<commit_message>
Fixed bad GitHub repo link in paper (.docx and .pdf).
</commit_message>
<xml_diff>
--- a/paper/Auditing the Unread — A Corpus Validation Framework for Undeciphered Scripts, with a Demonstration on Linear A.docx
+++ b/paper/Auditing the Unread — A Corpus Validation Framework for Undeciphered Scripts, with a Demonstration on Linear A.docx
@@ -1668,24 +1668,7 @@
             <w:sz w:val="22"/>
             <w:u w:val="single"/>
           </w:rPr>
-          <w:t>https://github.com/ChristosTsirkas/</w:t>
-        </w:r>
-        <w:r>
-          <w:rPr>
-            <w:rStyle w:val="Hyperlink"/>
-            <w:rFonts w:ascii="Noto Serif" w:hAnsi="Noto Serif" w:cs="Noto Serif"/>
-            <w:u w:val="single"/>
-          </w:rPr>
-          <w:t xml:space="preserve"> </w:t>
-        </w:r>
-        <w:r>
-          <w:rPr>
-            <w:rStyle w:val="Hyperlink"/>
-            <w:rFonts w:ascii="Noto Serif" w:hAnsi="Noto Serif" w:cs="Noto Serif"/>
-            <w:sz w:val="22"/>
-            <w:u w:val="single"/>
-          </w:rPr>
-          <w:t>corpus-validation-for-undeciphered-scripts-linear-a</w:t>
+          <w:t>https://github.com/ChristosTsirkas/corpus-validation-for-undeciphered-scripts-linear-a</w:t>
         </w:r>
       </w:hyperlink>
     </w:p>
@@ -1866,7 +1849,6 @@
         </w:rPr>
         <w:t xml:space="preserve"> — both corpora byte-identical to their published checksums, full test suite green, every headline figure below cross-checked against a fresh run’s output. Upstream sources and shared code can both drift day to day, so this date matters more than the one on the paper itself; see the </w:t>
       </w:r>
-      <w:proofErr w:type="spellStart"/>
       <w:r>
         <w:rPr>
           <w:rStyle w:val="VerbatimChar"/>
@@ -1878,14 +1860,7 @@
         <w:rPr>
           <w:rFonts w:ascii="Noto Serif" w:hAnsi="Noto Serif" w:cs="Noto Serif"/>
         </w:rPr>
-        <w:t>’s</w:t>
-      </w:r>
-      <w:proofErr w:type="spellEnd"/>
-      <w:r>
-        <w:rPr>
-          <w:rFonts w:ascii="Noto Serif" w:hAnsi="Noto Serif" w:cs="Noto Serif"/>
-        </w:rPr>
-        <w:t xml:space="preserve"> “Last pipeline verification” for the record.</w:t>
+        <w:t>’s “Last pipeline verification” for the record.</w:t>
       </w:r>
     </w:p>
     <w:p>
@@ -2046,18 +2021,8 @@
           <w:i/>
           <w:iCs/>
         </w:rPr>
-        <w:t xml:space="preserve">Linear A, corpus validation, reproducibility, undeciphered scripts, permutation testing, adequacy testing, Packard 1974, </w:t>
-      </w:r>
-      <w:proofErr w:type="spellStart"/>
-      <w:r>
-        <w:rPr>
-          <w:rFonts w:ascii="Noto Serif" w:hAnsi="Noto Serif" w:cs="Noto Serif"/>
-          <w:i/>
-          <w:iCs/>
-        </w:rPr>
-        <w:t>SigLA</w:t>
-      </w:r>
-      <w:proofErr w:type="spellEnd"/>
+        <w:t>Linear A, corpus validation, reproducibility, undeciphered scripts, permutation testing, adequacy testing, Packard 1974, SigLA</w:t>
+      </w:r>
       <w:r>
         <w:rPr>
           <w:rFonts w:ascii="Noto Serif" w:hAnsi="Noto Serif" w:cs="Noto Serif"/>
@@ -2142,21 +2107,7 @@
         <w:rPr>
           <w:rFonts w:ascii="Noto Serif" w:hAnsi="Noto Serif" w:cs="Noto Serif"/>
         </w:rPr>
-        <w:t xml:space="preserve">Linear A is the administrative and religious script of </w:t>
-      </w:r>
-      <w:proofErr w:type="spellStart"/>
-      <w:r>
-        <w:rPr>
-          <w:rFonts w:ascii="Noto Serif" w:hAnsi="Noto Serif" w:cs="Noto Serif"/>
-        </w:rPr>
-        <w:t>Neopalatial</w:t>
-      </w:r>
-      <w:proofErr w:type="spellEnd"/>
-      <w:r>
-        <w:rPr>
-          <w:rFonts w:ascii="Noto Serif" w:hAnsi="Noto Serif" w:cs="Noto Serif"/>
-        </w:rPr>
-        <w:t xml:space="preserve"> Crete, attested in roughly fifteen hundred documents from the eighteenth to the fifteenth century BCE. It remains undeciphered. The language behind it, generally called Minoan, has no demonstrated affiliation, and successive proposals — Semitic, Anatolian, Hurrian, Tyrrhenian — have failed to command assent.</w:t>
+        <w:t>Linear A is the administrative and religious script of Neopalatial Crete, attested in roughly fifteen hundred documents from the eighteenth to the fifteenth century BCE. It remains undeciphered. The language behind it, generally called Minoan, has no demonstrated affiliation, and successive proposals — Semitic, Anatolian, Hurrian, Tyrrhenian — have failed to command assent.</w:t>
       </w:r>
     </w:p>
     <w:p>
@@ -2482,79 +2433,193 @@
           <w:i/>
           <w:iCs/>
         </w:rPr>
-        <w:t xml:space="preserve">Corpus </w:t>
-      </w:r>
-      <w:proofErr w:type="spellStart"/>
+        <w:t>Corpus transnuméré</w:t>
+      </w:r>
+      <w:r>
+        <w:rPr>
+          <w:rFonts w:ascii="Noto Serif" w:hAnsi="Noto Serif" w:cs="Noto Serif"/>
+        </w:rPr>
+        <w:t>, Brice’s edition, Younger’s phonetic transcription, Douros’s tabulation, van Soesbergen’s corpus, and the SigLA palaeographical database of Salgarella and Castellan. Each re-encoding serves a purpose and each loses or adds something. The losses are the subject of Section 4.</w:t>
+      </w:r>
+    </w:p>
+    <w:p>
+      <w:pPr>
+        <w:pStyle w:val="BodyText"/>
+        <w:jc w:val="both"/>
+        <w:rPr>
+          <w:rFonts w:ascii="Noto Serif" w:hAnsi="Noto Serif" w:cs="Noto Serif"/>
+        </w:rPr>
+      </w:pPr>
+    </w:p>
+    <w:p>
+      <w:pPr>
+        <w:pStyle w:val="Heading3"/>
+        <w:jc w:val="both"/>
+        <w:rPr>
+          <w:rFonts w:ascii="Noto Serif" w:hAnsi="Noto Serif" w:cs="Noto Serif"/>
+          <w:sz w:val="26"/>
+          <w:szCs w:val="26"/>
+        </w:rPr>
+      </w:pPr>
+      <w:bookmarkStart w:id="13" w:name="the-statistical-tradition"/>
+      <w:bookmarkEnd w:id="12"/>
+      <w:r>
+        <w:rPr>
+          <w:rFonts w:ascii="Noto Serif" w:hAnsi="Noto Serif" w:cs="Noto Serif"/>
+          <w:sz w:val="26"/>
+          <w:szCs w:val="26"/>
+        </w:rPr>
+        <w:t>2.2 The statistical tradition</w:t>
+      </w:r>
+    </w:p>
+    <w:p>
+      <w:pPr>
+        <w:pStyle w:val="FirstParagraph"/>
+        <w:jc w:val="both"/>
+        <w:rPr>
+          <w:rFonts w:ascii="Noto Serif" w:hAnsi="Noto Serif" w:cs="Noto Serif"/>
+        </w:rPr>
+      </w:pPr>
+      <w:r>
+        <w:rPr>
+          <w:rFonts w:ascii="Noto Serif" w:hAnsi="Noto Serif" w:cs="Noto Serif"/>
+        </w:rPr>
+        <w:t>The practice of transliterating Linear A with Linear B sound values rests on an argument made by Packard (1967, 1974) and refined by Pope and Raison (1978). Packard constructed nine deliberately invalid “random decipherments” as a control and asked whether the true Linear B values produced more confirmatory evidence than the fictitious ones. He reported a ratio “just over 2 : 1” in favor of the Linear B values.</w:t>
+      </w:r>
+    </w:p>
+    <w:p>
+      <w:pPr>
+        <w:pStyle w:val="BodyText"/>
+        <w:jc w:val="both"/>
+        <w:rPr>
+          <w:rFonts w:ascii="Noto Serif" w:hAnsi="Noto Serif" w:cs="Noto Serif"/>
+        </w:rPr>
+      </w:pPr>
+      <w:r>
+        <w:rPr>
+          <w:rFonts w:ascii="Noto Serif" w:hAnsi="Noto Serif" w:cs="Noto Serif"/>
+        </w:rPr>
+        <w:t>That figure has circulated ever since as the warrant for backward projection. It has not, to this author’s knowledge, been re-run. Section 8 re-runs it.</w:t>
+      </w:r>
+    </w:p>
+    <w:p>
+      <w:pPr>
+        <w:pStyle w:val="BodyText"/>
+        <w:jc w:val="both"/>
+        <w:rPr>
+          <w:rFonts w:ascii="Noto Serif" w:hAnsi="Noto Serif" w:cs="Noto Serif"/>
+        </w:rPr>
+      </w:pPr>
+    </w:p>
+    <w:p>
+      <w:pPr>
+        <w:pStyle w:val="Heading3"/>
+        <w:jc w:val="both"/>
+        <w:rPr>
+          <w:rFonts w:ascii="Noto Serif" w:hAnsi="Noto Serif" w:cs="Noto Serif"/>
+          <w:sz w:val="26"/>
+          <w:szCs w:val="26"/>
+        </w:rPr>
+      </w:pPr>
+      <w:bookmarkStart w:id="14" w:name="position-within-digital-humanities"/>
+      <w:bookmarkEnd w:id="13"/>
+      <w:r>
+        <w:rPr>
+          <w:rFonts w:ascii="Noto Serif" w:hAnsi="Noto Serif" w:cs="Noto Serif"/>
+          <w:sz w:val="26"/>
+          <w:szCs w:val="26"/>
+        </w:rPr>
+        <w:t>2.3 Position within digital humanities</w:t>
+      </w:r>
+    </w:p>
+    <w:p>
+      <w:pPr>
+        <w:pStyle w:val="FirstParagraph"/>
+        <w:jc w:val="both"/>
+        <w:rPr>
+          <w:rFonts w:ascii="Noto Serif" w:hAnsi="Noto Serif" w:cs="Noto Serif"/>
+        </w:rPr>
+      </w:pPr>
+      <w:r>
+        <w:rPr>
+          <w:rFonts w:ascii="Noto Serif" w:hAnsi="Noto Serif" w:cs="Noto Serif"/>
+        </w:rPr>
+        <w:t>The argument of this paper belongs to a discussion wider than Aegean studies: that a digital corpus is an argument rather than a record, and that its editorial decisions constitute claims which downstream users inherit without seeing.</w:t>
+      </w:r>
+    </w:p>
+    <w:p>
+      <w:pPr>
+        <w:pStyle w:val="BodyText"/>
+        <w:jc w:val="both"/>
+        <w:rPr>
+          <w:rFonts w:ascii="Noto Serif" w:hAnsi="Noto Serif" w:cs="Noto Serif"/>
+        </w:rPr>
+      </w:pPr>
+      <w:r>
+        <w:rPr>
+          <w:rFonts w:ascii="Noto Serif" w:hAnsi="Noto Serif" w:cs="Noto Serif"/>
+        </w:rPr>
+        <w:lastRenderedPageBreak/>
+        <w:t>Critical work in digital humanities has made this point about selection — whose texts are digitized — and about markup, where encoding schemes embed interpretive commitments. The case of undeciphered scripts sharpens it, for two reasons.</w:t>
+      </w:r>
+    </w:p>
+    <w:p>
+      <w:pPr>
+        <w:pStyle w:val="BodyText"/>
+        <w:jc w:val="both"/>
+        <w:rPr>
+          <w:rFonts w:ascii="Noto Serif" w:hAnsi="Noto Serif" w:cs="Noto Serif"/>
+        </w:rPr>
+      </w:pPr>
+      <w:r>
+        <w:rPr>
+          <w:rFonts w:ascii="Noto Serif" w:hAnsi="Noto Serif" w:cs="Noto Serif"/>
+        </w:rPr>
+        <w:t>First, the interpretive layer is unusually thick relative to the evidence. A transliteration of a Linear A tablet embeds a sign inventory, a set of phonetic values borrowed from another language, a word division, and a judgment about which readings are certain. None is neutral, and §4 shows that in current corpora several are not even recoverable.</w:t>
+      </w:r>
+    </w:p>
+    <w:p>
+      <w:pPr>
+        <w:pStyle w:val="BodyText"/>
+        <w:jc w:val="both"/>
+        <w:rPr>
+          <w:rFonts w:ascii="Noto Serif" w:hAnsi="Noto Serif" w:cs="Noto Serif"/>
+        </w:rPr>
+      </w:pPr>
+      <w:r>
+        <w:rPr>
+          <w:rFonts w:ascii="Noto Serif" w:hAnsi="Noto Serif" w:cs="Noto Serif"/>
+        </w:rPr>
+        <w:t>Second, the usual corrective is unavailable. A user of a digitized Greek corpus can read the Greek. A user of a Linear A corpus cannot check a reading against the language, because the language is unknown. The corpus is therefore not merely a convenience but the entire evidential basis, and its defects are invisible from inside.</w:t>
+      </w:r>
+    </w:p>
+    <w:p>
+      <w:pPr>
+        <w:pStyle w:val="BodyText"/>
+        <w:jc w:val="both"/>
+        <w:rPr>
+          <w:rFonts w:ascii="Noto Serif" w:hAnsi="Noto Serif" w:cs="Noto Serif"/>
+        </w:rPr>
+      </w:pPr>
+      <w:r>
+        <w:rPr>
+          <w:rFonts w:ascii="Noto Serif" w:hAnsi="Noto Serif" w:cs="Noto Serif"/>
+        </w:rPr>
+        <w:t xml:space="preserve">This is why the framework here is an </w:t>
+      </w:r>
       <w:r>
         <w:rPr>
           <w:rFonts w:ascii="Noto Serif" w:hAnsi="Noto Serif" w:cs="Noto Serif"/>
           <w:i/>
           <w:iCs/>
         </w:rPr>
-        <w:t>transnuméré</w:t>
-      </w:r>
-      <w:proofErr w:type="spellEnd"/>
-      <w:r>
-        <w:rPr>
-          <w:rFonts w:ascii="Noto Serif" w:hAnsi="Noto Serif" w:cs="Noto Serif"/>
-        </w:rPr>
-        <w:t xml:space="preserve">, Brice’s edition, Younger’s phonetic transcription, Douros’s tabulation, van </w:t>
-      </w:r>
-      <w:proofErr w:type="spellStart"/>
-      <w:r>
-        <w:rPr>
-          <w:rFonts w:ascii="Noto Serif" w:hAnsi="Noto Serif" w:cs="Noto Serif"/>
-        </w:rPr>
-        <w:t>Soesbergen’s</w:t>
-      </w:r>
-      <w:proofErr w:type="spellEnd"/>
-      <w:r>
-        <w:rPr>
-          <w:rFonts w:ascii="Noto Serif" w:hAnsi="Noto Serif" w:cs="Noto Serif"/>
-        </w:rPr>
-        <w:t xml:space="preserve"> corpus, and the </w:t>
-      </w:r>
-      <w:proofErr w:type="spellStart"/>
-      <w:r>
-        <w:rPr>
-          <w:rFonts w:ascii="Noto Serif" w:hAnsi="Noto Serif" w:cs="Noto Serif"/>
-        </w:rPr>
-        <w:t>SigLA</w:t>
-      </w:r>
-      <w:proofErr w:type="spellEnd"/>
-      <w:r>
-        <w:rPr>
-          <w:rFonts w:ascii="Noto Serif" w:hAnsi="Noto Serif" w:cs="Noto Serif"/>
-        </w:rPr>
-        <w:t xml:space="preserve"> </w:t>
-      </w:r>
-      <w:proofErr w:type="spellStart"/>
-      <w:r>
-        <w:rPr>
-          <w:rFonts w:ascii="Noto Serif" w:hAnsi="Noto Serif" w:cs="Noto Serif"/>
-        </w:rPr>
-        <w:t>palaeographical</w:t>
-      </w:r>
-      <w:proofErr w:type="spellEnd"/>
-      <w:r>
-        <w:rPr>
-          <w:rFonts w:ascii="Noto Serif" w:hAnsi="Noto Serif" w:cs="Noto Serif"/>
-        </w:rPr>
-        <w:t xml:space="preserve"> database of </w:t>
-      </w:r>
-      <w:proofErr w:type="spellStart"/>
-      <w:r>
-        <w:rPr>
-          <w:rFonts w:ascii="Noto Serif" w:hAnsi="Noto Serif" w:cs="Noto Serif"/>
-        </w:rPr>
-        <w:t>Salgarella</w:t>
-      </w:r>
-      <w:proofErr w:type="spellEnd"/>
-      <w:r>
-        <w:rPr>
-          <w:rFonts w:ascii="Noto Serif" w:hAnsi="Noto Serif" w:cs="Noto Serif"/>
-        </w:rPr>
-        <w:t xml:space="preserve"> and Castellan. Each re-encoding serves a purpose and each loses or adds something. The losses are the subject of Section 4.</w:t>
+        <w:t>audit</w:t>
+      </w:r>
+      <w:r>
+        <w:rPr>
+          <w:rFonts w:ascii="Noto Serif" w:hAnsi="Noto Serif" w:cs="Noto Serif"/>
+        </w:rPr>
+        <w:t xml:space="preserve"> rather than an edition. It does not propose a better corpus; it proposes a method for establishing what any given corpus can and cannot support, and for making its editorial layers legible to the statistics that consume them. The divergence register is the instrument of that legibility: it converts an editorial disagreement from something a corpus hides into something a downstream analysis can condition on.</w:t>
       </w:r>
     </w:p>
     <w:p>
@@ -2576,15 +2641,15 @@
           <w:szCs w:val="26"/>
         </w:rPr>
       </w:pPr>
-      <w:bookmarkStart w:id="13" w:name="the-statistical-tradition"/>
-      <w:bookmarkEnd w:id="12"/>
+      <w:bookmarkStart w:id="15" w:name="the-theoretical-objection"/>
+      <w:bookmarkEnd w:id="14"/>
       <w:r>
         <w:rPr>
           <w:rFonts w:ascii="Noto Serif" w:hAnsi="Noto Serif" w:cs="Noto Serif"/>
           <w:sz w:val="26"/>
           <w:szCs w:val="26"/>
         </w:rPr>
-        <w:t>2.2 The statistical tradition</w:t>
+        <w:t>2.4 The theoretical objection</w:t>
       </w:r>
     </w:p>
     <w:p>
@@ -2599,201 +2664,7 @@
         <w:rPr>
           <w:rFonts w:ascii="Noto Serif" w:hAnsi="Noto Serif" w:cs="Noto Serif"/>
         </w:rPr>
-        <w:t>The practice of transliterating Linear A with Linear B sound values rests on an argument made by Packard (1967, 1974) and refined by Pope and Raison (1978). Packard constructed nine deliberately invalid “random decipherments” as a control and asked whether the true Linear B values produced more confirmatory evidence than the fictitious ones. He reported a ratio “just over 2 : 1” in favor of the Linear B values.</w:t>
-      </w:r>
-    </w:p>
-    <w:p>
-      <w:pPr>
-        <w:pStyle w:val="BodyText"/>
-        <w:jc w:val="both"/>
-        <w:rPr>
-          <w:rFonts w:ascii="Noto Serif" w:hAnsi="Noto Serif" w:cs="Noto Serif"/>
-        </w:rPr>
-      </w:pPr>
-      <w:r>
-        <w:rPr>
-          <w:rFonts w:ascii="Noto Serif" w:hAnsi="Noto Serif" w:cs="Noto Serif"/>
-        </w:rPr>
-        <w:t>That figure has circulated ever since as the warrant for backward projection. It has not, to this author’s knowledge, been re-run. Section 8 re-runs it.</w:t>
-      </w:r>
-    </w:p>
-    <w:p>
-      <w:pPr>
-        <w:pStyle w:val="BodyText"/>
-        <w:jc w:val="both"/>
-        <w:rPr>
-          <w:rFonts w:ascii="Noto Serif" w:hAnsi="Noto Serif" w:cs="Noto Serif"/>
-        </w:rPr>
-      </w:pPr>
-    </w:p>
-    <w:p>
-      <w:pPr>
-        <w:pStyle w:val="Heading3"/>
-        <w:jc w:val="both"/>
-        <w:rPr>
-          <w:rFonts w:ascii="Noto Serif" w:hAnsi="Noto Serif" w:cs="Noto Serif"/>
-          <w:sz w:val="26"/>
-          <w:szCs w:val="26"/>
-        </w:rPr>
-      </w:pPr>
-      <w:bookmarkStart w:id="14" w:name="position-within-digital-humanities"/>
-      <w:bookmarkEnd w:id="13"/>
-      <w:r>
-        <w:rPr>
-          <w:rFonts w:ascii="Noto Serif" w:hAnsi="Noto Serif" w:cs="Noto Serif"/>
-          <w:sz w:val="26"/>
-          <w:szCs w:val="26"/>
-        </w:rPr>
-        <w:t>2.3 Position within digital humanities</w:t>
-      </w:r>
-    </w:p>
-    <w:p>
-      <w:pPr>
-        <w:pStyle w:val="FirstParagraph"/>
-        <w:jc w:val="both"/>
-        <w:rPr>
-          <w:rFonts w:ascii="Noto Serif" w:hAnsi="Noto Serif" w:cs="Noto Serif"/>
-        </w:rPr>
-      </w:pPr>
-      <w:r>
-        <w:rPr>
-          <w:rFonts w:ascii="Noto Serif" w:hAnsi="Noto Serif" w:cs="Noto Serif"/>
-        </w:rPr>
-        <w:t>The argument of this paper belongs to a discussion wider than Aegean studies: that a digital corpus is an argument rather than a record, and that its editorial decisions constitute claims which downstream users inherit without seeing.</w:t>
-      </w:r>
-    </w:p>
-    <w:p>
-      <w:pPr>
-        <w:pStyle w:val="BodyText"/>
-        <w:jc w:val="both"/>
-        <w:rPr>
-          <w:rFonts w:ascii="Noto Serif" w:hAnsi="Noto Serif" w:cs="Noto Serif"/>
-        </w:rPr>
-      </w:pPr>
-      <w:r>
-        <w:rPr>
-          <w:rFonts w:ascii="Noto Serif" w:hAnsi="Noto Serif" w:cs="Noto Serif"/>
-        </w:rPr>
-        <w:lastRenderedPageBreak/>
-        <w:t>Critical work in digital humanities has made this point about selection — whose texts are digitized — and about markup, where encoding schemes embed interpretive commitments. The case of undeciphered scripts sharpens it, for two reasons.</w:t>
-      </w:r>
-    </w:p>
-    <w:p>
-      <w:pPr>
-        <w:pStyle w:val="BodyText"/>
-        <w:jc w:val="both"/>
-        <w:rPr>
-          <w:rFonts w:ascii="Noto Serif" w:hAnsi="Noto Serif" w:cs="Noto Serif"/>
-        </w:rPr>
-      </w:pPr>
-      <w:r>
-        <w:rPr>
-          <w:rFonts w:ascii="Noto Serif" w:hAnsi="Noto Serif" w:cs="Noto Serif"/>
-        </w:rPr>
-        <w:t>First, the interpretive layer is unusually thick relative to the evidence. A transliteration of a Linear A tablet embeds a sign inventory, a set of phonetic values borrowed from another language, a word division, and a judgment about which readings are certain. None is neutral, and §4 shows that in current corpora several are not even recoverable.</w:t>
-      </w:r>
-    </w:p>
-    <w:p>
-      <w:pPr>
-        <w:pStyle w:val="BodyText"/>
-        <w:jc w:val="both"/>
-        <w:rPr>
-          <w:rFonts w:ascii="Noto Serif" w:hAnsi="Noto Serif" w:cs="Noto Serif"/>
-        </w:rPr>
-      </w:pPr>
-      <w:r>
-        <w:rPr>
-          <w:rFonts w:ascii="Noto Serif" w:hAnsi="Noto Serif" w:cs="Noto Serif"/>
-        </w:rPr>
-        <w:t>Second, the usual corrective is unavailable. A user of a digitized Greek corpus can read the Greek. A user of a Linear A corpus cannot check a reading against the language, because the language is unknown. The corpus is therefore not merely a convenience but the entire evidential basis, and its defects are invisible from inside.</w:t>
-      </w:r>
-    </w:p>
-    <w:p>
-      <w:pPr>
-        <w:pStyle w:val="BodyText"/>
-        <w:jc w:val="both"/>
-        <w:rPr>
-          <w:rFonts w:ascii="Noto Serif" w:hAnsi="Noto Serif" w:cs="Noto Serif"/>
-        </w:rPr>
-      </w:pPr>
-      <w:r>
-        <w:rPr>
-          <w:rFonts w:ascii="Noto Serif" w:hAnsi="Noto Serif" w:cs="Noto Serif"/>
-        </w:rPr>
-        <w:t xml:space="preserve">This is why the framework here is an </w:t>
-      </w:r>
-      <w:r>
-        <w:rPr>
-          <w:rFonts w:ascii="Noto Serif" w:hAnsi="Noto Serif" w:cs="Noto Serif"/>
-          <w:i/>
-          <w:iCs/>
-        </w:rPr>
-        <w:t>audit</w:t>
-      </w:r>
-      <w:r>
-        <w:rPr>
-          <w:rFonts w:ascii="Noto Serif" w:hAnsi="Noto Serif" w:cs="Noto Serif"/>
-        </w:rPr>
-        <w:t xml:space="preserve"> rather than an edition. It does not propose a better corpus; it proposes a method for establishing what any given corpus can and cannot support, and for making its editorial layers legible to the statistics that consume them. The divergence register is the instrument of that legibility: it converts an editorial disagreement from something a corpus hides into something a downstream analysis can condition on.</w:t>
-      </w:r>
-    </w:p>
-    <w:p>
-      <w:pPr>
-        <w:pStyle w:val="BodyText"/>
-        <w:jc w:val="both"/>
-        <w:rPr>
-          <w:rFonts w:ascii="Noto Serif" w:hAnsi="Noto Serif" w:cs="Noto Serif"/>
-        </w:rPr>
-      </w:pPr>
-    </w:p>
-    <w:p>
-      <w:pPr>
-        <w:pStyle w:val="Heading3"/>
-        <w:jc w:val="both"/>
-        <w:rPr>
-          <w:rFonts w:ascii="Noto Serif" w:hAnsi="Noto Serif" w:cs="Noto Serif"/>
-          <w:sz w:val="26"/>
-          <w:szCs w:val="26"/>
-        </w:rPr>
-      </w:pPr>
-      <w:bookmarkStart w:id="15" w:name="the-theoretical-objection"/>
-      <w:bookmarkEnd w:id="14"/>
-      <w:r>
-        <w:rPr>
-          <w:rFonts w:ascii="Noto Serif" w:hAnsi="Noto Serif" w:cs="Noto Serif"/>
-          <w:sz w:val="26"/>
-          <w:szCs w:val="26"/>
-        </w:rPr>
-        <w:t>2.4 The theoretical objection</w:t>
-      </w:r>
-    </w:p>
-    <w:p>
-      <w:pPr>
-        <w:pStyle w:val="FirstParagraph"/>
-        <w:jc w:val="both"/>
-        <w:rPr>
-          <w:rFonts w:ascii="Noto Serif" w:hAnsi="Noto Serif" w:cs="Noto Serif"/>
-        </w:rPr>
-      </w:pPr>
-      <w:r>
-        <w:rPr>
-          <w:rFonts w:ascii="Noto Serif" w:hAnsi="Noto Serif" w:cs="Noto Serif"/>
-        </w:rPr>
-        <w:t xml:space="preserve">Steele and </w:t>
-      </w:r>
-      <w:proofErr w:type="spellStart"/>
-      <w:r>
-        <w:rPr>
-          <w:rFonts w:ascii="Noto Serif" w:hAnsi="Noto Serif" w:cs="Noto Serif"/>
-        </w:rPr>
-        <w:t>Meißner</w:t>
-      </w:r>
-      <w:proofErr w:type="spellEnd"/>
-      <w:r>
-        <w:rPr>
-          <w:rFonts w:ascii="Noto Serif" w:hAnsi="Noto Serif" w:cs="Noto Serif"/>
-        </w:rPr>
-        <w:t xml:space="preserve"> (2017) treat backward projection as a problem rather than a settled procedure. Their case is that a script adapted to a different language routinely has its sign values reassigned — Latin script for Turkish or Vietnamese, or the Cherokee syllabary, whose eighty-five signs are mostly based on Latin letters and of which none retains its Latin value.</w:t>
+        <w:t>Steele and Meißner (2017) treat backward projection as a problem rather than a settled procedure. Their case is that a script adapted to a different language routinely has its sign values reassigned — Latin script for Turkish or Vietnamese, or the Cherokee syllabary, whose eighty-five signs are mostly based on Latin letters and of which none retains its Latin value.</w:t>
       </w:r>
     </w:p>
     <w:p>
@@ -3195,35 +3066,7 @@
         <w:rPr>
           <w:rFonts w:ascii="Noto Serif" w:hAnsi="Noto Serif" w:cs="Noto Serif"/>
         </w:rPr>
-        <w:t xml:space="preserve">Three witnesses are used here: Younger’s phonetic transcription (tabular and free-text records, compared separately), and the </w:t>
-      </w:r>
-      <w:proofErr w:type="spellStart"/>
-      <w:r>
-        <w:rPr>
-          <w:rFonts w:ascii="Noto Serif" w:hAnsi="Noto Serif" w:cs="Noto Serif"/>
-        </w:rPr>
-        <w:t>SigLA</w:t>
-      </w:r>
-      <w:proofErr w:type="spellEnd"/>
-      <w:r>
-        <w:rPr>
-          <w:rFonts w:ascii="Noto Serif" w:hAnsi="Noto Serif" w:cs="Noto Serif"/>
-        </w:rPr>
-        <w:t xml:space="preserve"> </w:t>
-      </w:r>
-      <w:proofErr w:type="spellStart"/>
-      <w:r>
-        <w:rPr>
-          <w:rFonts w:ascii="Noto Serif" w:hAnsi="Noto Serif" w:cs="Noto Serif"/>
-        </w:rPr>
-        <w:t>palaeographical</w:t>
-      </w:r>
-      <w:proofErr w:type="spellEnd"/>
-      <w:r>
-        <w:rPr>
-          <w:rFonts w:ascii="Noto Serif" w:hAnsi="Noto Serif" w:cs="Noto Serif"/>
-        </w:rPr>
-        <w:t xml:space="preserve"> database.</w:t>
+        <w:t>Three witnesses are used here: Younger’s phonetic transcription (tabular and free-text records, compared separately), and the SigLA palaeographical database.</w:t>
       </w:r>
     </w:p>
     <w:p>
@@ -3995,7 +3838,6 @@
         </w:rPr>
         <w:t xml:space="preserve">The cost of deferral is that the corpus knowingly contains readings believed to be wrong, for as long as it takes to adjudicate them. That cost is real and is paid in </w:t>
       </w:r>
-      <w:proofErr w:type="spellStart"/>
       <w:r>
         <w:rPr>
           <w:rStyle w:val="VerbatimChar"/>
@@ -4003,7 +3845,6 @@
         </w:rPr>
         <w:t>divergences.json</w:t>
       </w:r>
-      <w:proofErr w:type="spellEnd"/>
       <w:r>
         <w:rPr>
           <w:rFonts w:ascii="Noto Serif" w:hAnsi="Noto Serif" w:cs="Noto Serif"/>
@@ -4328,21 +4169,7 @@
         <w:rPr>
           <w:rFonts w:ascii="Noto Serif" w:hAnsi="Noto Serif" w:cs="Noto Serif"/>
         </w:rPr>
-        <w:t xml:space="preserve">; </w:t>
-      </w:r>
-      <w:proofErr w:type="spellStart"/>
-      <w:r>
-        <w:rPr>
-          <w:rFonts w:ascii="Noto Serif" w:hAnsi="Noto Serif" w:cs="Noto Serif"/>
-        </w:rPr>
-        <w:t>VINa</w:t>
-      </w:r>
-      <w:proofErr w:type="spellEnd"/>
-      <w:r>
-        <w:rPr>
-          <w:rFonts w:ascii="Noto Serif" w:hAnsi="Noto Serif" w:cs="Noto Serif"/>
-        </w:rPr>
-        <w:t xml:space="preserve"> flattened to </w:t>
+        <w:t xml:space="preserve">; VINa flattened to </w:t>
       </w:r>
       <w:r>
         <w:rPr>
@@ -4355,21 +4182,7 @@
         <w:rPr>
           <w:rFonts w:ascii="Noto Serif" w:hAnsi="Noto Serif" w:cs="Noto Serif"/>
         </w:rPr>
-        <w:t xml:space="preserve"> while </w:t>
-      </w:r>
-      <w:proofErr w:type="spellStart"/>
-      <w:r>
-        <w:rPr>
-          <w:rFonts w:ascii="Noto Serif" w:hAnsi="Noto Serif" w:cs="Noto Serif"/>
-        </w:rPr>
-        <w:t>VINb</w:t>
-      </w:r>
-      <w:proofErr w:type="spellEnd"/>
-      <w:r>
-        <w:rPr>
-          <w:rFonts w:ascii="Noto Serif" w:hAnsi="Noto Serif" w:cs="Noto Serif"/>
-        </w:rPr>
-        <w:t xml:space="preserve"> survived.</w:t>
+        <w:t xml:space="preserve"> while VINb survived.</w:t>
       </w:r>
     </w:p>
     <w:p>
@@ -4539,49 +4352,7 @@
         <w:rPr>
           <w:rFonts w:ascii="Noto Serif" w:hAnsi="Noto Serif" w:cs="Noto Serif"/>
         </w:rPr>
-        <w:t xml:space="preserve">, spanning </w:t>
-      </w:r>
-      <w:proofErr w:type="spellStart"/>
-      <w:r>
-        <w:rPr>
-          <w:rFonts w:ascii="Noto Serif" w:hAnsi="Noto Serif" w:cs="Noto Serif"/>
-        </w:rPr>
-        <w:t>Haghia</w:t>
-      </w:r>
-      <w:proofErr w:type="spellEnd"/>
-      <w:r>
-        <w:rPr>
-          <w:rFonts w:ascii="Noto Serif" w:hAnsi="Noto Serif" w:cs="Noto Serif"/>
-        </w:rPr>
-        <w:t xml:space="preserve"> </w:t>
-      </w:r>
-      <w:proofErr w:type="spellStart"/>
-      <w:r>
-        <w:rPr>
-          <w:rFonts w:ascii="Noto Serif" w:hAnsi="Noto Serif" w:cs="Noto Serif"/>
-        </w:rPr>
-        <w:t>Triada</w:t>
-      </w:r>
-      <w:proofErr w:type="spellEnd"/>
-      <w:r>
-        <w:rPr>
-          <w:rFonts w:ascii="Noto Serif" w:hAnsi="Noto Serif" w:cs="Noto Serif"/>
-        </w:rPr>
-        <w:t xml:space="preserve">, Khania, Knossos, Phaistos and </w:t>
-      </w:r>
-      <w:proofErr w:type="spellStart"/>
-      <w:r>
-        <w:rPr>
-          <w:rFonts w:ascii="Noto Serif" w:hAnsi="Noto Serif" w:cs="Noto Serif"/>
-        </w:rPr>
-        <w:t>Zakros</w:t>
-      </w:r>
-      <w:proofErr w:type="spellEnd"/>
-      <w:r>
-        <w:rPr>
-          <w:rFonts w:ascii="Noto Serif" w:hAnsi="Noto Serif" w:cs="Noto Serif"/>
-        </w:rPr>
-        <w:t xml:space="preserve">, and the disagreement runs in </w:t>
+        <w:t xml:space="preserve">, spanning Haghia Triada, Khania, Knossos, Phaistos and Zakros, and the disagreement runs in </w:t>
       </w:r>
       <w:r>
         <w:rPr>
@@ -4612,31 +4383,50 @@
           <w:b/>
           <w:bCs/>
         </w:rPr>
-        <w:t xml:space="preserve">Stage two: exclusion of a </w:t>
-      </w:r>
-      <w:proofErr w:type="spellStart"/>
+        <w:t>Stage two: exclusion of a palaeographic explanation.</w:t>
+      </w:r>
+      <w:r>
+        <w:rPr>
+          <w:rFonts w:ascii="Noto Serif" w:hAnsi="Noto Serif" w:cs="Noto Serif"/>
+        </w:rPr>
+        <w:t xml:space="preserve"> If contested readings concentrated in particular scribal hands, the dispute would be partly about confusable letterforms. They do not. Only five of the eighteen sites carry a scribal attribution and those five fall under five different scribes.</w:t>
+      </w:r>
+    </w:p>
+    <w:p>
+      <w:pPr>
+        <w:pStyle w:val="BodyText"/>
+        <w:jc w:val="both"/>
+        <w:rPr>
+          <w:rFonts w:ascii="Noto Serif" w:hAnsi="Noto Serif" w:cs="Noto Serif"/>
+        </w:rPr>
+      </w:pPr>
       <w:r>
         <w:rPr>
           <w:rFonts w:ascii="Noto Serif" w:hAnsi="Noto Serif" w:cs="Noto Serif"/>
           <w:b/>
           <w:bCs/>
         </w:rPr>
-        <w:t>palaeographic</w:t>
-      </w:r>
-      <w:proofErr w:type="spellEnd"/>
+        <w:t>Stage three: a third witness.</w:t>
+      </w:r>
+      <w:r>
+        <w:rPr>
+          <w:rFonts w:ascii="Noto Serif" w:hAnsi="Noto Serif" w:cs="Noto Serif"/>
+        </w:rPr>
+        <w:t xml:space="preserve"> The SigLA database, when decoded (§4.4), agrees with Younger at </w:t>
+      </w:r>
       <w:r>
         <w:rPr>
           <w:rFonts w:ascii="Noto Serif" w:hAnsi="Noto Serif" w:cs="Noto Serif"/>
           <w:b/>
           <w:bCs/>
         </w:rPr>
-        <w:t xml:space="preserve"> explanation.</w:t>
-      </w:r>
-      <w:r>
-        <w:rPr>
-          <w:rFonts w:ascii="Noto Serif" w:hAnsi="Noto Serif" w:cs="Noto Serif"/>
-        </w:rPr>
-        <w:t xml:space="preserve"> If contested readings concentrated in particular scribal hands, the dispute would be partly about confusable letterforms. They do not. Only five of the eighteen sites carry a scribal attribution and those five fall under five different scribes.</w:t>
+        <w:t>fifteen of fifteen attestable sites, in both directions, without exception</w:t>
+      </w:r>
+      <w:r>
+        <w:rPr>
+          <w:rFonts w:ascii="Noto Serif" w:hAnsi="Noto Serif" w:cs="Noto Serif"/>
+        </w:rPr>
+        <w:t>.</w:t>
       </w:r>
     </w:p>
     <w:p>
@@ -4647,33 +4437,110 @@
           <w:rFonts w:ascii="Noto Serif" w:hAnsi="Noto Serif" w:cs="Noto Serif"/>
         </w:rPr>
       </w:pPr>
+      <w:r>
+        <w:rPr>
+          <w:rFonts w:ascii="Noto Serif" w:hAnsi="Noto Serif" w:cs="Noto Serif"/>
+        </w:rPr>
+        <w:t>A perfect inversion across fifteen independent sites is not fifteen misreadings. It is a systematic mis-mapping in the tabulation. The inversion is now applied at build time and the corpus reproduces SigLA on twelve of twelve documents.</w:t>
+      </w:r>
+    </w:p>
+    <w:p>
+      <w:pPr>
+        <w:pStyle w:val="BodyText"/>
+        <w:jc w:val="both"/>
+        <w:rPr>
+          <w:rFonts w:ascii="Noto Serif" w:hAnsi="Noto Serif" w:cs="Noto Serif"/>
+        </w:rPr>
+      </w:pPr>
+      <w:r>
+        <w:rPr>
+          <w:rFonts w:ascii="Noto Serif" w:hAnsi="Noto Serif" w:cs="Noto Serif"/>
+        </w:rPr>
+        <w:t xml:space="preserve">The methodological consequence deserves emphasis. The register policy of §3.3 is to retain the source reading and defer adjudication. Had the conflict been “corrected” toward either witness when first encountered as a single site, the pattern that proved the source wrong would have been erased. </w:t>
+      </w:r>
       <w:r>
         <w:rPr>
           <w:rFonts w:ascii="Noto Serif" w:hAnsi="Noto Serif" w:cs="Noto Serif"/>
           <w:b/>
           <w:bCs/>
         </w:rPr>
-        <w:t>Stage three: a third witness.</w:t>
-      </w:r>
-      <w:r>
-        <w:rPr>
-          <w:rFonts w:ascii="Noto Serif" w:hAnsi="Noto Serif" w:cs="Noto Serif"/>
-        </w:rPr>
-        <w:t xml:space="preserve"> The </w:t>
-      </w:r>
-      <w:proofErr w:type="spellStart"/>
-      <w:r>
-        <w:rPr>
-          <w:rFonts w:ascii="Noto Serif" w:hAnsi="Noto Serif" w:cs="Noto Serif"/>
-        </w:rPr>
-        <w:t>SigLA</w:t>
-      </w:r>
-      <w:proofErr w:type="spellEnd"/>
-      <w:r>
-        <w:rPr>
-          <w:rFonts w:ascii="Noto Serif" w:hAnsi="Noto Serif" w:cs="Noto Serif"/>
-        </w:rPr>
-        <w:t xml:space="preserve"> database, when decoded (§4.4), agrees with Younger at </w:t>
+        <w:t>Deferral was not caution; it was what made the finding possible.</w:t>
+      </w:r>
+    </w:p>
+    <w:p>
+      <w:pPr>
+        <w:pStyle w:val="BodyText"/>
+        <w:jc w:val="both"/>
+        <w:rPr>
+          <w:rFonts w:ascii="Noto Serif" w:hAnsi="Noto Serif" w:cs="Noto Serif"/>
+        </w:rPr>
+      </w:pPr>
+      <w:r>
+        <w:rPr>
+          <w:rFonts w:ascii="Noto Serif" w:hAnsi="Noto Serif" w:cs="Noto Serif"/>
+        </w:rPr>
+        <w:lastRenderedPageBreak/>
+        <w:t>Two qualifications. SigLA does not record the gender variants the source carries, so adjudication is at AB21/AB22 family level. Two documents are absent from SigLA and remain unadjudicated.</w:t>
+      </w:r>
+    </w:p>
+    <w:p>
+      <w:pPr>
+        <w:pStyle w:val="BodyText"/>
+        <w:jc w:val="both"/>
+        <w:rPr>
+          <w:rFonts w:ascii="Noto Serif" w:hAnsi="Noto Serif" w:cs="Noto Serif"/>
+        </w:rPr>
+      </w:pPr>
+    </w:p>
+    <w:p>
+      <w:pPr>
+        <w:pStyle w:val="Heading3"/>
+        <w:jc w:val="both"/>
+        <w:rPr>
+          <w:rFonts w:ascii="Noto Serif" w:hAnsi="Noto Serif" w:cs="Noto Serif"/>
+          <w:sz w:val="26"/>
+          <w:szCs w:val="26"/>
+        </w:rPr>
+      </w:pPr>
+      <w:bookmarkStart w:id="31" w:name="d12-uncertainty-absent-from-every-layer"/>
+      <w:bookmarkEnd w:id="30"/>
+      <w:r>
+        <w:rPr>
+          <w:rFonts w:ascii="Noto Serif" w:hAnsi="Noto Serif" w:cs="Noto Serif"/>
+          <w:sz w:val="26"/>
+          <w:szCs w:val="26"/>
+        </w:rPr>
+        <w:t>4.3 D12: uncertainty absent from every layer</w:t>
+      </w:r>
+    </w:p>
+    <w:p>
+      <w:pPr>
+        <w:pStyle w:val="FirstParagraph"/>
+        <w:jc w:val="both"/>
+        <w:rPr>
+          <w:rFonts w:ascii="Noto Serif" w:hAnsi="Noto Serif" w:cs="Noto Serif"/>
+        </w:rPr>
+      </w:pPr>
+      <w:r>
+        <w:rPr>
+          <w:rFonts w:ascii="Noto Serif" w:hAnsi="Noto Serif" w:cs="Noto Serif"/>
+        </w:rPr>
+        <w:t>D1 concerned a marker present in one layer and stripped from another; it was recoverable. D12 is worse.</w:t>
+      </w:r>
+    </w:p>
+    <w:p>
+      <w:pPr>
+        <w:pStyle w:val="BodyText"/>
+        <w:jc w:val="both"/>
+        <w:rPr>
+          <w:rFonts w:ascii="Noto Serif" w:hAnsi="Noto Serif" w:cs="Noto Serif"/>
+        </w:rPr>
+      </w:pPr>
+      <w:r>
+        <w:rPr>
+          <w:rFonts w:ascii="Noto Serif" w:hAnsi="Noto Serif" w:cs="Noto Serif"/>
+        </w:rPr>
+        <w:t xml:space="preserve">GORILA marks uncertain sign readings with subscript dots. Younger uses underlining. The corpus used here carries </w:t>
       </w:r>
       <w:r>
         <w:rPr>
@@ -4681,13 +4548,13 @@
           <w:b/>
           <w:bCs/>
         </w:rPr>
-        <w:t>fifteen of fifteen attestable sites, in both directions, without exception</w:t>
-      </w:r>
-      <w:r>
-        <w:rPr>
-          <w:rFonts w:ascii="Noto Serif" w:hAnsi="Noto Serif" w:cs="Noto Serif"/>
-        </w:rPr>
-        <w:t>.</w:t>
+        <w:t>neither, in any layer</w:t>
+      </w:r>
+      <w:r>
+        <w:rPr>
+          <w:rFonts w:ascii="Noto Serif" w:hAnsi="Noto Serif" w:cs="Noto Serif"/>
+        </w:rPr>
+        <w:t>. A sign an editor could barely make out is indistinguishable from one read with confidence.</w:t>
       </w:r>
     </w:p>
     <w:p>
@@ -4702,35 +4569,7 @@
         <w:rPr>
           <w:rFonts w:ascii="Noto Serif" w:hAnsi="Noto Serif" w:cs="Noto Serif"/>
         </w:rPr>
-        <w:t xml:space="preserve">A perfect inversion across fifteen independent sites is not fifteen </w:t>
-      </w:r>
-      <w:proofErr w:type="spellStart"/>
-      <w:r>
-        <w:rPr>
-          <w:rFonts w:ascii="Noto Serif" w:hAnsi="Noto Serif" w:cs="Noto Serif"/>
-        </w:rPr>
-        <w:t>misreadings</w:t>
-      </w:r>
-      <w:proofErr w:type="spellEnd"/>
-      <w:r>
-        <w:rPr>
-          <w:rFonts w:ascii="Noto Serif" w:hAnsi="Noto Serif" w:cs="Noto Serif"/>
-        </w:rPr>
-        <w:t xml:space="preserve">. It is a systematic mis-mapping in the tabulation. The inversion is now applied at build time and the corpus reproduces </w:t>
-      </w:r>
-      <w:proofErr w:type="spellStart"/>
-      <w:r>
-        <w:rPr>
-          <w:rFonts w:ascii="Noto Serif" w:hAnsi="Noto Serif" w:cs="Noto Serif"/>
-        </w:rPr>
-        <w:t>SigLA</w:t>
-      </w:r>
-      <w:proofErr w:type="spellEnd"/>
-      <w:r>
-        <w:rPr>
-          <w:rFonts w:ascii="Noto Serif" w:hAnsi="Noto Serif" w:cs="Noto Serif"/>
-        </w:rPr>
-        <w:t xml:space="preserve"> on twelve of twelve documents.</w:t>
+        <w:t>The defect was detected indirectly. Comparing fraction-sign counts against Corazza et al., most signs tracked closely — sign A707 is attested exactly 137 times in both — but sign A709 showed ten occurrences here against their one. Their footnote lists the doubtful instances they exclude, and our ten fall precisely in the documents they name. We were counting their excluded doubtful readings as certain.</w:t>
       </w:r>
     </w:p>
     <w:p>
@@ -4745,59 +4584,33 @@
         <w:rPr>
           <w:rFonts w:ascii="Noto Serif" w:hAnsi="Noto Serif" w:cs="Noto Serif"/>
         </w:rPr>
-        <w:t xml:space="preserve">The methodological consequence deserves emphasis. The register policy of §3.3 is to retain the source reading and defer adjudication. Had the conflict been “corrected” toward either witness when first encountered as a single site, the pattern that proved the source wrong would have been erased. </w:t>
-      </w:r>
-      <w:r>
-        <w:rPr>
-          <w:rFonts w:ascii="Noto Serif" w:hAnsi="Noto Serif" w:cs="Noto Serif"/>
-          <w:b/>
-          <w:bCs/>
-        </w:rPr>
-        <w:t>Deferral was not caution; it was what made the finding possible.</w:t>
-      </w:r>
-    </w:p>
-    <w:p>
-      <w:pPr>
-        <w:pStyle w:val="BodyText"/>
-        <w:jc w:val="both"/>
-        <w:rPr>
-          <w:rFonts w:ascii="Noto Serif" w:hAnsi="Noto Serif" w:cs="Noto Serif"/>
-        </w:rPr>
-      </w:pPr>
-      <w:r>
-        <w:rPr>
-          <w:rFonts w:ascii="Noto Serif" w:hAnsi="Noto Serif" w:cs="Noto Serif"/>
-        </w:rPr>
-        <w:lastRenderedPageBreak/>
-        <w:t xml:space="preserve">Two qualifications. </w:t>
-      </w:r>
-      <w:proofErr w:type="spellStart"/>
-      <w:r>
-        <w:rPr>
-          <w:rFonts w:ascii="Noto Serif" w:hAnsi="Noto Serif" w:cs="Noto Serif"/>
-        </w:rPr>
-        <w:t>SigLA</w:t>
-      </w:r>
-      <w:proofErr w:type="spellEnd"/>
-      <w:r>
-        <w:rPr>
-          <w:rFonts w:ascii="Noto Serif" w:hAnsi="Noto Serif" w:cs="Noto Serif"/>
-        </w:rPr>
-        <w:t xml:space="preserve"> does not record the gender variants the source carries, so adjudication is at AB21/AB22 family level. Two documents are absent from </w:t>
-      </w:r>
-      <w:proofErr w:type="spellStart"/>
-      <w:r>
-        <w:rPr>
-          <w:rFonts w:ascii="Noto Serif" w:hAnsi="Noto Serif" w:cs="Noto Serif"/>
-        </w:rPr>
-        <w:t>SigLA</w:t>
-      </w:r>
-      <w:proofErr w:type="spellEnd"/>
-      <w:r>
-        <w:rPr>
-          <w:rFonts w:ascii="Noto Serif" w:hAnsi="Noto Serif" w:cs="Noto Serif"/>
-        </w:rPr>
-        <w:t xml:space="preserve"> and remain unadjudicated.</w:t>
+        <w:t>This is not bookkeeping. Corazza et al. build a statistical argument at p = 4 × 10</w:t>
+      </w:r>
+      <w:r>
+        <w:rPr>
+          <w:rFonts w:ascii="Times New Roman" w:hAnsi="Times New Roman" w:cs="Times New Roman"/>
+        </w:rPr>
+        <w:t>⁻</w:t>
+      </w:r>
+      <w:r>
+        <w:rPr>
+          <w:rFonts w:ascii="Noto Serif" w:hAnsi="Noto Serif" w:cs="Noto Serif"/>
+        </w:rPr>
+        <w:t xml:space="preserve">¹² that A709 is </w:t>
+      </w:r>
+      <w:r>
+        <w:rPr>
+          <w:rFonts w:ascii="Noto Serif" w:hAnsi="Noto Serif" w:cs="Noto Serif"/>
+          <w:i/>
+          <w:iCs/>
+        </w:rPr>
+        <w:t>not an independent sign</w:t>
+      </w:r>
+      <w:r>
+        <w:rPr>
+          <w:rFonts w:ascii="Noto Serif" w:hAnsi="Noto Serif" w:cs="Noto Serif"/>
+        </w:rPr>
+        <w:t>, and that argument rests on its rarity. On uncorrected counts the sign is ten times commoner and the argument would not go through.</w:t>
       </w:r>
     </w:p>
     <w:p>
@@ -4819,15 +4632,15 @@
           <w:szCs w:val="26"/>
         </w:rPr>
       </w:pPr>
-      <w:bookmarkStart w:id="31" w:name="d12-uncertainty-absent-from-every-layer"/>
-      <w:bookmarkEnd w:id="30"/>
+      <w:bookmarkStart w:id="32" w:name="Xb12ac3e3ba80d61b5d9f7155e093206a65f536c"/>
+      <w:bookmarkEnd w:id="31"/>
       <w:r>
         <w:rPr>
           <w:rFonts w:ascii="Noto Serif" w:hAnsi="Noto Serif" w:cs="Noto Serif"/>
           <w:sz w:val="26"/>
           <w:szCs w:val="26"/>
         </w:rPr>
-        <w:t>4.3 D12: uncertainty absent from every layer</w:t>
+        <w:t>4.4 Recovering a witness that carries certainty</w:t>
       </w:r>
     </w:p>
     <w:p>
@@ -4842,7 +4655,7 @@
         <w:rPr>
           <w:rFonts w:ascii="Noto Serif" w:hAnsi="Noto Serif" w:cs="Noto Serif"/>
         </w:rPr>
-        <w:t>D1 concerned a marker present in one layer and stripped from another; it was recoverable. D12 is worse.</w:t>
+        <w:t>D12 cannot be fixed by better processing of the same source; it requires a corpus that records certainty natively. SigLA does.</w:t>
       </w:r>
     </w:p>
     <w:p>
@@ -4857,173 +4670,7 @@
         <w:rPr>
           <w:rFonts w:ascii="Noto Serif" w:hAnsi="Noto Serif" w:cs="Noto Serif"/>
         </w:rPr>
-        <w:t xml:space="preserve">GORILA marks uncertain sign readings with subscript dots. Younger uses underlining. The corpus used here carries </w:t>
-      </w:r>
-      <w:r>
-        <w:rPr>
-          <w:rFonts w:ascii="Noto Serif" w:hAnsi="Noto Serif" w:cs="Noto Serif"/>
-          <w:b/>
-          <w:bCs/>
-        </w:rPr>
-        <w:t>neither, in any layer</w:t>
-      </w:r>
-      <w:r>
-        <w:rPr>
-          <w:rFonts w:ascii="Noto Serif" w:hAnsi="Noto Serif" w:cs="Noto Serif"/>
-        </w:rPr>
-        <w:t>. A sign an editor could barely make out is indistinguishable from one read with confidence.</w:t>
-      </w:r>
-    </w:p>
-    <w:p>
-      <w:pPr>
-        <w:pStyle w:val="BodyText"/>
-        <w:jc w:val="both"/>
-        <w:rPr>
-          <w:rFonts w:ascii="Noto Serif" w:hAnsi="Noto Serif" w:cs="Noto Serif"/>
-        </w:rPr>
-      </w:pPr>
-      <w:r>
-        <w:rPr>
-          <w:rFonts w:ascii="Noto Serif" w:hAnsi="Noto Serif" w:cs="Noto Serif"/>
-        </w:rPr>
-        <w:t>The defect was detected indirectly. Comparing fraction-sign counts against Corazza et al., most signs tracked closely — sign A707 is attested exactly 137 times in both — but sign A709 showed ten occurrences here against their one. Their footnote lists the doubtful instances they exclude, and our ten fall precisely in the documents they name. We were counting their excluded doubtful readings as certain.</w:t>
-      </w:r>
-    </w:p>
-    <w:p>
-      <w:pPr>
-        <w:pStyle w:val="BodyText"/>
-        <w:jc w:val="both"/>
-        <w:rPr>
-          <w:rFonts w:ascii="Noto Serif" w:hAnsi="Noto Serif" w:cs="Noto Serif"/>
-        </w:rPr>
-      </w:pPr>
-      <w:r>
-        <w:rPr>
-          <w:rFonts w:ascii="Noto Serif" w:hAnsi="Noto Serif" w:cs="Noto Serif"/>
-        </w:rPr>
-        <w:t>This is not bookkeeping. Corazza et al. build a statistical argument at p = 4 × 10</w:t>
-      </w:r>
-      <w:r>
-        <w:rPr>
-          <w:rFonts w:ascii="Times New Roman" w:hAnsi="Times New Roman" w:cs="Times New Roman"/>
-        </w:rPr>
-        <w:t>⁻</w:t>
-      </w:r>
-      <w:r>
-        <w:rPr>
-          <w:rFonts w:ascii="Noto Serif" w:hAnsi="Noto Serif" w:cs="Noto Serif"/>
-        </w:rPr>
-        <w:t xml:space="preserve">¹² that A709 is </w:t>
-      </w:r>
-      <w:r>
-        <w:rPr>
-          <w:rFonts w:ascii="Noto Serif" w:hAnsi="Noto Serif" w:cs="Noto Serif"/>
-          <w:i/>
-          <w:iCs/>
-        </w:rPr>
-        <w:t>not an independent sign</w:t>
-      </w:r>
-      <w:r>
-        <w:rPr>
-          <w:rFonts w:ascii="Noto Serif" w:hAnsi="Noto Serif" w:cs="Noto Serif"/>
-        </w:rPr>
-        <w:t>, and that argument rests on its rarity. On uncorrected counts the sign is ten times commoner and the argument would not go through.</w:t>
-      </w:r>
-    </w:p>
-    <w:p>
-      <w:pPr>
-        <w:pStyle w:val="BodyText"/>
-        <w:jc w:val="both"/>
-        <w:rPr>
-          <w:rFonts w:ascii="Noto Serif" w:hAnsi="Noto Serif" w:cs="Noto Serif"/>
-        </w:rPr>
-      </w:pPr>
-    </w:p>
-    <w:p>
-      <w:pPr>
-        <w:pStyle w:val="Heading3"/>
-        <w:jc w:val="both"/>
-        <w:rPr>
-          <w:rFonts w:ascii="Noto Serif" w:hAnsi="Noto Serif" w:cs="Noto Serif"/>
-          <w:sz w:val="26"/>
-          <w:szCs w:val="26"/>
-        </w:rPr>
-      </w:pPr>
-      <w:bookmarkStart w:id="32" w:name="Xb12ac3e3ba80d61b5d9f7155e093206a65f536c"/>
-      <w:bookmarkEnd w:id="31"/>
-      <w:r>
-        <w:rPr>
-          <w:rFonts w:ascii="Noto Serif" w:hAnsi="Noto Serif" w:cs="Noto Serif"/>
-          <w:sz w:val="26"/>
-          <w:szCs w:val="26"/>
-        </w:rPr>
-        <w:t>4.4 Recovering a witness that carries certainty</w:t>
-      </w:r>
-    </w:p>
-    <w:p>
-      <w:pPr>
-        <w:pStyle w:val="FirstParagraph"/>
-        <w:jc w:val="both"/>
-        <w:rPr>
-          <w:rFonts w:ascii="Noto Serif" w:hAnsi="Noto Serif" w:cs="Noto Serif"/>
-        </w:rPr>
-      </w:pPr>
-      <w:r>
-        <w:rPr>
-          <w:rFonts w:ascii="Noto Serif" w:hAnsi="Noto Serif" w:cs="Noto Serif"/>
-        </w:rPr>
-        <w:t xml:space="preserve">D12 cannot be fixed by better processing of the same source; it requires a corpus that records certainty natively. </w:t>
-      </w:r>
-      <w:proofErr w:type="spellStart"/>
-      <w:r>
-        <w:rPr>
-          <w:rFonts w:ascii="Noto Serif" w:hAnsi="Noto Serif" w:cs="Noto Serif"/>
-        </w:rPr>
-        <w:t>SigLA</w:t>
-      </w:r>
-      <w:proofErr w:type="spellEnd"/>
-      <w:r>
-        <w:rPr>
-          <w:rFonts w:ascii="Noto Serif" w:hAnsi="Noto Serif" w:cs="Noto Serif"/>
-        </w:rPr>
-        <w:t xml:space="preserve"> does.</w:t>
-      </w:r>
-    </w:p>
-    <w:p>
-      <w:pPr>
-        <w:pStyle w:val="BodyText"/>
-        <w:jc w:val="both"/>
-        <w:rPr>
-          <w:rFonts w:ascii="Noto Serif" w:hAnsi="Noto Serif" w:cs="Noto Serif"/>
-        </w:rPr>
-      </w:pPr>
-      <w:proofErr w:type="spellStart"/>
-      <w:r>
-        <w:rPr>
-          <w:rFonts w:ascii="Noto Serif" w:hAnsi="Noto Serif" w:cs="Noto Serif"/>
-        </w:rPr>
-        <w:t>SigLA</w:t>
-      </w:r>
-      <w:proofErr w:type="spellEnd"/>
-      <w:r>
-        <w:rPr>
-          <w:rFonts w:ascii="Noto Serif" w:hAnsi="Noto Serif" w:cs="Noto Serif"/>
-        </w:rPr>
-        <w:t xml:space="preserve"> ships its corpus as two </w:t>
-      </w:r>
-      <w:proofErr w:type="spellStart"/>
-      <w:r>
-        <w:rPr>
-          <w:rFonts w:ascii="Noto Serif" w:hAnsi="Noto Serif" w:cs="Noto Serif"/>
-        </w:rPr>
-        <w:t>OCaml</w:t>
-      </w:r>
-      <w:proofErr w:type="spellEnd"/>
-      <w:r>
-        <w:rPr>
-          <w:rFonts w:ascii="Noto Serif" w:hAnsi="Noto Serif" w:cs="Noto Serif"/>
-        </w:rPr>
-        <w:t xml:space="preserve"> </w:t>
+        <w:t xml:space="preserve">SigLA ships its corpus as two OCaml </w:t>
       </w:r>
       <w:r>
         <w:rPr>
@@ -5633,14 +5280,12 @@
                 <w:rFonts w:ascii="Noto Serif" w:hAnsi="Noto Serif" w:cs="Noto Serif"/>
               </w:rPr>
             </w:pPr>
-            <w:proofErr w:type="spellStart"/>
             <w:r>
               <w:rPr>
                 <w:rFonts w:ascii="Noto Serif" w:hAnsi="Noto Serif" w:cs="Noto Serif"/>
               </w:rPr>
               <w:t>SigLA</w:t>
             </w:r>
-            <w:proofErr w:type="spellEnd"/>
           </w:p>
         </w:tc>
         <w:tc>
@@ -5659,16 +5304,8 @@
               <w:rPr>
                 <w:rFonts w:ascii="Noto Serif" w:hAnsi="Noto Serif" w:cs="Noto Serif"/>
               </w:rPr>
-              <w:t xml:space="preserve">all overlapping, </w:t>
-            </w:r>
-            <w:proofErr w:type="spellStart"/>
-            <w:r>
-              <w:rPr>
-                <w:rFonts w:ascii="Noto Serif" w:hAnsi="Noto Serif" w:cs="Noto Serif"/>
-              </w:rPr>
-              <w:t>syllabograms</w:t>
-            </w:r>
-            <w:proofErr w:type="spellEnd"/>
+              <w:t>all overlapping, syllabograms</w:t>
+            </w:r>
           </w:p>
         </w:tc>
         <w:tc>
@@ -5776,67 +5413,15 @@
         <w:rPr>
           <w:rFonts w:ascii="Noto Serif" w:hAnsi="Noto Serif" w:cs="Noto Serif"/>
         </w:rPr>
-        <w:t xml:space="preserve">Sweep 3 required care. Comparing all signs gives 91.8%; comparing </w:t>
-      </w:r>
-      <w:proofErr w:type="spellStart"/>
-      <w:r>
-        <w:rPr>
-          <w:rFonts w:ascii="Noto Serif" w:hAnsi="Noto Serif" w:cs="Noto Serif"/>
-        </w:rPr>
-        <w:t>syllabograms</w:t>
-      </w:r>
-      <w:proofErr w:type="spellEnd"/>
-      <w:r>
-        <w:rPr>
-          <w:rFonts w:ascii="Noto Serif" w:hAnsi="Noto Serif" w:cs="Noto Serif"/>
-        </w:rPr>
-        <w:t xml:space="preserve"> only gives 95.9%. The gap is not disagreement but coverage: </w:t>
-      </w:r>
-      <w:proofErr w:type="spellStart"/>
-      <w:r>
-        <w:rPr>
-          <w:rFonts w:ascii="Noto Serif" w:hAnsi="Noto Serif" w:cs="Noto Serif"/>
-        </w:rPr>
-        <w:t>SigLA</w:t>
-      </w:r>
-      <w:proofErr w:type="spellEnd"/>
-      <w:r>
-        <w:rPr>
-          <w:rFonts w:ascii="Noto Serif" w:hAnsi="Noto Serif" w:cs="Noto Serif"/>
-        </w:rPr>
-        <w:t xml:space="preserve"> records 332 fraction tokens against 447 here, and sign A732 is absent entirely. A </w:t>
-      </w:r>
-      <w:proofErr w:type="spellStart"/>
-      <w:r>
-        <w:rPr>
-          <w:rFonts w:ascii="Noto Serif" w:hAnsi="Noto Serif" w:cs="Noto Serif"/>
-        </w:rPr>
-        <w:t>palaeographical</w:t>
-      </w:r>
-      <w:proofErr w:type="spellEnd"/>
-      <w:r>
-        <w:rPr>
-          <w:rFonts w:ascii="Noto Serif" w:hAnsi="Noto Serif" w:cs="Noto Serif"/>
-        </w:rPr>
-        <w:t xml:space="preserve"> database indexes drawn sign forms, so composite fractions are plausibly drawn as components or not drawn. </w:t>
-      </w:r>
-      <w:proofErr w:type="spellStart"/>
+        <w:t xml:space="preserve">Sweep 3 required care. Comparing all signs gives 91.8%; comparing syllabograms only gives 95.9%. The gap is not disagreement but coverage: SigLA records 332 fraction tokens against 447 here, and sign A732 is absent entirely. A palaeographical database indexes drawn sign forms, so composite fractions are plausibly drawn as components or not drawn. </w:t>
+      </w:r>
       <w:r>
         <w:rPr>
           <w:rFonts w:ascii="Noto Serif" w:hAnsi="Noto Serif" w:cs="Noto Serif"/>
           <w:b/>
           <w:bCs/>
         </w:rPr>
-        <w:t>SigLA</w:t>
-      </w:r>
-      <w:proofErr w:type="spellEnd"/>
-      <w:r>
-        <w:rPr>
-          <w:rFonts w:ascii="Noto Serif" w:hAnsi="Noto Serif" w:cs="Noto Serif"/>
-          <w:b/>
-          <w:bCs/>
-        </w:rPr>
-        <w:t xml:space="preserve"> must therefore not be used to adjudicate fraction counts</w:t>
+        <w:t>SigLA must therefore not be used to adjudicate fraction counts</w:t>
       </w:r>
       <w:r>
         <w:rPr>
@@ -5857,35 +5442,7 @@
         <w:rPr>
           <w:rFonts w:ascii="Noto Serif" w:hAnsi="Noto Serif" w:cs="Noto Serif"/>
         </w:rPr>
-        <w:t xml:space="preserve">A hypothesis that did not survive: after the KN </w:t>
-      </w:r>
-      <w:proofErr w:type="spellStart"/>
-      <w:r>
-        <w:rPr>
-          <w:rFonts w:ascii="Noto Serif" w:hAnsi="Noto Serif" w:cs="Noto Serif"/>
-        </w:rPr>
-        <w:t>Zc</w:t>
-      </w:r>
-      <w:proofErr w:type="spellEnd"/>
-      <w:r>
-        <w:rPr>
-          <w:rFonts w:ascii="Noto Serif" w:hAnsi="Noto Serif" w:cs="Noto Serif"/>
-        </w:rPr>
-        <w:t xml:space="preserve"> 6 case (§4.6) it seemed plausible that disagreements might concentrate in readings </w:t>
-      </w:r>
-      <w:proofErr w:type="spellStart"/>
-      <w:r>
-        <w:rPr>
-          <w:rFonts w:ascii="Noto Serif" w:hAnsi="Noto Serif" w:cs="Noto Serif"/>
-        </w:rPr>
-        <w:t>SigLA</w:t>
-      </w:r>
-      <w:proofErr w:type="spellEnd"/>
-      <w:r>
-        <w:rPr>
-          <w:rFonts w:ascii="Noto Serif" w:hAnsi="Noto Serif" w:cs="Noto Serif"/>
-        </w:rPr>
-        <w:t xml:space="preserve"> flags as doubtful. Corpus-wide they do not. Restricting to confident signs makes agreement slightly </w:t>
+        <w:t xml:space="preserve">A hypothesis that did not survive: after the KN Zc 6 case (§4.6) it seemed plausible that disagreements might concentrate in readings SigLA flags as doubtful. Corpus-wide they do not. Restricting to confident signs makes agreement slightly </w:t>
       </w:r>
       <w:r>
         <w:rPr>
@@ -5944,21 +5501,7 @@
         <w:rPr>
           <w:rFonts w:ascii="Noto Serif" w:hAnsi="Noto Serif" w:cs="Noto Serif"/>
         </w:rPr>
-        <w:t xml:space="preserve">The two long tails logged by the Younger sweeps totaled 137 sites. Eighty-four were testable against </w:t>
-      </w:r>
-      <w:proofErr w:type="spellStart"/>
-      <w:r>
-        <w:rPr>
-          <w:rFonts w:ascii="Noto Serif" w:hAnsi="Noto Serif" w:cs="Noto Serif"/>
-        </w:rPr>
-        <w:t>SigLA</w:t>
-      </w:r>
-      <w:proofErr w:type="spellEnd"/>
-      <w:r>
-        <w:rPr>
-          <w:rFonts w:ascii="Noto Serif" w:hAnsi="Noto Serif" w:cs="Noto Serif"/>
-        </w:rPr>
-        <w:t xml:space="preserve"> — sign-type conflicts in covered documents.</w:t>
+        <w:t>The two long tails logged by the Younger sweeps totaled 137 sites. Eighty-four were testable against SigLA — sign-type conflicts in covered documents.</w:t>
       </w:r>
     </w:p>
     <w:tbl>
@@ -6062,16 +5605,8 @@
               <w:rPr>
                 <w:rFonts w:ascii="Noto Serif" w:hAnsi="Noto Serif" w:cs="Noto Serif"/>
               </w:rPr>
-              <w:t xml:space="preserve">identical after </w:t>
-            </w:r>
-            <w:proofErr w:type="spellStart"/>
-            <w:r>
-              <w:rPr>
-                <w:rFonts w:ascii="Noto Serif" w:hAnsi="Noto Serif" w:cs="Noto Serif"/>
-              </w:rPr>
-              <w:t>normalisation</w:t>
-            </w:r>
-            <w:proofErr w:type="spellEnd"/>
+              <w:t>identical after normalisation</w:t>
+            </w:r>
           </w:p>
         </w:tc>
         <w:tc>
@@ -6160,21 +5695,7 @@
               <w:rPr>
                 <w:rFonts w:ascii="Noto Serif" w:hAnsi="Noto Serif" w:cs="Noto Serif"/>
               </w:rPr>
-              <w:t xml:space="preserve">near-identical, </w:t>
-            </w:r>
-            <w:proofErr w:type="spellStart"/>
-            <w:r>
-              <w:rPr>
-                <w:rFonts w:ascii="Noto Serif" w:hAnsi="Noto Serif" w:cs="Noto Serif"/>
-              </w:rPr>
-              <w:t>tokenisation</w:t>
-            </w:r>
-            <w:proofErr w:type="spellEnd"/>
-            <w:r>
-              <w:rPr>
-                <w:rFonts w:ascii="Noto Serif" w:hAnsi="Noto Serif" w:cs="Noto Serif"/>
-              </w:rPr>
-              <w:t xml:space="preserve"> or annotation only</w:t>
+              <w:t>near-identical, tokenisation or annotation only</w:t>
             </w:r>
           </w:p>
         </w:tc>
@@ -6260,19 +5781,11 @@
                 <w:rFonts w:ascii="Noto Serif" w:hAnsi="Noto Serif" w:cs="Noto Serif"/>
               </w:rPr>
             </w:pPr>
-            <w:proofErr w:type="spellStart"/>
-            <w:r>
-              <w:rPr>
-                <w:rFonts w:ascii="Noto Serif" w:hAnsi="Noto Serif" w:cs="Noto Serif"/>
-              </w:rPr>
-              <w:t>SigLA</w:t>
-            </w:r>
-            <w:proofErr w:type="spellEnd"/>
-            <w:r>
-              <w:rPr>
-                <w:rFonts w:ascii="Noto Serif" w:hAnsi="Noto Serif" w:cs="Noto Serif"/>
-              </w:rPr>
-              <w:t xml:space="preserve"> adjudicates, backs the source</w:t>
+            <w:r>
+              <w:rPr>
+                <w:rFonts w:ascii="Noto Serif" w:hAnsi="Noto Serif" w:cs="Noto Serif"/>
+              </w:rPr>
+              <w:t>SigLA adjudicates, backs the source</w:t>
             </w:r>
           </w:p>
         </w:tc>
@@ -6313,19 +5826,11 @@
                 <w:rFonts w:ascii="Noto Serif" w:hAnsi="Noto Serif" w:cs="Noto Serif"/>
               </w:rPr>
             </w:pPr>
-            <w:proofErr w:type="spellStart"/>
-            <w:r>
-              <w:rPr>
-                <w:rFonts w:ascii="Noto Serif" w:hAnsi="Noto Serif" w:cs="Noto Serif"/>
-              </w:rPr>
-              <w:t>SigLA</w:t>
-            </w:r>
-            <w:proofErr w:type="spellEnd"/>
-            <w:r>
-              <w:rPr>
-                <w:rFonts w:ascii="Noto Serif" w:hAnsi="Noto Serif" w:cs="Noto Serif"/>
-              </w:rPr>
-              <w:t xml:space="preserve"> adjudicates, backs Younger</w:t>
+            <w:r>
+              <w:rPr>
+                <w:rFonts w:ascii="Noto Serif" w:hAnsi="Noto Serif" w:cs="Noto Serif"/>
+              </w:rPr>
+              <w:t>SigLA adjudicates, backs Younger</w:t>
             </w:r>
           </w:p>
         </w:tc>
@@ -6370,16 +5875,8 @@
               <w:rPr>
                 <w:rFonts w:ascii="Noto Serif" w:hAnsi="Noto Serif" w:cs="Noto Serif"/>
               </w:rPr>
-              <w:t xml:space="preserve">ambiguous or absent in </w:t>
-            </w:r>
-            <w:proofErr w:type="spellStart"/>
-            <w:r>
-              <w:rPr>
-                <w:rFonts w:ascii="Noto Serif" w:hAnsi="Noto Serif" w:cs="Noto Serif"/>
-              </w:rPr>
-              <w:t>SigLA</w:t>
-            </w:r>
-            <w:proofErr w:type="spellEnd"/>
+              <w:t>ambiguous or absent in SigLA</w:t>
+            </w:r>
           </w:p>
         </w:tc>
         <w:tc>
@@ -6490,25 +5987,7 @@
           <w:b/>
           <w:bCs/>
         </w:rPr>
-        <w:t xml:space="preserve">Where </w:t>
-      </w:r>
-      <w:proofErr w:type="spellStart"/>
-      <w:r>
-        <w:rPr>
-          <w:rFonts w:ascii="Noto Serif" w:hAnsi="Noto Serif" w:cs="Noto Serif"/>
-          <w:b/>
-          <w:bCs/>
-        </w:rPr>
-        <w:t>SigLA</w:t>
-      </w:r>
-      <w:proofErr w:type="spellEnd"/>
-      <w:r>
-        <w:rPr>
-          <w:rFonts w:ascii="Noto Serif" w:hAnsi="Noto Serif" w:cs="Noto Serif"/>
-          <w:b/>
-          <w:bCs/>
-        </w:rPr>
-        <w:t xml:space="preserve"> can adjudicate a single-sign conflict it backs the source eleven times to two.</w:t>
+        <w:t>Where SigLA can adjudicate a single-sign conflict it backs the source eleven times to two.</w:t>
       </w:r>
       <w:r>
         <w:rPr>
@@ -6544,49 +6023,7 @@
         <w:rPr>
           <w:rFonts w:ascii="Noto Serif" w:hAnsi="Noto Serif" w:cs="Noto Serif"/>
         </w:rPr>
-        <w:t xml:space="preserve">One partial resolution came from the same exercise. KN </w:t>
-      </w:r>
-      <w:proofErr w:type="spellStart"/>
-      <w:r>
-        <w:rPr>
-          <w:rFonts w:ascii="Noto Serif" w:hAnsi="Noto Serif" w:cs="Noto Serif"/>
-        </w:rPr>
-        <w:t>Zc</w:t>
-      </w:r>
-      <w:proofErr w:type="spellEnd"/>
-      <w:r>
-        <w:rPr>
-          <w:rFonts w:ascii="Noto Serif" w:hAnsi="Noto Serif" w:cs="Noto Serif"/>
-        </w:rPr>
-        <w:t xml:space="preserve"> 6 is the only contested word-division site </w:t>
-      </w:r>
-      <w:proofErr w:type="spellStart"/>
-      <w:r>
-        <w:rPr>
-          <w:rFonts w:ascii="Noto Serif" w:hAnsi="Noto Serif" w:cs="Noto Serif"/>
-        </w:rPr>
-        <w:t>SigLA</w:t>
-      </w:r>
-      <w:proofErr w:type="spellEnd"/>
-      <w:r>
-        <w:rPr>
-          <w:rFonts w:ascii="Noto Serif" w:hAnsi="Noto Serif" w:cs="Noto Serif"/>
-        </w:rPr>
-        <w:t xml:space="preserve"> covers. </w:t>
-      </w:r>
-      <w:proofErr w:type="spellStart"/>
-      <w:r>
-        <w:rPr>
-          <w:rFonts w:ascii="Noto Serif" w:hAnsi="Noto Serif" w:cs="Noto Serif"/>
-        </w:rPr>
-        <w:t>SigLA</w:t>
-      </w:r>
-      <w:proofErr w:type="spellEnd"/>
-      <w:r>
-        <w:rPr>
-          <w:rFonts w:ascii="Noto Serif" w:hAnsi="Noto Serif" w:cs="Noto Serif"/>
-        </w:rPr>
-        <w:t xml:space="preserve"> records </w:t>
+        <w:t xml:space="preserve">One partial resolution came from the same exercise. KN Zc 6 is the only contested word-division site SigLA covers. SigLA records </w:t>
       </w:r>
       <w:r>
         <w:rPr>
@@ -7138,21 +6575,7 @@
               <w:rPr>
                 <w:rFonts w:ascii="Noto Serif" w:hAnsi="Noto Serif" w:cs="Noto Serif"/>
               </w:rPr>
-              <w:t xml:space="preserve">; </w:t>
-            </w:r>
-            <w:proofErr w:type="spellStart"/>
-            <w:r>
-              <w:rPr>
-                <w:rFonts w:ascii="Noto Serif" w:hAnsi="Noto Serif" w:cs="Noto Serif"/>
-              </w:rPr>
-              <w:t>SigLA</w:t>
-            </w:r>
-            <w:proofErr w:type="spellEnd"/>
-            <w:r>
-              <w:rPr>
-                <w:rFonts w:ascii="Noto Serif" w:hAnsi="Noto Serif" w:cs="Noto Serif"/>
-              </w:rPr>
-              <w:t xml:space="preserve"> imported</w:t>
+              <w:t>; SigLA imported</w:t>
             </w:r>
           </w:p>
         </w:tc>
@@ -10869,43 +10292,26 @@
           <w:rStyle w:val="VerbatimChar"/>
           <w:rFonts w:ascii="Noto Serif" w:hAnsi="Noto Serif" w:cs="Noto Serif"/>
         </w:rPr>
-        <w:t>data/</w:t>
-      </w:r>
-      <w:proofErr w:type="spellStart"/>
+        <w:t>data/power_analysis.json</w:t>
+      </w:r>
+      <w:r>
+        <w:rPr>
+          <w:rFonts w:ascii="Noto Serif" w:hAnsi="Noto Serif" w:cs="Noto Serif"/>
+        </w:rPr>
+        <w:t xml:space="preserve"> (regenerated 2026-08-04; see </w:t>
+      </w:r>
       <w:r>
         <w:rPr>
           <w:rStyle w:val="VerbatimChar"/>
           <w:rFonts w:ascii="Noto Serif" w:hAnsi="Noto Serif" w:cs="Noto Serif"/>
         </w:rPr>
-        <w:t>power_analysis.json</w:t>
-      </w:r>
-      <w:proofErr w:type="spellEnd"/>
-      <w:r>
-        <w:rPr>
-          <w:rFonts w:ascii="Noto Serif" w:hAnsi="Noto Serif" w:cs="Noto Serif"/>
-        </w:rPr>
-        <w:t xml:space="preserve"> (regenerated 2026-08-04; see </w:t>
-      </w:r>
-      <w:proofErr w:type="spellStart"/>
-      <w:r>
-        <w:rPr>
-          <w:rStyle w:val="VerbatimChar"/>
-          <w:rFonts w:ascii="Noto Serif" w:hAnsi="Noto Serif" w:cs="Noto Serif"/>
-        </w:rPr>
         <w:t>README.md</w:t>
       </w:r>
       <w:r>
         <w:rPr>
           <w:rFonts w:ascii="Noto Serif" w:hAnsi="Noto Serif" w:cs="Noto Serif"/>
         </w:rPr>
-        <w:t>’s</w:t>
-      </w:r>
-      <w:proofErr w:type="spellEnd"/>
-      <w:r>
-        <w:rPr>
-          <w:rFonts w:ascii="Noto Serif" w:hAnsi="Noto Serif" w:cs="Noto Serif"/>
-        </w:rPr>
-        <w:t xml:space="preserve"> “Last pipeline verification” for why that date matters).</w:t>
+        <w:t>’s “Last pipeline verification” for why that date matters).</w:t>
       </w:r>
     </w:p>
     <w:p>
@@ -14714,35 +14120,7 @@
         <w:rPr>
           <w:rFonts w:ascii="Noto Serif" w:hAnsi="Noto Serif" w:cs="Noto Serif"/>
         </w:rPr>
-        <w:t xml:space="preserve"> The standard view is that Minoan may have had a three-vowel system, since in Linear B most signs carrying /o/ and one carrying /e/ are Greek innovations rather than inherited. On that view the test above is mis-specified. Re-run with vowels collapsed </w:t>
-      </w:r>
-      <w:proofErr w:type="spellStart"/>
-      <w:r>
-        <w:rPr>
-          <w:rFonts w:ascii="Noto Serif" w:hAnsi="Noto Serif" w:cs="Noto Serif"/>
-        </w:rPr>
-        <w:t>e→i</w:t>
-      </w:r>
-      <w:proofErr w:type="spellEnd"/>
-      <w:r>
-        <w:rPr>
-          <w:rFonts w:ascii="Noto Serif" w:hAnsi="Noto Serif" w:cs="Noto Serif"/>
-        </w:rPr>
-        <w:t xml:space="preserve"> and </w:t>
-      </w:r>
-      <w:proofErr w:type="spellStart"/>
-      <w:r>
-        <w:rPr>
-          <w:rFonts w:ascii="Noto Serif" w:hAnsi="Noto Serif" w:cs="Noto Serif"/>
-        </w:rPr>
-        <w:t>o→u</w:t>
-      </w:r>
-      <w:proofErr w:type="spellEnd"/>
-      <w:r>
-        <w:rPr>
-          <w:rFonts w:ascii="Noto Serif" w:hAnsi="Noto Serif" w:cs="Noto Serif"/>
-        </w:rPr>
-        <w:t xml:space="preserve">, sampling improves from 49 to 135 observations per cell and the weak trend </w:t>
+        <w:t xml:space="preserve"> The standard view is that Minoan may have had a three-vowel system, since in Linear B most signs carrying /o/ and one carrying /e/ are Greek innovations rather than inherited. On that view the test above is mis-specified. Re-run with vowels collapsed e→i and o→u, sampling improves from 49 to 135 observations per cell and the weak trend </w:t>
       </w:r>
       <w:r>
         <w:rPr>
@@ -15029,21 +14407,7 @@
               <w:rPr>
                 <w:rFonts w:ascii="Noto Serif" w:hAnsi="Noto Serif" w:cs="Noto Serif"/>
               </w:rPr>
-              <w:t>Morphological segmentation (</w:t>
-            </w:r>
-            <w:proofErr w:type="spellStart"/>
-            <w:r>
-              <w:rPr>
-                <w:rFonts w:ascii="Noto Serif" w:hAnsi="Noto Serif" w:cs="Noto Serif"/>
-              </w:rPr>
-              <w:t>Morfessor</w:t>
-            </w:r>
-            <w:proofErr w:type="spellEnd"/>
-            <w:r>
-              <w:rPr>
-                <w:rFonts w:ascii="Noto Serif" w:hAnsi="Noto Serif" w:cs="Noto Serif"/>
-              </w:rPr>
-              <w:t>, BPE, etc.)</w:t>
+              <w:t>Morphological segmentation (Morfessor, BPE, etc.)</w:t>
             </w:r>
           </w:p>
         </w:tc>
@@ -15083,21 +14447,7 @@
               <w:rPr>
                 <w:rFonts w:ascii="Noto Serif" w:hAnsi="Noto Serif" w:cs="Noto Serif"/>
               </w:rPr>
-              <w:t xml:space="preserve">Requires substantially greater lexical recurrence than the corpus contains; segmentation becomes driven by </w:t>
-            </w:r>
-            <w:proofErr w:type="spellStart"/>
-            <w:r>
-              <w:rPr>
-                <w:rFonts w:ascii="Noto Serif" w:hAnsi="Noto Serif" w:cs="Noto Serif"/>
-              </w:rPr>
-              <w:t>optimisation</w:t>
-            </w:r>
-            <w:proofErr w:type="spellEnd"/>
-            <w:r>
-              <w:rPr>
-                <w:rFonts w:ascii="Noto Serif" w:hAnsi="Noto Serif" w:cs="Noto Serif"/>
-              </w:rPr>
-              <w:t xml:space="preserve"> assumptions, not recoverable morphology.</w:t>
+              <w:t>Requires substantially greater lexical recurrence than the corpus contains; segmentation becomes driven by optimisation assumptions, not recoverable morphology.</w:t>
             </w:r>
           </w:p>
         </w:tc>
@@ -15317,16 +14667,8 @@
               <w:rPr>
                 <w:rFonts w:ascii="Noto Serif" w:hAnsi="Noto Serif" w:cs="Noto Serif"/>
               </w:rPr>
-              <w:t xml:space="preserve">Syllable inventory </w:t>
-            </w:r>
-            <w:proofErr w:type="spellStart"/>
-            <w:r>
-              <w:rPr>
-                <w:rFonts w:ascii="Noto Serif" w:hAnsi="Noto Serif" w:cs="Noto Serif"/>
-              </w:rPr>
-              <w:t>optimisation</w:t>
-            </w:r>
-            <w:proofErr w:type="spellEnd"/>
+              <w:t>Syllable inventory optimisation</w:t>
+            </w:r>
           </w:p>
         </w:tc>
         <w:tc>
@@ -18253,17 +17595,8 @@
           <w:rStyle w:val="VerbatimChar"/>
           <w:rFonts w:ascii="Noto Serif" w:hAnsi="Noto Serif" w:cs="Noto Serif"/>
         </w:rPr>
-        <w:t xml:space="preserve">Corpus </w:t>
-      </w:r>
-      <w:proofErr w:type="spellStart"/>
-      <w:r>
-        <w:rPr>
-          <w:rStyle w:val="VerbatimChar"/>
-          <w:rFonts w:ascii="Noto Serif" w:hAnsi="Noto Serif" w:cs="Noto Serif"/>
-        </w:rPr>
-        <w:t>transnuméré</w:t>
-      </w:r>
-      <w:proofErr w:type="spellEnd"/>
+        <w:t>Corpus transnuméré</w:t>
+      </w:r>
       <w:r>
         <w:rPr>
           <w:rFonts w:ascii="Noto Serif" w:hAnsi="Noto Serif" w:cs="Noto Serif"/>
@@ -19872,21 +19205,7 @@
         <w:rPr>
           <w:rFonts w:ascii="Noto Serif" w:hAnsi="Noto Serif" w:cs="Noto Serif"/>
         </w:rPr>
-        <w:t xml:space="preserve"> </w:t>
-      </w:r>
-      <w:proofErr w:type="spellStart"/>
-      <w:r>
-        <w:rPr>
-          <w:rFonts w:ascii="Noto Serif" w:hAnsi="Noto Serif" w:cs="Noto Serif"/>
-        </w:rPr>
-        <w:t>SigLA’s</w:t>
-      </w:r>
-      <w:proofErr w:type="spellEnd"/>
-      <w:r>
-        <w:rPr>
-          <w:rFonts w:ascii="Noto Serif" w:hAnsi="Noto Serif" w:cs="Noto Serif"/>
-        </w:rPr>
-        <w:t xml:space="preserve"> corpus was accessible in principle and unreadable in practice, being stored in a binary format that discards field names. The decoder released with this paper makes 802 documents and 5144 attestations, with certainty and boundary annotation, available for statistical work for the first time. That has value independent of anything argued here.</w:t>
+        <w:t xml:space="preserve"> SigLA’s corpus was accessible in principle and unreadable in practice, being stored in a binary format that discards field names. The decoder released with this paper makes 802 documents and 5144 attestations, with certainty and boundary annotation, available for statistical work for the first time. That has value independent of anything argued here.</w:t>
       </w:r>
     </w:p>
     <w:p>
@@ -20008,21 +19327,7 @@
         <w:rPr>
           <w:rFonts w:ascii="Noto Serif" w:hAnsi="Noto Serif" w:cs="Noto Serif"/>
         </w:rPr>
-        <w:t xml:space="preserve"> Nothing here advances decipherment, and §7 argues that this corpus cannot. Nothing here bears on the affiliation of Minoan. Nothing here overturns Packard, Younger, Douros or </w:t>
-      </w:r>
-      <w:proofErr w:type="spellStart"/>
-      <w:r>
-        <w:rPr>
-          <w:rFonts w:ascii="Noto Serif" w:hAnsi="Noto Serif" w:cs="Noto Serif"/>
-        </w:rPr>
-        <w:t>Duhoux</w:t>
-      </w:r>
-      <w:proofErr w:type="spellEnd"/>
-      <w:r>
-        <w:rPr>
-          <w:rFonts w:ascii="Noto Serif" w:hAnsi="Noto Serif" w:cs="Noto Serif"/>
-        </w:rPr>
-        <w:t>; where their work is examined it is substantially vindicated, and where an earlier draft of this study thought otherwise, §5.5 records the retraction.</w:t>
+        <w:t xml:space="preserve"> Nothing here advances decipherment, and §7 argues that this corpus cannot. Nothing here bears on the affiliation of Minoan. Nothing here overturns Packard, Younger, Douros or Duhoux; where their work is examined it is substantially vindicated, and where an earlier draft of this study thought otherwise, §5.5 records the retraction.</w:t>
       </w:r>
     </w:p>
     <w:p>
@@ -20256,35 +19561,7 @@
         <w:rPr>
           <w:rFonts w:ascii="Noto Serif" w:hAnsi="Noto Serif" w:cs="Noto Serif"/>
         </w:rPr>
-        <w:t xml:space="preserve">The Packard name-parallel replication now restricts its Linear B lexicon to Knossos-attested names (154 of 429, checked against DĀMOS), matching his criterion; the underlying corpus is still not his own, so the restriction closes the naming gap without closing the corpus gap. The alternation replication uses GORILA numbering against his Raison-Pope numbering. The </w:t>
-      </w:r>
-      <w:proofErr w:type="spellStart"/>
-      <w:r>
-        <w:rPr>
-          <w:rFonts w:ascii="Noto Serif" w:hAnsi="Noto Serif" w:cs="Noto Serif"/>
-        </w:rPr>
-        <w:t>SigLA</w:t>
-      </w:r>
-      <w:proofErr w:type="spellEnd"/>
-      <w:r>
-        <w:rPr>
-          <w:rFonts w:ascii="Noto Serif" w:hAnsi="Noto Serif" w:cs="Noto Serif"/>
-        </w:rPr>
-        <w:t xml:space="preserve"> comparison is at sign-family level, since </w:t>
-      </w:r>
-      <w:proofErr w:type="spellStart"/>
-      <w:r>
-        <w:rPr>
-          <w:rFonts w:ascii="Noto Serif" w:hAnsi="Noto Serif" w:cs="Noto Serif"/>
-        </w:rPr>
-        <w:t>SigLA</w:t>
-      </w:r>
-      <w:proofErr w:type="spellEnd"/>
-      <w:r>
-        <w:rPr>
-          <w:rFonts w:ascii="Noto Serif" w:hAnsi="Noto Serif" w:cs="Noto Serif"/>
-        </w:rPr>
-        <w:t xml:space="preserve"> does not record gender variants. Each remaining looseness applies equally across compared conditions, so ratios hold; absolute counts do not fully transfer.</w:t>
+        <w:t>The Packard name-parallel replication now restricts its Linear B lexicon to Knossos-attested names (154 of 429, checked against DĀMOS), matching his criterion; the underlying corpus is still not his own, so the restriction closes the naming gap without closing the corpus gap. The alternation replication uses GORILA numbering against his Raison-Pope numbering. The SigLA comparison is at sign-family level, since SigLA does not record gender variants. Each remaining looseness applies equally across compared conditions, so ratios hold; absolute counts do not fully transfer.</w:t>
       </w:r>
     </w:p>
     <w:p>
@@ -20325,33 +19602,11 @@
           <w:rFonts w:ascii="Noto Serif" w:hAnsi="Noto Serif" w:cs="Noto Serif"/>
         </w:rPr>
       </w:pPr>
-      <w:proofErr w:type="spellStart"/>
-      <w:r>
-        <w:rPr>
-          <w:rFonts w:ascii="Noto Serif" w:hAnsi="Noto Serif" w:cs="Noto Serif"/>
-        </w:rPr>
-        <w:t>Duhoux’s</w:t>
-      </w:r>
-      <w:proofErr w:type="spellEnd"/>
-      <w:r>
-        <w:rPr>
-          <w:rFonts w:ascii="Noto Serif" w:hAnsi="Noto Serif" w:cs="Noto Serif"/>
-        </w:rPr>
-        <w:t xml:space="preserve"> affix analysis has not been examined in the original, being unavailable digitally. Given that this study’s reconstruction of Packard’s method was wrong three times before the primary source corrected it, no weight should be placed on this study’s reading of </w:t>
-      </w:r>
-      <w:proofErr w:type="spellStart"/>
-      <w:r>
-        <w:rPr>
-          <w:rFonts w:ascii="Noto Serif" w:hAnsi="Noto Serif" w:cs="Noto Serif"/>
-        </w:rPr>
-        <w:t>Duhoux’s</w:t>
-      </w:r>
-      <w:proofErr w:type="spellEnd"/>
-      <w:r>
-        <w:rPr>
-          <w:rFonts w:ascii="Noto Serif" w:hAnsi="Noto Serif" w:cs="Noto Serif"/>
-        </w:rPr>
-        <w:t xml:space="preserve"> method, and §5.5 places none.</w:t>
+      <w:r>
+        <w:rPr>
+          <w:rFonts w:ascii="Noto Serif" w:hAnsi="Noto Serif" w:cs="Noto Serif"/>
+        </w:rPr>
+        <w:t>Duhoux’s affix analysis has not been examined in the original, being unavailable digitally. Given that this study’s reconstruction of Packard’s method was wrong three times before the primary source corrected it, no weight should be placed on this study’s reading of Duhoux’s method, and §5.5 places none.</w:t>
       </w:r>
     </w:p>
     <w:p>
@@ -20366,21 +19621,7 @@
         <w:rPr>
           <w:rFonts w:ascii="Noto Serif" w:hAnsi="Noto Serif" w:cs="Noto Serif"/>
         </w:rPr>
-        <w:t xml:space="preserve">Davis’s treatment of the libation corpus and Steele and </w:t>
-      </w:r>
-      <w:proofErr w:type="spellStart"/>
-      <w:r>
-        <w:rPr>
-          <w:rFonts w:ascii="Noto Serif" w:hAnsi="Noto Serif" w:cs="Noto Serif"/>
-        </w:rPr>
-        <w:t>Meißner</w:t>
-      </w:r>
-      <w:proofErr w:type="spellEnd"/>
-      <w:r>
-        <w:rPr>
-          <w:rFonts w:ascii="Noto Serif" w:hAnsi="Noto Serif" w:cs="Noto Serif"/>
-        </w:rPr>
-        <w:t xml:space="preserve"> on backward projection have likewise not been consulted in the original.</w:t>
+        <w:t>Davis’s treatment of the libation corpus and Steele and Meißner on backward projection have likewise not been consulted in the original.</w:t>
       </w:r>
     </w:p>
     <w:p>
@@ -20436,19 +19677,11 @@
           <w:rFonts w:ascii="Noto Serif" w:hAnsi="Noto Serif" w:cs="Noto Serif"/>
         </w:rPr>
       </w:pPr>
-      <w:proofErr w:type="spellStart"/>
-      <w:r>
-        <w:rPr>
-          <w:rFonts w:ascii="Noto Serif" w:hAnsi="Noto Serif" w:cs="Noto Serif"/>
-        </w:rPr>
-        <w:t>SigLA</w:t>
-      </w:r>
-      <w:proofErr w:type="spellEnd"/>
-      <w:r>
-        <w:rPr>
-          <w:rFonts w:ascii="Noto Serif" w:hAnsi="Noto Serif" w:cs="Noto Serif"/>
-        </w:rPr>
-        <w:t xml:space="preserve"> does not record the M/F gender variants our source carries. The adjudication of §4.2 therefore establishes that the source assigns AB21 where AB22 belongs and vice versa, but says nothing about whether the gender assignment within each sign is correct.</w:t>
+      <w:r>
+        <w:rPr>
+          <w:rFonts w:ascii="Noto Serif" w:hAnsi="Noto Serif" w:cs="Noto Serif"/>
+        </w:rPr>
+        <w:t>SigLA does not record the M/F gender variants our source carries. The adjudication of §4.2 therefore establishes that the source assigns AB21 where AB22 belongs and vice versa, but says nothing about whether the gender assignment within each sign is correct.</w:t>
       </w:r>
     </w:p>
     <w:p>
@@ -20862,16 +20095,8 @@
               <w:rPr>
                 <w:rFonts w:ascii="Noto Serif" w:hAnsi="Noto Serif" w:cs="Noto Serif"/>
               </w:rPr>
-              <w:t xml:space="preserve">GORILA plates; not in </w:t>
-            </w:r>
-            <w:proofErr w:type="spellStart"/>
-            <w:r>
-              <w:rPr>
-                <w:rFonts w:ascii="Noto Serif" w:hAnsi="Noto Serif" w:cs="Noto Serif"/>
-              </w:rPr>
-              <w:t>SigLA</w:t>
-            </w:r>
-            <w:proofErr w:type="spellEnd"/>
+              <w:t>GORILA plates; not in SigLA</w:t>
+            </w:r>
           </w:p>
         </w:tc>
       </w:tr>
@@ -21063,21 +20288,7 @@
         <w:rPr>
           <w:rFonts w:ascii="Noto Serif" w:hAnsi="Noto Serif" w:cs="Noto Serif"/>
         </w:rPr>
-        <w:t xml:space="preserve">Five substantive claims made during this project were withdrawn or reversed before publication: the affix-direction challenge to </w:t>
-      </w:r>
-      <w:proofErr w:type="spellStart"/>
-      <w:r>
-        <w:rPr>
-          <w:rFonts w:ascii="Noto Serif" w:hAnsi="Noto Serif" w:cs="Noto Serif"/>
-        </w:rPr>
-        <w:t>Duhoux</w:t>
-      </w:r>
-      <w:proofErr w:type="spellEnd"/>
-      <w:r>
-        <w:rPr>
-          <w:rFonts w:ascii="Noto Serif" w:hAnsi="Noto Serif" w:cs="Noto Serif"/>
-        </w:rPr>
-        <w:t xml:space="preserve"> (§5.5), the scribal clustering effect (§9), the A301 positional finding (§5.4), the initial reading of the Packard replication as a refutation (§8.2), and the hypothesis that disagreements concentrate in doubtful readings (§4.5).</w:t>
+        <w:t>Five substantive claims made during this project were withdrawn or reversed before publication: the affix-direction challenge to Duhoux (§5.5), the scribal clustering effect (§9), the A301 positional finding (§5.4), the initial reading of the Packard replication as a refutation (§8.2), and the hypothesis that disagreements concentrate in doubtful readings (§4.5).</w:t>
       </w:r>
     </w:p>
     <w:p>
@@ -21279,21 +20490,7 @@
         <w:rPr>
           <w:rFonts w:ascii="Noto Serif" w:hAnsi="Noto Serif" w:cs="Noto Serif"/>
         </w:rPr>
-        <w:t xml:space="preserve"> failed because a single vivid case was generalized. The KN </w:t>
-      </w:r>
-      <w:proofErr w:type="spellStart"/>
-      <w:r>
-        <w:rPr>
-          <w:rFonts w:ascii="Noto Serif" w:hAnsi="Noto Serif" w:cs="Noto Serif"/>
-        </w:rPr>
-        <w:t>Zc</w:t>
-      </w:r>
-      <w:proofErr w:type="spellEnd"/>
-      <w:r>
-        <w:rPr>
-          <w:rFonts w:ascii="Noto Serif" w:hAnsi="Noto Serif" w:cs="Noto Serif"/>
-        </w:rPr>
-        <w:t xml:space="preserve"> 6 finding — an unreadable sign exactly at a contested boundary — was compelling and turned out not to describe the corpus: restricting to confident readings makes agreement slightly worse. </w:t>
+        <w:t xml:space="preserve"> failed because a single vivid case was generalized. The KN Zc 6 finding — an unreadable sign exactly at a contested boundary — was compelling and turned out not to describe the corpus: restricting to confident readings makes agreement slightly worse. </w:t>
       </w:r>
       <w:r>
         <w:rPr>
@@ -22357,21 +21554,7 @@
               <w:rPr>
                 <w:rFonts w:ascii="Noto Serif" w:hAnsi="Noto Serif" w:cs="Noto Serif"/>
               </w:rPr>
-              <w:t>Segment the lexicon morphologically (</w:t>
-            </w:r>
-            <w:proofErr w:type="spellStart"/>
-            <w:r>
-              <w:rPr>
-                <w:rFonts w:ascii="Noto Serif" w:hAnsi="Noto Serif" w:cs="Noto Serif"/>
-              </w:rPr>
-              <w:t>Morfessor</w:t>
-            </w:r>
-            <w:proofErr w:type="spellEnd"/>
-            <w:r>
-              <w:rPr>
-                <w:rFonts w:ascii="Noto Serif" w:hAnsi="Noto Serif" w:cs="Noto Serif"/>
-              </w:rPr>
-              <w:t>, BPE, or equivalent)</w:t>
+              <w:t>Segment the lexicon morphologically (Morfessor, BPE, or equivalent)</w:t>
             </w:r>
           </w:p>
         </w:tc>
@@ -22391,21 +21574,7 @@
               <w:rPr>
                 <w:rFonts w:ascii="Noto Serif" w:hAnsi="Noto Serif" w:cs="Noto Serif"/>
               </w:rPr>
-              <w:t xml:space="preserve">Requires lexical recurrence this corpus does not have; output would be driven by the </w:t>
-            </w:r>
-            <w:proofErr w:type="spellStart"/>
-            <w:r>
-              <w:rPr>
-                <w:rFonts w:ascii="Noto Serif" w:hAnsi="Noto Serif" w:cs="Noto Serif"/>
-              </w:rPr>
-              <w:t>optimiser’s</w:t>
-            </w:r>
-            <w:proofErr w:type="spellEnd"/>
-            <w:r>
-              <w:rPr>
-                <w:rFonts w:ascii="Noto Serif" w:hAnsi="Noto Serif" w:cs="Noto Serif"/>
-              </w:rPr>
-              <w:t xml:space="preserve"> priors, not recoverable structure</w:t>
+              <w:t>Requires lexical recurrence this corpus does not have; output would be driven by the optimiser’s priors, not recoverable structure</w:t>
             </w:r>
           </w:p>
         </w:tc>
@@ -22867,21 +22036,7 @@
         <w:rPr>
           <w:rFonts w:ascii="Noto Serif" w:hAnsi="Noto Serif" w:cs="Noto Serif"/>
         </w:rPr>
-        <w:t xml:space="preserve">Corazza, M., Ferrara, S., </w:t>
-      </w:r>
-      <w:proofErr w:type="spellStart"/>
-      <w:r>
-        <w:rPr>
-          <w:rFonts w:ascii="Noto Serif" w:hAnsi="Noto Serif" w:cs="Noto Serif"/>
-        </w:rPr>
-        <w:t>Montecchi</w:t>
-      </w:r>
-      <w:proofErr w:type="spellEnd"/>
-      <w:r>
-        <w:rPr>
-          <w:rFonts w:ascii="Noto Serif" w:hAnsi="Noto Serif" w:cs="Noto Serif"/>
-        </w:rPr>
-        <w:t xml:space="preserve">, B., Tamburini, F. &amp; Valério, M. (2021), “The mathematical values of fraction signs in the Linear A script: A computational, statistical and typological approach”, </w:t>
+        <w:t xml:space="preserve">Corazza, M., Ferrara, S., Montecchi, B., Tamburini, F. &amp; Valério, M. (2021), “The mathematical values of fraction signs in the Linear A script: A computational, statistical and typological approach”, </w:t>
       </w:r>
       <w:r>
         <w:rPr>
@@ -22953,21 +22108,7 @@
         <w:rPr>
           <w:rFonts w:ascii="Noto Serif" w:hAnsi="Noto Serif" w:cs="Noto Serif"/>
         </w:rPr>
-        <w:t xml:space="preserve">, </w:t>
-      </w:r>
-      <w:proofErr w:type="spellStart"/>
-      <w:r>
-        <w:rPr>
-          <w:rFonts w:ascii="Noto Serif" w:hAnsi="Noto Serif" w:cs="Noto Serif"/>
-        </w:rPr>
-        <w:t>Aegaeum</w:t>
-      </w:r>
-      <w:proofErr w:type="spellEnd"/>
-      <w:r>
-        <w:rPr>
-          <w:rFonts w:ascii="Noto Serif" w:hAnsi="Noto Serif" w:cs="Noto Serif"/>
-        </w:rPr>
-        <w:t xml:space="preserve"> 36, Leuven: Peeters.</w:t>
+        <w:t>, Aegaeum 36, Leuven: Peeters.</w:t>
       </w:r>
     </w:p>
     <w:p>
@@ -22978,75 +22119,11 @@
           <w:rFonts w:ascii="Noto Serif" w:hAnsi="Noto Serif" w:cs="Noto Serif"/>
         </w:rPr>
       </w:pPr>
-      <w:proofErr w:type="spellStart"/>
-      <w:r>
-        <w:rPr>
-          <w:rFonts w:ascii="Noto Serif" w:hAnsi="Noto Serif" w:cs="Noto Serif"/>
-        </w:rPr>
-        <w:t>Duhoux</w:t>
-      </w:r>
-      <w:proofErr w:type="spellEnd"/>
-      <w:r>
-        <w:rPr>
-          <w:rFonts w:ascii="Noto Serif" w:hAnsi="Noto Serif" w:cs="Noto Serif"/>
-        </w:rPr>
-        <w:t xml:space="preserve">, Y. (1978), “Une </w:t>
-      </w:r>
-      <w:proofErr w:type="spellStart"/>
-      <w:r>
-        <w:rPr>
-          <w:rFonts w:ascii="Noto Serif" w:hAnsi="Noto Serif" w:cs="Noto Serif"/>
-        </w:rPr>
-        <w:t>analyse</w:t>
-      </w:r>
-      <w:proofErr w:type="spellEnd"/>
-      <w:r>
-        <w:rPr>
-          <w:rFonts w:ascii="Noto Serif" w:hAnsi="Noto Serif" w:cs="Noto Serif"/>
-        </w:rPr>
-        <w:t xml:space="preserve"> </w:t>
-      </w:r>
-      <w:proofErr w:type="spellStart"/>
-      <w:r>
-        <w:rPr>
-          <w:rFonts w:ascii="Noto Serif" w:hAnsi="Noto Serif" w:cs="Noto Serif"/>
-        </w:rPr>
-        <w:t>linguistique</w:t>
-      </w:r>
-      <w:proofErr w:type="spellEnd"/>
-      <w:r>
-        <w:rPr>
-          <w:rFonts w:ascii="Noto Serif" w:hAnsi="Noto Serif" w:cs="Noto Serif"/>
-        </w:rPr>
-        <w:t xml:space="preserve"> du </w:t>
-      </w:r>
-      <w:proofErr w:type="spellStart"/>
-      <w:r>
-        <w:rPr>
-          <w:rFonts w:ascii="Noto Serif" w:hAnsi="Noto Serif" w:cs="Noto Serif"/>
-        </w:rPr>
-        <w:t>linéaire</w:t>
-      </w:r>
-      <w:proofErr w:type="spellEnd"/>
-      <w:r>
-        <w:rPr>
-          <w:rFonts w:ascii="Noto Serif" w:hAnsi="Noto Serif" w:cs="Noto Serif"/>
-        </w:rPr>
-        <w:t xml:space="preserve"> A”, in Y. </w:t>
-      </w:r>
-      <w:proofErr w:type="spellStart"/>
-      <w:r>
-        <w:rPr>
-          <w:rFonts w:ascii="Noto Serif" w:hAnsi="Noto Serif" w:cs="Noto Serif"/>
-        </w:rPr>
-        <w:t>Duhoux</w:t>
-      </w:r>
-      <w:proofErr w:type="spellEnd"/>
-      <w:r>
-        <w:rPr>
-          <w:rFonts w:ascii="Noto Serif" w:hAnsi="Noto Serif" w:cs="Noto Serif"/>
-        </w:rPr>
-        <w:t xml:space="preserve"> (ed.), </w:t>
+      <w:r>
+        <w:rPr>
+          <w:rFonts w:ascii="Noto Serif" w:hAnsi="Noto Serif" w:cs="Noto Serif"/>
+        </w:rPr>
+        <w:t xml:space="preserve">Duhoux, Y. (1978), “Une analyse linguistique du linéaire A”, in Y. Duhoux (ed.), </w:t>
       </w:r>
       <w:r>
         <w:rPr>
@@ -23054,49 +22131,129 @@
           <w:i/>
           <w:iCs/>
         </w:rPr>
-        <w:t xml:space="preserve">Études </w:t>
-      </w:r>
-      <w:proofErr w:type="spellStart"/>
+        <w:t>Études minoennes I: le linéaire A</w:t>
+      </w:r>
+      <w:r>
+        <w:rPr>
+          <w:rFonts w:ascii="Noto Serif" w:hAnsi="Noto Serif" w:cs="Noto Serif"/>
+        </w:rPr>
+        <w:t>, BCILL 14, Louvain: Peeters, 65–129.</w:t>
+      </w:r>
+    </w:p>
+    <w:p>
+      <w:pPr>
+        <w:pStyle w:val="BodyText"/>
+        <w:jc w:val="both"/>
+        <w:rPr>
+          <w:rFonts w:ascii="Noto Serif" w:hAnsi="Noto Serif" w:cs="Noto Serif"/>
+        </w:rPr>
+      </w:pPr>
+      <w:r>
+        <w:rPr>
+          <w:rFonts w:ascii="Noto Serif" w:hAnsi="Noto Serif" w:cs="Noto Serif"/>
+        </w:rPr>
+        <w:t xml:space="preserve">Godart, L. &amp; Olivier, J.-P. (1976–1985), </w:t>
+      </w:r>
       <w:r>
         <w:rPr>
           <w:rFonts w:ascii="Noto Serif" w:hAnsi="Noto Serif" w:cs="Noto Serif"/>
           <w:i/>
           <w:iCs/>
         </w:rPr>
-        <w:t>minoennes</w:t>
-      </w:r>
-      <w:proofErr w:type="spellEnd"/>
+        <w:t>Recueil des inscriptions en linéaire A</w:t>
+      </w:r>
+      <w:r>
+        <w:rPr>
+          <w:rFonts w:ascii="Noto Serif" w:hAnsi="Noto Serif" w:cs="Noto Serif"/>
+        </w:rPr>
+        <w:t>, Études Crétoises XXI, 1–5, Paris: Geuthner.</w:t>
+      </w:r>
+    </w:p>
+    <w:p>
+      <w:pPr>
+        <w:pStyle w:val="BodyText"/>
+        <w:jc w:val="both"/>
+        <w:rPr>
+          <w:rFonts w:ascii="Noto Serif" w:hAnsi="Noto Serif" w:cs="Noto Serif"/>
+        </w:rPr>
+      </w:pPr>
+      <w:r>
+        <w:rPr>
+          <w:rFonts w:ascii="Noto Serif" w:hAnsi="Noto Serif" w:cs="Noto Serif"/>
+        </w:rPr>
+        <w:t xml:space="preserve">Lazaridis, I. et al. (2017), “Genetic origins of the Minoans and Mycenaeans”, </w:t>
+      </w:r>
       <w:r>
         <w:rPr>
           <w:rFonts w:ascii="Noto Serif" w:hAnsi="Noto Serif" w:cs="Noto Serif"/>
           <w:i/>
           <w:iCs/>
         </w:rPr>
-        <w:t xml:space="preserve"> I: le </w:t>
-      </w:r>
-      <w:proofErr w:type="spellStart"/>
+        <w:t>Nature</w:t>
+      </w:r>
+      <w:r>
+        <w:rPr>
+          <w:rFonts w:ascii="Noto Serif" w:hAnsi="Noto Serif" w:cs="Noto Serif"/>
+        </w:rPr>
+        <w:t xml:space="preserve"> 548: 214–218. https://doi.org/10.1038/nature23310</w:t>
+      </w:r>
+    </w:p>
+    <w:p>
+      <w:pPr>
+        <w:pStyle w:val="BodyText"/>
+        <w:jc w:val="both"/>
+        <w:rPr>
+          <w:rFonts w:ascii="Noto Serif" w:hAnsi="Noto Serif" w:cs="Noto Serif"/>
+        </w:rPr>
+      </w:pPr>
+      <w:r>
+        <w:rPr>
+          <w:rFonts w:ascii="Noto Serif" w:hAnsi="Noto Serif" w:cs="Noto Serif"/>
+        </w:rPr>
+        <w:t xml:space="preserve">Luo, J., Cao, Y. &amp; Barzilay, R. (2019), “Neural Decipherment via Minimum-Cost Flow: From Ugaritic to Linear B”, </w:t>
+      </w:r>
       <w:r>
         <w:rPr>
           <w:rFonts w:ascii="Noto Serif" w:hAnsi="Noto Serif" w:cs="Noto Serif"/>
           <w:i/>
           <w:iCs/>
         </w:rPr>
-        <w:t>linéaire</w:t>
-      </w:r>
-      <w:proofErr w:type="spellEnd"/>
+        <w:t>Proceedings of ACL 2019</w:t>
+      </w:r>
+      <w:r>
+        <w:rPr>
+          <w:rFonts w:ascii="Noto Serif" w:hAnsi="Noto Serif" w:cs="Noto Serif"/>
+        </w:rPr>
+        <w:t>, 3146–3155.</w:t>
+      </w:r>
+    </w:p>
+    <w:p>
+      <w:pPr>
+        <w:pStyle w:val="BodyText"/>
+        <w:jc w:val="both"/>
+        <w:rPr>
+          <w:rFonts w:ascii="Noto Serif" w:hAnsi="Noto Serif" w:cs="Noto Serif"/>
+        </w:rPr>
+      </w:pPr>
+      <w:r>
+        <w:rPr>
+          <w:rFonts w:ascii="Noto Serif" w:hAnsi="Noto Serif" w:cs="Noto Serif"/>
+        </w:rPr>
+        <w:t xml:space="preserve">Packard, D. W. (1967), </w:t>
+      </w:r>
       <w:r>
         <w:rPr>
           <w:rFonts w:ascii="Noto Serif" w:hAnsi="Noto Serif" w:cs="Noto Serif"/>
           <w:i/>
           <w:iCs/>
         </w:rPr>
-        <w:t xml:space="preserve"> A</w:t>
-      </w:r>
-      <w:r>
-        <w:rPr>
-          <w:rFonts w:ascii="Noto Serif" w:hAnsi="Noto Serif" w:cs="Noto Serif"/>
-        </w:rPr>
-        <w:t>, BCILL 14, Louvain: Peeters, 65–129.</w:t>
+        <w:t>A Study of the Minoan Linear A Tablets</w:t>
+      </w:r>
+      <w:r>
+        <w:rPr>
+          <w:rFonts w:ascii="Noto Serif" w:hAnsi="Noto Serif" w:cs="Noto Serif"/>
+        </w:rPr>
+        <w:t>, unpublished doctoral dissertation, Harvard University.</w:t>
       </w:r>
     </w:p>
     <w:p>
@@ -23111,77 +22268,109 @@
         <w:rPr>
           <w:rFonts w:ascii="Noto Serif" w:hAnsi="Noto Serif" w:cs="Noto Serif"/>
         </w:rPr>
-        <w:t xml:space="preserve">Godart, L. &amp; Olivier, J.-P. (1976–1985), </w:t>
-      </w:r>
-      <w:proofErr w:type="spellStart"/>
+        <w:t xml:space="preserve">Packard, D. W. (1974), </w:t>
+      </w:r>
       <w:r>
         <w:rPr>
           <w:rFonts w:ascii="Noto Serif" w:hAnsi="Noto Serif" w:cs="Noto Serif"/>
           <w:i/>
           <w:iCs/>
         </w:rPr>
-        <w:t>Recueil</w:t>
-      </w:r>
-      <w:proofErr w:type="spellEnd"/>
+        <w:t>Minoan Linear A</w:t>
+      </w:r>
+      <w:r>
+        <w:rPr>
+          <w:rFonts w:ascii="Noto Serif" w:hAnsi="Noto Serif" w:cs="Noto Serif"/>
+        </w:rPr>
+        <w:t>, Berkeley, Los Angeles and London: University of California Press.</w:t>
+      </w:r>
+    </w:p>
+    <w:p>
+      <w:pPr>
+        <w:pStyle w:val="BodyText"/>
+        <w:jc w:val="both"/>
+        <w:rPr>
+          <w:rFonts w:ascii="Noto Serif" w:hAnsi="Noto Serif" w:cs="Noto Serif"/>
+        </w:rPr>
+      </w:pPr>
+      <w:r>
+        <w:rPr>
+          <w:rFonts w:ascii="Noto Serif" w:hAnsi="Noto Serif" w:cs="Noto Serif"/>
+        </w:rPr>
+        <w:t xml:space="preserve">Palaima, T. &amp; Sikkenga, E. (1999), “Linear A &gt; Linear B”, in </w:t>
+      </w:r>
       <w:r>
         <w:rPr>
           <w:rFonts w:ascii="Noto Serif" w:hAnsi="Noto Serif" w:cs="Noto Serif"/>
           <w:i/>
           <w:iCs/>
         </w:rPr>
-        <w:t xml:space="preserve"> des inscriptions en </w:t>
-      </w:r>
-      <w:proofErr w:type="spellStart"/>
+        <w:t>Meletemata: Studies in Aegean Archaeology Presented to Malcolm H. Wiener</w:t>
+      </w:r>
+      <w:r>
+        <w:rPr>
+          <w:rFonts w:ascii="Noto Serif" w:hAnsi="Noto Serif" w:cs="Noto Serif"/>
+        </w:rPr>
+        <w:t>, Aegaeum 20, 599–608.</w:t>
+      </w:r>
+    </w:p>
+    <w:p>
+      <w:pPr>
+        <w:pStyle w:val="BodyText"/>
+        <w:jc w:val="both"/>
+        <w:rPr>
+          <w:rFonts w:ascii="Noto Serif" w:hAnsi="Noto Serif" w:cs="Noto Serif"/>
+        </w:rPr>
+      </w:pPr>
+      <w:r>
+        <w:rPr>
+          <w:rFonts w:ascii="Noto Serif" w:hAnsi="Noto Serif" w:cs="Noto Serif"/>
+        </w:rPr>
+        <w:t xml:space="preserve">Pope, M. (1960), “Linear A and the Numerical Fractions”, </w:t>
+      </w:r>
       <w:r>
         <w:rPr>
           <w:rFonts w:ascii="Noto Serif" w:hAnsi="Noto Serif" w:cs="Noto Serif"/>
           <w:i/>
           <w:iCs/>
         </w:rPr>
-        <w:t>linéaire</w:t>
-      </w:r>
-      <w:proofErr w:type="spellEnd"/>
+        <w:t>Bulletin de correspondance hellénique</w:t>
+      </w:r>
+      <w:r>
+        <w:rPr>
+          <w:rFonts w:ascii="Noto Serif" w:hAnsi="Noto Serif" w:cs="Noto Serif"/>
+        </w:rPr>
+        <w:t xml:space="preserve"> 84: 216–229.</w:t>
+      </w:r>
+    </w:p>
+    <w:p>
+      <w:pPr>
+        <w:pStyle w:val="BodyText"/>
+        <w:jc w:val="both"/>
+        <w:rPr>
+          <w:rFonts w:ascii="Noto Serif" w:hAnsi="Noto Serif" w:cs="Noto Serif"/>
+        </w:rPr>
+      </w:pPr>
+      <w:r>
+        <w:rPr>
+          <w:rFonts w:ascii="Noto Serif" w:hAnsi="Noto Serif" w:cs="Noto Serif"/>
+        </w:rPr>
+        <w:lastRenderedPageBreak/>
+        <w:t xml:space="preserve">Pope, M. &amp; Raison, J. (1978), “Linear A: Changing Perspectives”, in Y. Duhoux (ed.), </w:t>
+      </w:r>
       <w:r>
         <w:rPr>
           <w:rFonts w:ascii="Noto Serif" w:hAnsi="Noto Serif" w:cs="Noto Serif"/>
           <w:i/>
           <w:iCs/>
         </w:rPr>
-        <w:t xml:space="preserve"> A</w:t>
-      </w:r>
-      <w:r>
-        <w:rPr>
-          <w:rFonts w:ascii="Noto Serif" w:hAnsi="Noto Serif" w:cs="Noto Serif"/>
-        </w:rPr>
-        <w:t xml:space="preserve">, Études </w:t>
-      </w:r>
-      <w:proofErr w:type="spellStart"/>
-      <w:r>
-        <w:rPr>
-          <w:rFonts w:ascii="Noto Serif" w:hAnsi="Noto Serif" w:cs="Noto Serif"/>
-        </w:rPr>
-        <w:t>Crétoises</w:t>
-      </w:r>
-      <w:proofErr w:type="spellEnd"/>
-      <w:r>
-        <w:rPr>
-          <w:rFonts w:ascii="Noto Serif" w:hAnsi="Noto Serif" w:cs="Noto Serif"/>
-        </w:rPr>
-        <w:t xml:space="preserve"> XXI, 1–5, Paris: </w:t>
-      </w:r>
-      <w:proofErr w:type="spellStart"/>
-      <w:r>
-        <w:rPr>
-          <w:rFonts w:ascii="Noto Serif" w:hAnsi="Noto Serif" w:cs="Noto Serif"/>
-        </w:rPr>
-        <w:t>Geuthner</w:t>
-      </w:r>
-      <w:proofErr w:type="spellEnd"/>
-      <w:r>
-        <w:rPr>
-          <w:rFonts w:ascii="Noto Serif" w:hAnsi="Noto Serif" w:cs="Noto Serif"/>
-        </w:rPr>
-        <w:t>.</w:t>
+        <w:t>Études minoennes I</w:t>
+      </w:r>
+      <w:r>
+        <w:rPr>
+          <w:rFonts w:ascii="Noto Serif" w:hAnsi="Noto Serif" w:cs="Noto Serif"/>
+        </w:rPr>
+        <w:t>, BCILL 14, Louvain: Peeters, 5–64.</w:t>
       </w:r>
     </w:p>
     <w:p>
@@ -23196,7 +22385,7 @@
         <w:rPr>
           <w:rFonts w:ascii="Noto Serif" w:hAnsi="Noto Serif" w:cs="Noto Serif"/>
         </w:rPr>
-        <w:t xml:space="preserve">Lazaridis, I. et al. (2017), “Genetic origins of the Minoans and Mycenaeans”, </w:t>
+        <w:t xml:space="preserve">Raison, J. &amp; Pope, M. (1994), </w:t>
       </w:r>
       <w:r>
         <w:rPr>
@@ -23204,13 +22393,13 @@
           <w:i/>
           <w:iCs/>
         </w:rPr>
-        <w:t>Nature</w:t>
-      </w:r>
-      <w:r>
-        <w:rPr>
-          <w:rFonts w:ascii="Noto Serif" w:hAnsi="Noto Serif" w:cs="Noto Serif"/>
-        </w:rPr>
-        <w:t xml:space="preserve"> 548: 214–218. https://doi.org/10.1038/nature23310</w:t>
+        <w:t>Corpus transnuméré du linéaire A</w:t>
+      </w:r>
+      <w:r>
+        <w:rPr>
+          <w:rFonts w:ascii="Noto Serif" w:hAnsi="Noto Serif" w:cs="Noto Serif"/>
+        </w:rPr>
+        <w:t>, 2nd ed., BCILL 74, Louvain-la-Neuve: Peeters.</w:t>
       </w:r>
     </w:p>
     <w:p>
@@ -23225,7 +22414,7 @@
         <w:rPr>
           <w:rFonts w:ascii="Noto Serif" w:hAnsi="Noto Serif" w:cs="Noto Serif"/>
         </w:rPr>
-        <w:t xml:space="preserve">Luo, J., Cao, Y. &amp; Barzilay, R. (2019), “Neural Decipherment via Minimum-Cost Flow: From Ugaritic to Linear B”, </w:t>
+        <w:t xml:space="preserve">Salgarella, E. (2020), </w:t>
       </w:r>
       <w:r>
         <w:rPr>
@@ -23233,13 +22422,13 @@
           <w:i/>
           <w:iCs/>
         </w:rPr>
-        <w:t>Proceedings of ACL 2019</w:t>
-      </w:r>
-      <w:r>
-        <w:rPr>
-          <w:rFonts w:ascii="Noto Serif" w:hAnsi="Noto Serif" w:cs="Noto Serif"/>
-        </w:rPr>
-        <w:t>, 3146–3155.</w:t>
+        <w:t>Aegean Linear Script(s): Rethinking the Relationship Between Linear A and Linear B</w:t>
+      </w:r>
+      <w:r>
+        <w:rPr>
+          <w:rFonts w:ascii="Noto Serif" w:hAnsi="Noto Serif" w:cs="Noto Serif"/>
+        </w:rPr>
+        <w:t>, Cambridge: Cambridge University Press.</w:t>
       </w:r>
     </w:p>
     <w:p>
@@ -23254,7 +22443,7 @@
         <w:rPr>
           <w:rFonts w:ascii="Noto Serif" w:hAnsi="Noto Serif" w:cs="Noto Serif"/>
         </w:rPr>
-        <w:t xml:space="preserve">Packard, D. W. (1967), </w:t>
+        <w:t xml:space="preserve">Salgarella, E. (2022), “Linear A”, </w:t>
       </w:r>
       <w:r>
         <w:rPr>
@@ -23262,13 +22451,13 @@
           <w:i/>
           <w:iCs/>
         </w:rPr>
-        <w:t>A Study of the Minoan Linear A Tablets</w:t>
-      </w:r>
-      <w:r>
-        <w:rPr>
-          <w:rFonts w:ascii="Noto Serif" w:hAnsi="Noto Serif" w:cs="Noto Serif"/>
-        </w:rPr>
-        <w:t>, unpublished doctoral dissertation, Harvard University.</w:t>
+        <w:t>Oxford Classical Dictionary</w:t>
+      </w:r>
+      <w:r>
+        <w:rPr>
+          <w:rFonts w:ascii="Noto Serif" w:hAnsi="Noto Serif" w:cs="Noto Serif"/>
+        </w:rPr>
+        <w:t>. https://doi.org/10.1093/acrefore/9780199381135.013.8927</w:t>
       </w:r>
     </w:p>
     <w:p>
@@ -23283,7 +22472,7 @@
         <w:rPr>
           <w:rFonts w:ascii="Noto Serif" w:hAnsi="Noto Serif" w:cs="Noto Serif"/>
         </w:rPr>
-        <w:t xml:space="preserve">Packard, D. W. (1974), </w:t>
+        <w:t xml:space="preserve">Salgarella, E. &amp; Castellan, S. (2021), “SigLA: The Signs of Linear A. A Paleographical Database”, </w:t>
       </w:r>
       <w:r>
         <w:rPr>
@@ -23291,13 +22480,13 @@
           <w:i/>
           <w:iCs/>
         </w:rPr>
-        <w:t>Minoan Linear A</w:t>
-      </w:r>
-      <w:r>
-        <w:rPr>
-          <w:rFonts w:ascii="Noto Serif" w:hAnsi="Noto Serif" w:cs="Noto Serif"/>
-        </w:rPr>
-        <w:t>, Berkeley, Los Angeles and London: University of California Press.</w:t>
+        <w:t>Proceedings of the 5th International Conference on Digital Access to Textual Cultural Heritage</w:t>
+      </w:r>
+      <w:r>
+        <w:rPr>
+          <w:rFonts w:ascii="Noto Serif" w:hAnsi="Noto Serif" w:cs="Noto Serif"/>
+        </w:rPr>
+        <w:t>. https://sigla.phis.me/</w:t>
       </w:r>
     </w:p>
     <w:p>
@@ -23312,45 +22501,50 @@
         <w:rPr>
           <w:rFonts w:ascii="Noto Serif" w:hAnsi="Noto Serif" w:cs="Noto Serif"/>
         </w:rPr>
-        <w:t xml:space="preserve">Palaima, T. &amp; Sikkenga, E. (1999), “Linear A &gt; Linear B”, in </w:t>
-      </w:r>
-      <w:proofErr w:type="spellStart"/>
+        <w:t xml:space="preserve">Schoep, I. (2002), </w:t>
+      </w:r>
       <w:r>
         <w:rPr>
           <w:rFonts w:ascii="Noto Serif" w:hAnsi="Noto Serif" w:cs="Noto Serif"/>
           <w:i/>
           <w:iCs/>
         </w:rPr>
-        <w:t>Meletemata</w:t>
-      </w:r>
-      <w:proofErr w:type="spellEnd"/>
+        <w:t>The Administration of Neopalatial Crete: A Critical Assessment of the Linear A Tablets and Their Role in the Administrative Process</w:t>
+      </w:r>
+      <w:r>
+        <w:rPr>
+          <w:rFonts w:ascii="Noto Serif" w:hAnsi="Noto Serif" w:cs="Noto Serif"/>
+        </w:rPr>
+        <w:t>, Salamanca: Ediciones Universidad de Salamanca.</w:t>
+      </w:r>
+    </w:p>
+    <w:p>
+      <w:pPr>
+        <w:pStyle w:val="BodyText"/>
+        <w:jc w:val="both"/>
+        <w:rPr>
+          <w:rFonts w:ascii="Noto Serif" w:hAnsi="Noto Serif" w:cs="Noto Serif"/>
+        </w:rPr>
+      </w:pPr>
+      <w:r>
+        <w:rPr>
+          <w:rFonts w:ascii="Noto Serif" w:hAnsi="Noto Serif" w:cs="Noto Serif"/>
+        </w:rPr>
+        <w:t xml:space="preserve">Steele, P. M. &amp; Meißner, T. (2017), “From Linear B to Linear A: The Problem of the Backward Projection of Sound Values”, in P. M. Steele (ed.), </w:t>
+      </w:r>
       <w:r>
         <w:rPr>
           <w:rFonts w:ascii="Noto Serif" w:hAnsi="Noto Serif" w:cs="Noto Serif"/>
           <w:i/>
           <w:iCs/>
         </w:rPr>
-        <w:t>: Studies in Aegean Archaeology Presented to Malcolm H. Wiener</w:t>
-      </w:r>
-      <w:r>
-        <w:rPr>
-          <w:rFonts w:ascii="Noto Serif" w:hAnsi="Noto Serif" w:cs="Noto Serif"/>
-        </w:rPr>
-        <w:t xml:space="preserve">, </w:t>
-      </w:r>
-      <w:proofErr w:type="spellStart"/>
-      <w:r>
-        <w:rPr>
-          <w:rFonts w:ascii="Noto Serif" w:hAnsi="Noto Serif" w:cs="Noto Serif"/>
-        </w:rPr>
-        <w:t>Aegaeum</w:t>
-      </w:r>
-      <w:proofErr w:type="spellEnd"/>
-      <w:r>
-        <w:rPr>
-          <w:rFonts w:ascii="Noto Serif" w:hAnsi="Noto Serif" w:cs="Noto Serif"/>
-        </w:rPr>
-        <w:t xml:space="preserve"> 20, 599–608.</w:t>
+        <w:t>Understanding Relations Between Scripts: The Aegean Writing Systems</w:t>
+      </w:r>
+      <w:r>
+        <w:rPr>
+          <w:rFonts w:ascii="Noto Serif" w:hAnsi="Noto Serif" w:cs="Noto Serif"/>
+        </w:rPr>
+        <w:t>, Oxford: Oxbow, 93–110.</w:t>
       </w:r>
     </w:p>
     <w:p>
@@ -23365,434 +22559,7 @@
         <w:rPr>
           <w:rFonts w:ascii="Noto Serif" w:hAnsi="Noto Serif" w:cs="Noto Serif"/>
         </w:rPr>
-        <w:t xml:space="preserve">Pope, M. (1960), “Linear A and the Numerical Fractions”, </w:t>
-      </w:r>
-      <w:r>
-        <w:rPr>
-          <w:rFonts w:ascii="Noto Serif" w:hAnsi="Noto Serif" w:cs="Noto Serif"/>
-          <w:i/>
-          <w:iCs/>
-        </w:rPr>
-        <w:t xml:space="preserve">Bulletin de </w:t>
-      </w:r>
-      <w:proofErr w:type="spellStart"/>
-      <w:r>
-        <w:rPr>
-          <w:rFonts w:ascii="Noto Serif" w:hAnsi="Noto Serif" w:cs="Noto Serif"/>
-          <w:i/>
-          <w:iCs/>
-        </w:rPr>
-        <w:t>correspondance</w:t>
-      </w:r>
-      <w:proofErr w:type="spellEnd"/>
-      <w:r>
-        <w:rPr>
-          <w:rFonts w:ascii="Noto Serif" w:hAnsi="Noto Serif" w:cs="Noto Serif"/>
-          <w:i/>
-          <w:iCs/>
-        </w:rPr>
-        <w:t xml:space="preserve"> </w:t>
-      </w:r>
-      <w:proofErr w:type="spellStart"/>
-      <w:r>
-        <w:rPr>
-          <w:rFonts w:ascii="Noto Serif" w:hAnsi="Noto Serif" w:cs="Noto Serif"/>
-          <w:i/>
-          <w:iCs/>
-        </w:rPr>
-        <w:t>hellénique</w:t>
-      </w:r>
-      <w:proofErr w:type="spellEnd"/>
-      <w:r>
-        <w:rPr>
-          <w:rFonts w:ascii="Noto Serif" w:hAnsi="Noto Serif" w:cs="Noto Serif"/>
-        </w:rPr>
-        <w:t xml:space="preserve"> 84: 216–229.</w:t>
-      </w:r>
-    </w:p>
-    <w:p>
-      <w:pPr>
-        <w:pStyle w:val="BodyText"/>
-        <w:jc w:val="both"/>
-        <w:rPr>
-          <w:rFonts w:ascii="Noto Serif" w:hAnsi="Noto Serif" w:cs="Noto Serif"/>
-        </w:rPr>
-      </w:pPr>
-      <w:r>
-        <w:rPr>
-          <w:rFonts w:ascii="Noto Serif" w:hAnsi="Noto Serif" w:cs="Noto Serif"/>
-        </w:rPr>
-        <w:lastRenderedPageBreak/>
-        <w:t xml:space="preserve">Pope, M. &amp; Raison, J. (1978), “Linear A: Changing Perspectives”, in Y. </w:t>
-      </w:r>
-      <w:proofErr w:type="spellStart"/>
-      <w:r>
-        <w:rPr>
-          <w:rFonts w:ascii="Noto Serif" w:hAnsi="Noto Serif" w:cs="Noto Serif"/>
-        </w:rPr>
-        <w:t>Duhoux</w:t>
-      </w:r>
-      <w:proofErr w:type="spellEnd"/>
-      <w:r>
-        <w:rPr>
-          <w:rFonts w:ascii="Noto Serif" w:hAnsi="Noto Serif" w:cs="Noto Serif"/>
-        </w:rPr>
-        <w:t xml:space="preserve"> (ed.), </w:t>
-      </w:r>
-      <w:r>
-        <w:rPr>
-          <w:rFonts w:ascii="Noto Serif" w:hAnsi="Noto Serif" w:cs="Noto Serif"/>
-          <w:i/>
-          <w:iCs/>
-        </w:rPr>
-        <w:t xml:space="preserve">Études </w:t>
-      </w:r>
-      <w:proofErr w:type="spellStart"/>
-      <w:r>
-        <w:rPr>
-          <w:rFonts w:ascii="Noto Serif" w:hAnsi="Noto Serif" w:cs="Noto Serif"/>
-          <w:i/>
-          <w:iCs/>
-        </w:rPr>
-        <w:t>minoennes</w:t>
-      </w:r>
-      <w:proofErr w:type="spellEnd"/>
-      <w:r>
-        <w:rPr>
-          <w:rFonts w:ascii="Noto Serif" w:hAnsi="Noto Serif" w:cs="Noto Serif"/>
-          <w:i/>
-          <w:iCs/>
-        </w:rPr>
-        <w:t xml:space="preserve"> I</w:t>
-      </w:r>
-      <w:r>
-        <w:rPr>
-          <w:rFonts w:ascii="Noto Serif" w:hAnsi="Noto Serif" w:cs="Noto Serif"/>
-        </w:rPr>
-        <w:t>, BCILL 14, Louvain: Peeters, 5–64.</w:t>
-      </w:r>
-    </w:p>
-    <w:p>
-      <w:pPr>
-        <w:pStyle w:val="BodyText"/>
-        <w:jc w:val="both"/>
-        <w:rPr>
-          <w:rFonts w:ascii="Noto Serif" w:hAnsi="Noto Serif" w:cs="Noto Serif"/>
-        </w:rPr>
-      </w:pPr>
-      <w:r>
-        <w:rPr>
-          <w:rFonts w:ascii="Noto Serif" w:hAnsi="Noto Serif" w:cs="Noto Serif"/>
-        </w:rPr>
-        <w:t xml:space="preserve">Raison, J. &amp; Pope, M. (1994), </w:t>
-      </w:r>
-      <w:r>
-        <w:rPr>
-          <w:rFonts w:ascii="Noto Serif" w:hAnsi="Noto Serif" w:cs="Noto Serif"/>
-          <w:i/>
-          <w:iCs/>
-        </w:rPr>
-        <w:t xml:space="preserve">Corpus </w:t>
-      </w:r>
-      <w:proofErr w:type="spellStart"/>
-      <w:r>
-        <w:rPr>
-          <w:rFonts w:ascii="Noto Serif" w:hAnsi="Noto Serif" w:cs="Noto Serif"/>
-          <w:i/>
-          <w:iCs/>
-        </w:rPr>
-        <w:t>transnuméré</w:t>
-      </w:r>
-      <w:proofErr w:type="spellEnd"/>
-      <w:r>
-        <w:rPr>
-          <w:rFonts w:ascii="Noto Serif" w:hAnsi="Noto Serif" w:cs="Noto Serif"/>
-          <w:i/>
-          <w:iCs/>
-        </w:rPr>
-        <w:t xml:space="preserve"> du </w:t>
-      </w:r>
-      <w:proofErr w:type="spellStart"/>
-      <w:r>
-        <w:rPr>
-          <w:rFonts w:ascii="Noto Serif" w:hAnsi="Noto Serif" w:cs="Noto Serif"/>
-          <w:i/>
-          <w:iCs/>
-        </w:rPr>
-        <w:t>linéaire</w:t>
-      </w:r>
-      <w:proofErr w:type="spellEnd"/>
-      <w:r>
-        <w:rPr>
-          <w:rFonts w:ascii="Noto Serif" w:hAnsi="Noto Serif" w:cs="Noto Serif"/>
-          <w:i/>
-          <w:iCs/>
-        </w:rPr>
-        <w:t xml:space="preserve"> A</w:t>
-      </w:r>
-      <w:r>
-        <w:rPr>
-          <w:rFonts w:ascii="Noto Serif" w:hAnsi="Noto Serif" w:cs="Noto Serif"/>
-        </w:rPr>
-        <w:t>, 2nd ed., BCILL 74, Louvain-la-</w:t>
-      </w:r>
-      <w:proofErr w:type="spellStart"/>
-      <w:r>
-        <w:rPr>
-          <w:rFonts w:ascii="Noto Serif" w:hAnsi="Noto Serif" w:cs="Noto Serif"/>
-        </w:rPr>
-        <w:t>Neuve</w:t>
-      </w:r>
-      <w:proofErr w:type="spellEnd"/>
-      <w:r>
-        <w:rPr>
-          <w:rFonts w:ascii="Noto Serif" w:hAnsi="Noto Serif" w:cs="Noto Serif"/>
-        </w:rPr>
-        <w:t>: Peeters.</w:t>
-      </w:r>
-    </w:p>
-    <w:p>
-      <w:pPr>
-        <w:pStyle w:val="BodyText"/>
-        <w:jc w:val="both"/>
-        <w:rPr>
-          <w:rFonts w:ascii="Noto Serif" w:hAnsi="Noto Serif" w:cs="Noto Serif"/>
-        </w:rPr>
-      </w:pPr>
-      <w:proofErr w:type="spellStart"/>
-      <w:r>
-        <w:rPr>
-          <w:rFonts w:ascii="Noto Serif" w:hAnsi="Noto Serif" w:cs="Noto Serif"/>
-        </w:rPr>
-        <w:t>Salgarella</w:t>
-      </w:r>
-      <w:proofErr w:type="spellEnd"/>
-      <w:r>
-        <w:rPr>
-          <w:rFonts w:ascii="Noto Serif" w:hAnsi="Noto Serif" w:cs="Noto Serif"/>
-        </w:rPr>
-        <w:t xml:space="preserve">, E. (2020), </w:t>
-      </w:r>
-      <w:r>
-        <w:rPr>
-          <w:rFonts w:ascii="Noto Serif" w:hAnsi="Noto Serif" w:cs="Noto Serif"/>
-          <w:i/>
-          <w:iCs/>
-        </w:rPr>
-        <w:t>Aegean Linear Script(s): Rethinking the Relationship Between Linear A and Linear B</w:t>
-      </w:r>
-      <w:r>
-        <w:rPr>
-          <w:rFonts w:ascii="Noto Serif" w:hAnsi="Noto Serif" w:cs="Noto Serif"/>
-        </w:rPr>
-        <w:t>, Cambridge: Cambridge University Press.</w:t>
-      </w:r>
-    </w:p>
-    <w:p>
-      <w:pPr>
-        <w:pStyle w:val="BodyText"/>
-        <w:jc w:val="both"/>
-        <w:rPr>
-          <w:rFonts w:ascii="Noto Serif" w:hAnsi="Noto Serif" w:cs="Noto Serif"/>
-        </w:rPr>
-      </w:pPr>
-      <w:proofErr w:type="spellStart"/>
-      <w:r>
-        <w:rPr>
-          <w:rFonts w:ascii="Noto Serif" w:hAnsi="Noto Serif" w:cs="Noto Serif"/>
-        </w:rPr>
-        <w:t>Salgarella</w:t>
-      </w:r>
-      <w:proofErr w:type="spellEnd"/>
-      <w:r>
-        <w:rPr>
-          <w:rFonts w:ascii="Noto Serif" w:hAnsi="Noto Serif" w:cs="Noto Serif"/>
-        </w:rPr>
-        <w:t xml:space="preserve">, E. (2022), “Linear A”, </w:t>
-      </w:r>
-      <w:r>
-        <w:rPr>
-          <w:rFonts w:ascii="Noto Serif" w:hAnsi="Noto Serif" w:cs="Noto Serif"/>
-          <w:i/>
-          <w:iCs/>
-        </w:rPr>
-        <w:t>Oxford Classical Dictionary</w:t>
-      </w:r>
-      <w:r>
-        <w:rPr>
-          <w:rFonts w:ascii="Noto Serif" w:hAnsi="Noto Serif" w:cs="Noto Serif"/>
-        </w:rPr>
-        <w:t>. https://doi.org/10.1093/acrefore/9780199381135.013.8927</w:t>
-      </w:r>
-    </w:p>
-    <w:p>
-      <w:pPr>
-        <w:pStyle w:val="BodyText"/>
-        <w:jc w:val="both"/>
-        <w:rPr>
-          <w:rFonts w:ascii="Noto Serif" w:hAnsi="Noto Serif" w:cs="Noto Serif"/>
-        </w:rPr>
-      </w:pPr>
-      <w:proofErr w:type="spellStart"/>
-      <w:r>
-        <w:rPr>
-          <w:rFonts w:ascii="Noto Serif" w:hAnsi="Noto Serif" w:cs="Noto Serif"/>
-        </w:rPr>
-        <w:t>Salgarella</w:t>
-      </w:r>
-      <w:proofErr w:type="spellEnd"/>
-      <w:r>
-        <w:rPr>
-          <w:rFonts w:ascii="Noto Serif" w:hAnsi="Noto Serif" w:cs="Noto Serif"/>
-        </w:rPr>
-        <w:t>, E. &amp; Castellan, S. (2021), “</w:t>
-      </w:r>
-      <w:proofErr w:type="spellStart"/>
-      <w:r>
-        <w:rPr>
-          <w:rFonts w:ascii="Noto Serif" w:hAnsi="Noto Serif" w:cs="Noto Serif"/>
-        </w:rPr>
-        <w:t>SigLA</w:t>
-      </w:r>
-      <w:proofErr w:type="spellEnd"/>
-      <w:r>
-        <w:rPr>
-          <w:rFonts w:ascii="Noto Serif" w:hAnsi="Noto Serif" w:cs="Noto Serif"/>
-        </w:rPr>
-        <w:t xml:space="preserve">: The Signs of Linear A. A Paleographical Database”, </w:t>
-      </w:r>
-      <w:r>
-        <w:rPr>
-          <w:rFonts w:ascii="Noto Serif" w:hAnsi="Noto Serif" w:cs="Noto Serif"/>
-          <w:i/>
-          <w:iCs/>
-        </w:rPr>
-        <w:t>Proceedings of the 5th International Conference on Digital Access to Textual Cultural Heritage</w:t>
-      </w:r>
-      <w:r>
-        <w:rPr>
-          <w:rFonts w:ascii="Noto Serif" w:hAnsi="Noto Serif" w:cs="Noto Serif"/>
-        </w:rPr>
-        <w:t>. https://sigla.phis.me/</w:t>
-      </w:r>
-    </w:p>
-    <w:p>
-      <w:pPr>
-        <w:pStyle w:val="BodyText"/>
-        <w:jc w:val="both"/>
-        <w:rPr>
-          <w:rFonts w:ascii="Noto Serif" w:hAnsi="Noto Serif" w:cs="Noto Serif"/>
-        </w:rPr>
-      </w:pPr>
-      <w:r>
-        <w:rPr>
-          <w:rFonts w:ascii="Noto Serif" w:hAnsi="Noto Serif" w:cs="Noto Serif"/>
-        </w:rPr>
-        <w:t xml:space="preserve">Schoep, I. (2002), </w:t>
-      </w:r>
-      <w:r>
-        <w:rPr>
-          <w:rFonts w:ascii="Noto Serif" w:hAnsi="Noto Serif" w:cs="Noto Serif"/>
-          <w:i/>
-          <w:iCs/>
-        </w:rPr>
-        <w:t xml:space="preserve">The Administration of </w:t>
-      </w:r>
-      <w:proofErr w:type="spellStart"/>
-      <w:r>
-        <w:rPr>
-          <w:rFonts w:ascii="Noto Serif" w:hAnsi="Noto Serif" w:cs="Noto Serif"/>
-          <w:i/>
-          <w:iCs/>
-        </w:rPr>
-        <w:t>Neopalatial</w:t>
-      </w:r>
-      <w:proofErr w:type="spellEnd"/>
-      <w:r>
-        <w:rPr>
-          <w:rFonts w:ascii="Noto Serif" w:hAnsi="Noto Serif" w:cs="Noto Serif"/>
-          <w:i/>
-          <w:iCs/>
-        </w:rPr>
-        <w:t xml:space="preserve"> Crete: A Critical Assessment of the Linear A Tablets and Their Role in the Administrative Process</w:t>
-      </w:r>
-      <w:r>
-        <w:rPr>
-          <w:rFonts w:ascii="Noto Serif" w:hAnsi="Noto Serif" w:cs="Noto Serif"/>
-        </w:rPr>
-        <w:t>, Salamanca: Ediciones Universidad de Salamanca.</w:t>
-      </w:r>
-    </w:p>
-    <w:p>
-      <w:pPr>
-        <w:pStyle w:val="BodyText"/>
-        <w:jc w:val="both"/>
-        <w:rPr>
-          <w:rFonts w:ascii="Noto Serif" w:hAnsi="Noto Serif" w:cs="Noto Serif"/>
-        </w:rPr>
-      </w:pPr>
-      <w:r>
-        <w:rPr>
-          <w:rFonts w:ascii="Noto Serif" w:hAnsi="Noto Serif" w:cs="Noto Serif"/>
-        </w:rPr>
-        <w:t xml:space="preserve">Steele, P. M. &amp; </w:t>
-      </w:r>
-      <w:proofErr w:type="spellStart"/>
-      <w:r>
-        <w:rPr>
-          <w:rFonts w:ascii="Noto Serif" w:hAnsi="Noto Serif" w:cs="Noto Serif"/>
-        </w:rPr>
-        <w:t>Meißner</w:t>
-      </w:r>
-      <w:proofErr w:type="spellEnd"/>
-      <w:r>
-        <w:rPr>
-          <w:rFonts w:ascii="Noto Serif" w:hAnsi="Noto Serif" w:cs="Noto Serif"/>
-        </w:rPr>
-        <w:t xml:space="preserve">, T. (2017), “From Linear B to Linear A: The Problem of the Backward Projection of Sound Values”, in P. M. Steele (ed.), </w:t>
-      </w:r>
-      <w:r>
-        <w:rPr>
-          <w:rFonts w:ascii="Noto Serif" w:hAnsi="Noto Serif" w:cs="Noto Serif"/>
-          <w:i/>
-          <w:iCs/>
-        </w:rPr>
-        <w:t>Understanding Relations Between Scripts: The Aegean Writing Systems</w:t>
-      </w:r>
-      <w:r>
-        <w:rPr>
-          <w:rFonts w:ascii="Noto Serif" w:hAnsi="Noto Serif" w:cs="Noto Serif"/>
-        </w:rPr>
-        <w:t>, Oxford: Oxbow, 93–110.</w:t>
-      </w:r>
-    </w:p>
-    <w:p>
-      <w:pPr>
-        <w:pStyle w:val="BodyText"/>
-        <w:jc w:val="both"/>
-        <w:rPr>
-          <w:rFonts w:ascii="Noto Serif" w:hAnsi="Noto Serif" w:cs="Noto Serif"/>
-        </w:rPr>
-      </w:pPr>
-      <w:r>
-        <w:rPr>
-          <w:rFonts w:ascii="Noto Serif" w:hAnsi="Noto Serif" w:cs="Noto Serif"/>
-        </w:rPr>
-        <w:t xml:space="preserve">van </w:t>
-      </w:r>
-      <w:proofErr w:type="spellStart"/>
-      <w:r>
-        <w:rPr>
-          <w:rFonts w:ascii="Noto Serif" w:hAnsi="Noto Serif" w:cs="Noto Serif"/>
-        </w:rPr>
-        <w:t>Soesbergen</w:t>
-      </w:r>
-      <w:proofErr w:type="spellEnd"/>
-      <w:r>
-        <w:rPr>
-          <w:rFonts w:ascii="Noto Serif" w:hAnsi="Noto Serif" w:cs="Noto Serif"/>
-        </w:rPr>
-        <w:t xml:space="preserve">, P. G. (2022), </w:t>
+        <w:t xml:space="preserve">van Soesbergen, P. G. (2022), </w:t>
       </w:r>
       <w:r>
         <w:rPr>
@@ -24975,16 +23742,8 @@
               <w:rPr>
                 <w:rFonts w:ascii="Noto Serif" w:hAnsi="Noto Serif" w:cs="Noto Serif"/>
               </w:rPr>
-              <w:t xml:space="preserve">permutation validation, </w:t>
-            </w:r>
-            <w:proofErr w:type="spellStart"/>
-            <w:r>
-              <w:rPr>
-                <w:rFonts w:ascii="Noto Serif" w:hAnsi="Noto Serif" w:cs="Noto Serif"/>
-              </w:rPr>
-              <w:t>SigLA</w:t>
-            </w:r>
-            <w:proofErr w:type="spellEnd"/>
+              <w:t>permutation validation, SigLA</w:t>
+            </w:r>
           </w:p>
         </w:tc>
       </w:tr>
@@ -25202,17 +23961,8 @@
           <w:rStyle w:val="VerbatimChar"/>
           <w:rFonts w:ascii="Noto Serif" w:hAnsi="Noto Serif" w:cs="Noto Serif"/>
         </w:rPr>
-        <w:t>data/</w:t>
-      </w:r>
-      <w:proofErr w:type="spellStart"/>
-      <w:r>
-        <w:rPr>
-          <w:rStyle w:val="VerbatimChar"/>
-          <w:rFonts w:ascii="Noto Serif" w:hAnsi="Noto Serif" w:cs="Noto Serif"/>
-        </w:rPr>
-        <w:t>power_analysis.json</w:t>
-      </w:r>
-      <w:proofErr w:type="spellEnd"/>
+        <w:t>data/power_analysis.json</w:t>
+      </w:r>
       <w:r>
         <w:rPr>
           <w:rFonts w:ascii="Noto Serif" w:hAnsi="Noto Serif" w:cs="Noto Serif"/>
@@ -25311,7 +24061,6 @@
           <w:rFonts w:ascii="Noto Serif" w:hAnsi="Noto Serif" w:cs="Noto Serif"/>
         </w:rPr>
       </w:pPr>
-      <w:proofErr w:type="spellStart"/>
       <w:r>
         <w:rPr>
           <w:rStyle w:val="VerbatimChar"/>
@@ -25319,7 +24068,6 @@
         </w:rPr>
         <w:t>divergences.json</w:t>
       </w:r>
-      <w:proofErr w:type="spellEnd"/>
       <w:r>
         <w:rPr>
           <w:rFonts w:ascii="Noto Serif" w:hAnsi="Noto Serif" w:cs="Noto Serif"/>
@@ -25465,25 +24213,7 @@
           <w:szCs w:val="30"/>
         </w:rPr>
         <w:lastRenderedPageBreak/>
-        <w:t xml:space="preserve">Appendix D: Decoding the </w:t>
-      </w:r>
-      <w:proofErr w:type="spellStart"/>
-      <w:r>
-        <w:rPr>
-          <w:rFonts w:ascii="Noto Serif" w:hAnsi="Noto Serif" w:cs="Noto Serif"/>
-          <w:sz w:val="30"/>
-          <w:szCs w:val="30"/>
-        </w:rPr>
-        <w:t>SigLA</w:t>
-      </w:r>
-      <w:proofErr w:type="spellEnd"/>
-      <w:r>
-        <w:rPr>
-          <w:rFonts w:ascii="Noto Serif" w:hAnsi="Noto Serif" w:cs="Noto Serif"/>
-          <w:sz w:val="30"/>
-          <w:szCs w:val="30"/>
-        </w:rPr>
-        <w:t xml:space="preserve"> database</w:t>
+        <w:t>Appendix D: Decoding the SigLA database</w:t>
       </w:r>
       <w:bookmarkEnd w:id="92"/>
     </w:p>
@@ -25512,21 +24242,7 @@
         <w:rPr>
           <w:rFonts w:ascii="Noto Serif" w:hAnsi="Noto Serif" w:cs="Noto Serif"/>
         </w:rPr>
-        <w:t xml:space="preserve"> in the repository has no dependency on the rest of the pipeline and can decode any </w:t>
-      </w:r>
-      <w:proofErr w:type="spellStart"/>
-      <w:r>
-        <w:rPr>
-          <w:rFonts w:ascii="Noto Serif" w:hAnsi="Noto Serif" w:cs="Noto Serif"/>
-        </w:rPr>
-        <w:t>OCaml</w:t>
-      </w:r>
-      <w:proofErr w:type="spellEnd"/>
-      <w:r>
-        <w:rPr>
-          <w:rFonts w:ascii="Noto Serif" w:hAnsi="Noto Serif" w:cs="Noto Serif"/>
-        </w:rPr>
-        <w:t xml:space="preserve"> </w:t>
+        <w:t xml:space="preserve"> in the repository has no dependency on the rest of the pipeline and can decode any OCaml </w:t>
       </w:r>
       <w:r>
         <w:rPr>
@@ -25578,19 +24294,11 @@
           <w:rFonts w:ascii="Noto Serif" w:hAnsi="Noto Serif" w:cs="Noto Serif"/>
         </w:rPr>
       </w:pPr>
-      <w:proofErr w:type="spellStart"/>
-      <w:r>
-        <w:rPr>
-          <w:rFonts w:ascii="Noto Serif" w:hAnsi="Noto Serif" w:cs="Noto Serif"/>
-        </w:rPr>
-        <w:t>SigLA’s</w:t>
-      </w:r>
-      <w:proofErr w:type="spellEnd"/>
-      <w:r>
-        <w:rPr>
-          <w:rFonts w:ascii="Noto Serif" w:hAnsi="Noto Serif" w:cs="Noto Serif"/>
-        </w:rPr>
-        <w:t xml:space="preserve"> corpus is served as a publicly accessible JavaScript file, </w:t>
+      <w:r>
+        <w:rPr>
+          <w:rFonts w:ascii="Noto Serif" w:hAnsi="Noto Serif" w:cs="Noto Serif"/>
+        </w:rPr>
+        <w:t xml:space="preserve">SigLA’s corpus is served as a publicly accessible JavaScript file, </w:t>
       </w:r>
       <w:r>
         <w:rPr>
@@ -25616,21 +24324,7 @@
         <w:rPr>
           <w:rFonts w:ascii="Noto Serif" w:hAnsi="Noto Serif" w:cs="Noto Serif"/>
         </w:rPr>
-        <w:t xml:space="preserve">. The decoder released with this paper downloads that file and parses its </w:t>
-      </w:r>
-      <w:proofErr w:type="spellStart"/>
-      <w:r>
-        <w:rPr>
-          <w:rFonts w:ascii="Noto Serif" w:hAnsi="Noto Serif" w:cs="Noto Serif"/>
-        </w:rPr>
-        <w:t>OCaml</w:t>
-      </w:r>
-      <w:proofErr w:type="spellEnd"/>
-      <w:r>
-        <w:rPr>
-          <w:rFonts w:ascii="Noto Serif" w:hAnsi="Noto Serif" w:cs="Noto Serif"/>
-        </w:rPr>
-        <w:t xml:space="preserve"> </w:t>
+        <w:t xml:space="preserve">. The decoder released with this paper downloads that file and parses its OCaml </w:t>
       </w:r>
       <w:r>
         <w:rPr>
@@ -25687,21 +24381,7 @@
         <w:rPr>
           <w:rFonts w:ascii="Noto Serif" w:hAnsi="Noto Serif" w:cs="Noto Serif"/>
         </w:rPr>
-        <w:t xml:space="preserve">Correspondence with the </w:t>
-      </w:r>
-      <w:proofErr w:type="spellStart"/>
-      <w:r>
-        <w:rPr>
-          <w:rFonts w:ascii="Noto Serif" w:hAnsi="Noto Serif" w:cs="Noto Serif"/>
-        </w:rPr>
-        <w:t>SigLA</w:t>
-      </w:r>
-      <w:proofErr w:type="spellEnd"/>
-      <w:r>
-        <w:rPr>
-          <w:rFonts w:ascii="Noto Serif" w:hAnsi="Noto Serif" w:cs="Noto Serif"/>
-        </w:rPr>
-        <w:t xml:space="preserve"> authors is outstanding as a courtesy, and to establish a documented route for others and for formal attribution. It is not a precondition of the use made: the legal basis is the public file’s explicit license terms.</w:t>
+        <w:t>Correspondence with the SigLA authors is outstanding as a courtesy, and to establish a documented route for others and for formal attribution. It is not a precondition of the use made: the legal basis is the public file’s explicit license terms.</w:t>
       </w:r>
     </w:p>
     <w:p>
@@ -25716,35 +24396,7 @@
         <w:rPr>
           <w:rFonts w:ascii="Noto Serif" w:hAnsi="Noto Serif" w:cs="Noto Serif"/>
         </w:rPr>
-        <w:t xml:space="preserve">Two things follow for reproducibility. The repository does not redistribute </w:t>
-      </w:r>
-      <w:proofErr w:type="spellStart"/>
-      <w:r>
-        <w:rPr>
-          <w:rFonts w:ascii="Noto Serif" w:hAnsi="Noto Serif" w:cs="Noto Serif"/>
-        </w:rPr>
-        <w:t>SigLA</w:t>
-      </w:r>
-      <w:proofErr w:type="spellEnd"/>
-      <w:r>
-        <w:rPr>
-          <w:rFonts w:ascii="Noto Serif" w:hAnsi="Noto Serif" w:cs="Noto Serif"/>
-        </w:rPr>
-        <w:t xml:space="preserve"> data, so a reader wishing to check the </w:t>
-      </w:r>
-      <w:proofErr w:type="spellStart"/>
-      <w:r>
-        <w:rPr>
-          <w:rFonts w:ascii="Noto Serif" w:hAnsi="Noto Serif" w:cs="Noto Serif"/>
-        </w:rPr>
-        <w:t>SigLA</w:t>
-      </w:r>
-      <w:proofErr w:type="spellEnd"/>
-      <w:r>
-        <w:rPr>
-          <w:rFonts w:ascii="Noto Serif" w:hAnsi="Noto Serif" w:cs="Noto Serif"/>
-        </w:rPr>
-        <w:t xml:space="preserve">-dependent results retrieves it from the original source, at its current version, under the license — which is a better arrangement than working from a redistributed snapshot. And the decoder is released because the format documentation has independent value: </w:t>
+        <w:t xml:space="preserve">Two things follow for reproducibility. The repository does not redistribute SigLA data, so a reader wishing to check the SigLA-dependent results retrieves it from the original source, at its current version, under the license — which is a better arrangement than working from a redistributed snapshot. And the decoder is released because the format documentation has independent value: </w:t>
       </w:r>
       <w:r>
         <w:rPr>
@@ -25757,21 +24409,7 @@
         <w:rPr>
           <w:rFonts w:ascii="Noto Serif" w:hAnsi="Noto Serif" w:cs="Noto Serif"/>
         </w:rPr>
-        <w:t xml:space="preserve"> is </w:t>
-      </w:r>
-      <w:proofErr w:type="spellStart"/>
-      <w:r>
-        <w:rPr>
-          <w:rFonts w:ascii="Noto Serif" w:hAnsi="Noto Serif" w:cs="Noto Serif"/>
-        </w:rPr>
-        <w:t>OCaml’s</w:t>
-      </w:r>
-      <w:proofErr w:type="spellEnd"/>
-      <w:r>
-        <w:rPr>
-          <w:rFonts w:ascii="Noto Serif" w:hAnsi="Noto Serif" w:cs="Noto Serif"/>
-        </w:rPr>
-        <w:t xml:space="preserve"> standard serialization and the implementation is general.</w:t>
+        <w:t xml:space="preserve"> is OCaml’s standard serialization and the implementation is general.</w:t>
       </w:r>
     </w:p>
     <w:p>
@@ -25812,33 +24450,11 @@
           <w:rFonts w:ascii="Noto Serif" w:hAnsi="Noto Serif" w:cs="Noto Serif"/>
         </w:rPr>
       </w:pPr>
-      <w:proofErr w:type="spellStart"/>
-      <w:r>
-        <w:rPr>
-          <w:rFonts w:ascii="Noto Serif" w:hAnsi="Noto Serif" w:cs="Noto Serif"/>
-        </w:rPr>
-        <w:t>SigLA</w:t>
-      </w:r>
-      <w:proofErr w:type="spellEnd"/>
-      <w:r>
-        <w:rPr>
-          <w:rFonts w:ascii="Noto Serif" w:hAnsi="Noto Serif" w:cs="Noto Serif"/>
-        </w:rPr>
-        <w:t xml:space="preserve"> is written in </w:t>
-      </w:r>
-      <w:proofErr w:type="spellStart"/>
-      <w:r>
-        <w:rPr>
-          <w:rFonts w:ascii="Noto Serif" w:hAnsi="Noto Serif" w:cs="Noto Serif"/>
-        </w:rPr>
-        <w:t>OCaml</w:t>
-      </w:r>
-      <w:proofErr w:type="spellEnd"/>
-      <w:r>
-        <w:rPr>
-          <w:rFonts w:ascii="Noto Serif" w:hAnsi="Noto Serif" w:cs="Noto Serif"/>
-        </w:rPr>
-        <w:t xml:space="preserve"> and compiled to JavaScript. Its corpus ships in </w:t>
+      <w:r>
+        <w:rPr>
+          <w:rFonts w:ascii="Noto Serif" w:hAnsi="Noto Serif" w:cs="Noto Serif"/>
+        </w:rPr>
+        <w:t xml:space="preserve">SigLA is written in OCaml and compiled to JavaScript. Its corpus ships in </w:t>
       </w:r>
       <w:r>
         <w:rPr>
@@ -25851,21 +24467,7 @@
         <w:rPr>
           <w:rFonts w:ascii="Noto Serif" w:hAnsi="Noto Serif" w:cs="Noto Serif"/>
         </w:rPr>
-        <w:t xml:space="preserve"> as two </w:t>
-      </w:r>
-      <w:proofErr w:type="spellStart"/>
-      <w:r>
-        <w:rPr>
-          <w:rFonts w:ascii="Noto Serif" w:hAnsi="Noto Serif" w:cs="Noto Serif"/>
-        </w:rPr>
-        <w:t>OCaml</w:t>
-      </w:r>
-      <w:proofErr w:type="spellEnd"/>
-      <w:r>
-        <w:rPr>
-          <w:rFonts w:ascii="Noto Serif" w:hAnsi="Noto Serif" w:cs="Noto Serif"/>
-        </w:rPr>
-        <w:t xml:space="preserve"> </w:t>
+        <w:t xml:space="preserve"> as two OCaml </w:t>
       </w:r>
       <w:r>
         <w:rPr>
@@ -26003,21 +24605,7 @@
         <w:rPr>
           <w:rFonts w:ascii="Noto Serif" w:hAnsi="Noto Serif" w:cs="Noto Serif"/>
         </w:rPr>
-        <w:t xml:space="preserve"> is </w:t>
-      </w:r>
-      <w:proofErr w:type="spellStart"/>
-      <w:r>
-        <w:rPr>
-          <w:rFonts w:ascii="Noto Serif" w:hAnsi="Noto Serif" w:cs="Noto Serif"/>
-        </w:rPr>
-        <w:t>OCaml’s</w:t>
-      </w:r>
-      <w:proofErr w:type="spellEnd"/>
-      <w:r>
-        <w:rPr>
-          <w:rFonts w:ascii="Noto Serif" w:hAnsi="Noto Serif" w:cs="Noto Serif"/>
-        </w:rPr>
-        <w:t xml:space="preserve"> standard serialization for same-program round-tripping, where the type is known at both ends. It is simply not designed to be read by anything else.</w:t>
+        <w:t xml:space="preserve"> is OCaml’s standard serialization for same-program round-tripping, where the type is known at both ends. It is simply not designed to be read by anything else.</w:t>
       </w:r>
     </w:p>
     <w:p>
@@ -26062,23 +24650,8 @@
         <w:rPr>
           <w:rFonts w:ascii="Noto Serif" w:hAnsi="Noto Serif" w:cs="Noto Serif"/>
         </w:rPr>
-        <w:t xml:space="preserve">The format is documented in the </w:t>
-      </w:r>
-      <w:proofErr w:type="spellStart"/>
-      <w:r>
-        <w:rPr>
-          <w:rFonts w:ascii="Noto Serif" w:hAnsi="Noto Serif" w:cs="Noto Serif"/>
-        </w:rPr>
-        <w:t>OCaml</w:t>
-      </w:r>
-      <w:proofErr w:type="spellEnd"/>
-      <w:r>
-        <w:rPr>
-          <w:rFonts w:ascii="Noto Serif" w:hAnsi="Noto Serif" w:cs="Noto Serif"/>
-        </w:rPr>
-        <w:t xml:space="preserve"> runtime sources (</w:t>
-      </w:r>
-      <w:proofErr w:type="spellStart"/>
+        <w:t>The format is documented in the OCaml runtime sources (</w:t>
+      </w:r>
       <w:r>
         <w:rPr>
           <w:rStyle w:val="VerbatimChar"/>
@@ -26086,14 +24659,12 @@
         </w:rPr>
         <w:t>intext.h</w:t>
       </w:r>
-      <w:proofErr w:type="spellEnd"/>
       <w:r>
         <w:rPr>
           <w:rFonts w:ascii="Noto Serif" w:hAnsi="Noto Serif" w:cs="Noto Serif"/>
         </w:rPr>
         <w:t xml:space="preserve">, </w:t>
       </w:r>
-      <w:proofErr w:type="spellStart"/>
       <w:r>
         <w:rPr>
           <w:rStyle w:val="VerbatimChar"/>
@@ -26101,7 +24672,6 @@
         </w:rPr>
         <w:t>extern.c</w:t>
       </w:r>
-      <w:proofErr w:type="spellEnd"/>
       <w:r>
         <w:rPr>
           <w:rFonts w:ascii="Noto Serif" w:hAnsi="Noto Serif" w:cs="Noto Serif"/>
@@ -26257,21 +24827,7 @@
         <w:rPr>
           <w:rFonts w:ascii="Noto Serif" w:hAnsi="Noto Serif" w:cs="Noto Serif"/>
         </w:rPr>
-        <w:t xml:space="preserve">, doubles in both </w:t>
-      </w:r>
-      <w:proofErr w:type="spellStart"/>
-      <w:r>
-        <w:rPr>
-          <w:rFonts w:ascii="Noto Serif" w:hAnsi="Noto Serif" w:cs="Noto Serif"/>
-        </w:rPr>
-        <w:t>endiannesses</w:t>
-      </w:r>
-      <w:proofErr w:type="spellEnd"/>
-      <w:r>
-        <w:rPr>
-          <w:rFonts w:ascii="Noto Serif" w:hAnsi="Noto Serif" w:cs="Noto Serif"/>
-        </w:rPr>
-        <w:t>, double arrays, and custom blocks;</w:t>
+        <w:t>, doubles in both endiannesses, double arrays, and custom blocks;</w:t>
       </w:r>
     </w:p>
     <w:p>
@@ -26555,21 +25111,7 @@
         <w:rPr>
           <w:rFonts w:ascii="Noto Serif" w:hAnsi="Noto Serif" w:cs="Noto Serif"/>
         </w:rPr>
-        <w:t xml:space="preserve"> </w:t>
-      </w:r>
-      <w:proofErr w:type="spellStart"/>
-      <w:r>
-        <w:rPr>
-          <w:rFonts w:ascii="Noto Serif" w:hAnsi="Noto Serif" w:cs="Noto Serif"/>
-        </w:rPr>
-        <w:t>SigLA’s</w:t>
-      </w:r>
-      <w:proofErr w:type="spellEnd"/>
-      <w:r>
-        <w:rPr>
-          <w:rFonts w:ascii="Noto Serif" w:hAnsi="Noto Serif" w:cs="Noto Serif"/>
-        </w:rPr>
-        <w:t xml:space="preserve"> import pipeline is publicly available and declares the types. The label type carries a boolean </w:t>
+        <w:t xml:space="preserve"> SigLA’s import pipeline is publicly available and declares the types. The label type carries a boolean </w:t>
       </w:r>
       <w:r>
         <w:rPr>
@@ -26617,7 +25159,6 @@
         </w:rPr>
         <w:t xml:space="preserve">, </w:t>
       </w:r>
-      <w:proofErr w:type="spellStart"/>
       <w:r>
         <w:rPr>
           <w:rStyle w:val="VerbatimChar"/>
@@ -26625,7 +25166,6 @@
         </w:rPr>
         <w:t>Not_here</w:t>
       </w:r>
-      <w:proofErr w:type="spellEnd"/>
       <w:r>
         <w:rPr>
           <w:rFonts w:ascii="Noto Serif" w:hAnsi="Noto Serif" w:cs="Noto Serif"/>
@@ -26668,146 +25208,80 @@
         <w:rPr>
           <w:rFonts w:ascii="Noto Serif" w:hAnsi="Noto Serif" w:cs="Noto Serif"/>
         </w:rPr>
-        <w:t xml:space="preserve">A fourth, independent check became available after the decoder was built. </w:t>
-      </w:r>
-      <w:proofErr w:type="spellStart"/>
-      <w:r>
-        <w:rPr>
-          <w:rFonts w:ascii="Noto Serif" w:hAnsi="Noto Serif" w:cs="Noto Serif"/>
-        </w:rPr>
-        <w:t>Salgarella</w:t>
-      </w:r>
-      <w:proofErr w:type="spellEnd"/>
-      <w:r>
-        <w:rPr>
-          <w:rFonts w:ascii="Noto Serif" w:hAnsi="Noto Serif" w:cs="Noto Serif"/>
-        </w:rPr>
-        <w:t xml:space="preserve"> and Castellan’s 2021 paper describes </w:t>
-      </w:r>
-      <w:proofErr w:type="spellStart"/>
-      <w:r>
-        <w:rPr>
-          <w:rFonts w:ascii="Noto Serif" w:hAnsi="Noto Serif" w:cs="Noto Serif"/>
-        </w:rPr>
-        <w:t>SigLA’s</w:t>
-      </w:r>
-      <w:proofErr w:type="spellEnd"/>
-      <w:r>
-        <w:rPr>
-          <w:rFonts w:ascii="Noto Serif" w:hAnsi="Noto Serif" w:cs="Noto Serif"/>
-        </w:rPr>
-        <w:t xml:space="preserve"> scope as administrative documents only, while this </w:t>
-      </w:r>
-      <w:proofErr w:type="spellStart"/>
-      <w:r>
-        <w:rPr>
-          <w:rFonts w:ascii="Noto Serif" w:hAnsi="Noto Serif" w:cs="Noto Serif"/>
-        </w:rPr>
-        <w:t>decode’s</w:t>
-      </w:r>
-      <w:proofErr w:type="spellEnd"/>
-      <w:r>
-        <w:rPr>
-          <w:rFonts w:ascii="Noto Serif" w:hAnsi="Noto Serif" w:cs="Noto Serif"/>
-        </w:rPr>
-        <w:t xml:space="preserve"> 802 records include 29–30 documents of Z-series designation (libation tables, votive vessels, and similar religious material). Partitioning the 802 records either by physical support (Tablet, Nodule, Roundel, Sealing = 771) or by GORILA Z-designation (772 non-Z-type) lands within a document or two of a figure never consulted while building the decoder: Lamonica’s chapter in the 2026 </w:t>
-      </w:r>
-      <w:proofErr w:type="spellStart"/>
+        <w:t xml:space="preserve">A fourth, independent check became available after the decoder was built. Salgarella and Castellan’s 2021 paper describes SigLA’s scope as administrative documents only, while this decode’s 802 records include 29–30 documents of Z-series designation (libation tables, votive vessels, and similar religious material). Partitioning the 802 records either by physical support (Tablet, Nodule, Roundel, Sealing = 771) or by GORILA Z-designation (772 non-Z-type) lands within a document or two of a figure never consulted while building the decoder: Lamonica’s chapter in the 2026 </w:t>
+      </w:r>
       <w:r>
         <w:rPr>
           <w:rFonts w:ascii="Noto Serif" w:hAnsi="Noto Serif" w:cs="Noto Serif"/>
           <w:i/>
           <w:iCs/>
         </w:rPr>
-        <w:t>Wor</w:t>
-      </w:r>
-      <w:proofErr w:type="spellEnd"/>
+        <w:t>Wor(l)ds of Linear A</w:t>
+      </w:r>
+      <w:r>
+        <w:rPr>
+          <w:rFonts w:ascii="Noto Serif" w:hAnsi="Noto Serif" w:cs="Noto Serif"/>
+        </w:rPr>
+        <w:t xml:space="preserve"> volume states SigLA holds “over 770 documents.” Coverage grew, by almost exactly the religious-document set this decoder recovers, sometime between 2021 and that citation — a coincidence a parsing error would not produce.</w:t>
+      </w:r>
+    </w:p>
+    <w:p>
+      <w:pPr>
+        <w:pStyle w:val="BodyText"/>
+        <w:jc w:val="both"/>
+        <w:rPr>
+          <w:rFonts w:ascii="Noto Serif" w:hAnsi="Noto Serif" w:cs="Noto Serif"/>
+        </w:rPr>
+      </w:pPr>
+    </w:p>
+    <w:p>
+      <w:pPr>
+        <w:pStyle w:val="Heading3"/>
+        <w:jc w:val="both"/>
+        <w:rPr>
+          <w:rFonts w:ascii="Noto Serif" w:hAnsi="Noto Serif" w:cs="Noto Serif"/>
+          <w:sz w:val="26"/>
+          <w:szCs w:val="26"/>
+        </w:rPr>
+      </w:pPr>
+      <w:bookmarkStart w:id="97" w:name="a-finding-from-the-format-itself"/>
+      <w:bookmarkEnd w:id="96"/>
+      <w:r>
+        <w:rPr>
+          <w:rFonts w:ascii="Noto Serif" w:hAnsi="Noto Serif" w:cs="Noto Serif"/>
+          <w:sz w:val="26"/>
+          <w:szCs w:val="26"/>
+        </w:rPr>
+        <w:t>A finding from the format itself</w:t>
+      </w:r>
+    </w:p>
+    <w:p>
+      <w:pPr>
+        <w:pStyle w:val="FirstParagraph"/>
+        <w:jc w:val="both"/>
+        <w:rPr>
+          <w:rFonts w:ascii="Noto Serif" w:hAnsi="Noto Serif" w:cs="Noto Serif"/>
+        </w:rPr>
+      </w:pPr>
+      <w:r>
+        <w:rPr>
+          <w:rFonts w:ascii="Noto Serif" w:hAnsi="Noto Serif" w:cs="Noto Serif"/>
+        </w:rPr>
+        <w:t xml:space="preserve">The three-valued boundary encoding is not a detail. Our working corpus records word division as a binary — a divider is present or absent — inherited from a source that had no way to express uncertainty. SigLA distinguishes </w:t>
+      </w:r>
       <w:r>
         <w:rPr>
           <w:rFonts w:ascii="Noto Serif" w:hAnsi="Noto Serif" w:cs="Noto Serif"/>
           <w:i/>
           <w:iCs/>
         </w:rPr>
-        <w:t>(l)ds of Linear A</w:t>
-      </w:r>
-      <w:r>
-        <w:rPr>
-          <w:rFonts w:ascii="Noto Serif" w:hAnsi="Noto Serif" w:cs="Noto Serif"/>
-        </w:rPr>
-        <w:t xml:space="preserve"> volume states </w:t>
-      </w:r>
-      <w:proofErr w:type="spellStart"/>
-      <w:r>
-        <w:rPr>
-          <w:rFonts w:ascii="Noto Serif" w:hAnsi="Noto Serif" w:cs="Noto Serif"/>
-        </w:rPr>
-        <w:t>SigLA</w:t>
-      </w:r>
-      <w:proofErr w:type="spellEnd"/>
-      <w:r>
-        <w:rPr>
-          <w:rFonts w:ascii="Noto Serif" w:hAnsi="Noto Serif" w:cs="Noto Serif"/>
-        </w:rPr>
-        <w:t xml:space="preserve"> holds “over 770 documents.” Coverage grew, by almost exactly the religious-document set this decoder recovers, sometime between 2021 and that citation — a coincidence a parsing error would not produce.</w:t>
-      </w:r>
-    </w:p>
-    <w:p>
-      <w:pPr>
-        <w:pStyle w:val="BodyText"/>
-        <w:jc w:val="both"/>
-        <w:rPr>
-          <w:rFonts w:ascii="Noto Serif" w:hAnsi="Noto Serif" w:cs="Noto Serif"/>
-        </w:rPr>
-      </w:pPr>
-    </w:p>
-    <w:p>
-      <w:pPr>
-        <w:pStyle w:val="Heading3"/>
-        <w:jc w:val="both"/>
-        <w:rPr>
-          <w:rFonts w:ascii="Noto Serif" w:hAnsi="Noto Serif" w:cs="Noto Serif"/>
-          <w:sz w:val="26"/>
-          <w:szCs w:val="26"/>
-        </w:rPr>
-      </w:pPr>
-      <w:bookmarkStart w:id="97" w:name="a-finding-from-the-format-itself"/>
-      <w:bookmarkEnd w:id="96"/>
-      <w:r>
-        <w:rPr>
-          <w:rFonts w:ascii="Noto Serif" w:hAnsi="Noto Serif" w:cs="Noto Serif"/>
-          <w:sz w:val="26"/>
-          <w:szCs w:val="26"/>
-        </w:rPr>
-        <w:t>A finding from the format itself</w:t>
-      </w:r>
-    </w:p>
-    <w:p>
-      <w:pPr>
-        <w:pStyle w:val="FirstParagraph"/>
-        <w:jc w:val="both"/>
-        <w:rPr>
-          <w:rFonts w:ascii="Noto Serif" w:hAnsi="Noto Serif" w:cs="Noto Serif"/>
-        </w:rPr>
-      </w:pPr>
-      <w:r>
-        <w:rPr>
-          <w:rFonts w:ascii="Noto Serif" w:hAnsi="Noto Serif" w:cs="Noto Serif"/>
-        </w:rPr>
-        <w:t xml:space="preserve">The three-valued boundary encoding is not a detail. Our working corpus records word division as a binary — a divider is present or absent — inherited from a source that had no way to express uncertainty. </w:t>
-      </w:r>
-      <w:proofErr w:type="spellStart"/>
-      <w:r>
-        <w:rPr>
-          <w:rFonts w:ascii="Noto Serif" w:hAnsi="Noto Serif" w:cs="Noto Serif"/>
-        </w:rPr>
-        <w:t>SigLA</w:t>
-      </w:r>
-      <w:proofErr w:type="spellEnd"/>
-      <w:r>
-        <w:rPr>
-          <w:rFonts w:ascii="Noto Serif" w:hAnsi="Noto Serif" w:cs="Noto Serif"/>
-        </w:rPr>
-        <w:t xml:space="preserve"> distinguishes </w:t>
+        <w:t>definitely here</w:t>
+      </w:r>
+      <w:r>
+        <w:rPr>
+          <w:rFonts w:ascii="Noto Serif" w:hAnsi="Noto Serif" w:cs="Noto Serif"/>
+        </w:rPr>
+        <w:t xml:space="preserve">, </w:t>
       </w:r>
       <w:r>
         <w:rPr>
@@ -26815,13 +25289,13 @@
           <w:i/>
           <w:iCs/>
         </w:rPr>
-        <w:t>definitely here</w:t>
-      </w:r>
-      <w:r>
-        <w:rPr>
-          <w:rFonts w:ascii="Noto Serif" w:hAnsi="Noto Serif" w:cs="Noto Serif"/>
-        </w:rPr>
-        <w:t xml:space="preserve">, </w:t>
+        <w:t>uncertain</w:t>
+      </w:r>
+      <w:r>
+        <w:rPr>
+          <w:rFonts w:ascii="Noto Serif" w:hAnsi="Noto Serif" w:cs="Noto Serif"/>
+        </w:rPr>
+        <w:t xml:space="preserve">, and </w:t>
       </w:r>
       <w:r>
         <w:rPr>
@@ -26829,20 +25303,6 @@
           <w:i/>
           <w:iCs/>
         </w:rPr>
-        <w:t>uncertain</w:t>
-      </w:r>
-      <w:r>
-        <w:rPr>
-          <w:rFonts w:ascii="Noto Serif" w:hAnsi="Noto Serif" w:cs="Noto Serif"/>
-        </w:rPr>
-        <w:t xml:space="preserve">, and </w:t>
-      </w:r>
-      <w:r>
-        <w:rPr>
-          <w:rFonts w:ascii="Noto Serif" w:hAnsi="Noto Serif" w:cs="Noto Serif"/>
-          <w:i/>
-          <w:iCs/>
-        </w:rPr>
         <w:t>definitely not here</w:t>
       </w:r>
       <w:r>
@@ -26864,21 +25324,7 @@
         <w:rPr>
           <w:rFonts w:ascii="Noto Serif" w:hAnsi="Noto Serif" w:cs="Noto Serif"/>
         </w:rPr>
-        <w:t xml:space="preserve">Section 4.6 reports the consequence at KN </w:t>
-      </w:r>
-      <w:proofErr w:type="spellStart"/>
-      <w:r>
-        <w:rPr>
-          <w:rFonts w:ascii="Noto Serif" w:hAnsi="Noto Serif" w:cs="Noto Serif"/>
-        </w:rPr>
-        <w:t>Zc</w:t>
-      </w:r>
-      <w:proofErr w:type="spellEnd"/>
-      <w:r>
-        <w:rPr>
-          <w:rFonts w:ascii="Noto Serif" w:hAnsi="Noto Serif" w:cs="Noto Serif"/>
-        </w:rPr>
-        <w:t xml:space="preserve"> 6, where an unreadable sign sits exactly at a contested word boundary that two editors resolved in opposite directions with equal confidence. The uncertainty was in the source and was flattened by both.</w:t>
+        <w:t>Section 4.6 reports the consequence at KN Zc 6, where an unreadable sign sits exactly at a contested word boundary that two editors resolved in opposite directions with equal confidence. The uncertainty was in the source and was flattened by both.</w:t>
       </w:r>
     </w:p>
     <w:p>
@@ -26937,17 +25383,8 @@
           <w:rStyle w:val="VerbatimChar"/>
           <w:rFonts w:ascii="Noto Serif" w:hAnsi="Noto Serif" w:cs="Noto Serif"/>
         </w:rPr>
-        <w:t>data/</w:t>
-      </w:r>
-      <w:proofErr w:type="spellStart"/>
-      <w:r>
-        <w:rPr>
-          <w:rStyle w:val="VerbatimChar"/>
-          <w:rFonts w:ascii="Noto Serif" w:hAnsi="Noto Serif" w:cs="Noto Serif"/>
-        </w:rPr>
-        <w:t>divergences.json</w:t>
-      </w:r>
-      <w:proofErr w:type="spellEnd"/>
+        <w:t>data/divergences.json</w:t>
+      </w:r>
       <w:r>
         <w:rPr>
           <w:rFonts w:ascii="Noto Serif" w:hAnsi="Noto Serif" w:cs="Noto Serif"/>
@@ -27952,21 +26389,7 @@
               <w:rPr>
                 <w:rFonts w:ascii="Noto Serif" w:hAnsi="Noto Serif" w:cs="Noto Serif"/>
               </w:rPr>
-              <w:t xml:space="preserve">; </w:t>
-            </w:r>
-            <w:proofErr w:type="spellStart"/>
-            <w:r>
-              <w:rPr>
-                <w:rFonts w:ascii="Noto Serif" w:hAnsi="Noto Serif" w:cs="Noto Serif"/>
-              </w:rPr>
-              <w:t>SigLA</w:t>
-            </w:r>
-            <w:proofErr w:type="spellEnd"/>
-            <w:r>
-              <w:rPr>
-                <w:rFonts w:ascii="Noto Serif" w:hAnsi="Noto Serif" w:cs="Noto Serif"/>
-              </w:rPr>
-              <w:t xml:space="preserve"> imported</w:t>
+              <w:t>; SigLA imported</w:t>
             </w:r>
           </w:p>
         </w:tc>
@@ -29507,6 +27930,17 @@
       <w:shd w:val="clear" w:color="auto" w:fill="E1DFDD"/>
     </w:rPr>
   </w:style>
+  <w:style w:type="character" w:styleId="FollowedHyperlink">
+    <w:name w:val="FollowedHyperlink"/>
+    <w:basedOn w:val="DefaultParagraphFont"/>
+    <w:semiHidden/>
+    <w:unhideWhenUsed/>
+    <w:rsid w:val="005F7BF1"/>
+    <w:rPr>
+      <w:color w:val="800080" w:themeColor="followedHyperlink"/>
+      <w:u w:val="single"/>
+    </w:rPr>
+  </w:style>
 </w:styles>
 </file>
 

</xml_diff>

<commit_message>
Minor paper formatting corrections.
</commit_message>
<xml_diff>
--- a/paper/Auditing the Unread — A Corpus Validation Framework for Undeciphered Scripts, with a Demonstration on Linear A.docx
+++ b/paper/Auditing the Unread — A Corpus Validation Framework for Undeciphered Scripts, with a Demonstration on Linear A.docx
@@ -69,7 +69,7 @@
             </w:rPr>
             <w:fldChar w:fldCharType="separate"/>
           </w:r>
-          <w:hyperlink w:anchor="_Toc236991802" w:history="1">
+          <w:hyperlink w:anchor="_Toc236992162" w:history="1">
             <w:r>
               <w:rPr>
                 <w:rStyle w:val="Hyperlink"/>
@@ -97,7 +97,7 @@
                 <w:noProof/>
                 <w:webHidden/>
               </w:rPr>
-              <w:instrText xml:space="preserve"> PAGEREF _Toc236991802 \h </w:instrText>
+              <w:instrText xml:space="preserve"> PAGEREF _Toc236992162 \h </w:instrText>
             </w:r>
             <w:r>
               <w:rPr>
@@ -142,7 +142,7 @@
               <w:lang w:val="el-GR" w:eastAsia="el-GR"/>
             </w:rPr>
           </w:pPr>
-          <w:hyperlink w:anchor="_Toc236991803" w:history="1">
+          <w:hyperlink w:anchor="_Toc236992163" w:history="1">
             <w:r>
               <w:rPr>
                 <w:rStyle w:val="Hyperlink"/>
@@ -170,7 +170,7 @@
                 <w:noProof/>
                 <w:webHidden/>
               </w:rPr>
-              <w:instrText xml:space="preserve"> PAGEREF _Toc236991803 \h </w:instrText>
+              <w:instrText xml:space="preserve"> PAGEREF _Toc236992163 \h </w:instrText>
             </w:r>
             <w:r>
               <w:rPr>
@@ -215,7 +215,7 @@
               <w:lang w:val="el-GR" w:eastAsia="el-GR"/>
             </w:rPr>
           </w:pPr>
-          <w:hyperlink w:anchor="_Toc236991804" w:history="1">
+          <w:hyperlink w:anchor="_Toc236992164" w:history="1">
             <w:r>
               <w:rPr>
                 <w:rStyle w:val="Hyperlink"/>
@@ -243,7 +243,7 @@
                 <w:noProof/>
                 <w:webHidden/>
               </w:rPr>
-              <w:instrText xml:space="preserve"> PAGEREF _Toc236991804 \h </w:instrText>
+              <w:instrText xml:space="preserve"> PAGEREF _Toc236992164 \h </w:instrText>
             </w:r>
             <w:r>
               <w:rPr>
@@ -288,7 +288,7 @@
               <w:lang w:val="el-GR" w:eastAsia="el-GR"/>
             </w:rPr>
           </w:pPr>
-          <w:hyperlink w:anchor="_Toc236991805" w:history="1">
+          <w:hyperlink w:anchor="_Toc236992165" w:history="1">
             <w:r>
               <w:rPr>
                 <w:rStyle w:val="Hyperlink"/>
@@ -316,7 +316,7 @@
                 <w:noProof/>
                 <w:webHidden/>
               </w:rPr>
-              <w:instrText xml:space="preserve"> PAGEREF _Toc236991805 \h </w:instrText>
+              <w:instrText xml:space="preserve"> PAGEREF _Toc236992165 \h </w:instrText>
             </w:r>
             <w:r>
               <w:rPr>
@@ -361,7 +361,7 @@
               <w:lang w:val="el-GR" w:eastAsia="el-GR"/>
             </w:rPr>
           </w:pPr>
-          <w:hyperlink w:anchor="_Toc236991806" w:history="1">
+          <w:hyperlink w:anchor="_Toc236992166" w:history="1">
             <w:r>
               <w:rPr>
                 <w:rStyle w:val="Hyperlink"/>
@@ -389,7 +389,7 @@
                 <w:noProof/>
                 <w:webHidden/>
               </w:rPr>
-              <w:instrText xml:space="preserve"> PAGEREF _Toc236991806 \h </w:instrText>
+              <w:instrText xml:space="preserve"> PAGEREF _Toc236992166 \h </w:instrText>
             </w:r>
             <w:r>
               <w:rPr>
@@ -434,7 +434,7 @@
               <w:lang w:val="el-GR" w:eastAsia="el-GR"/>
             </w:rPr>
           </w:pPr>
-          <w:hyperlink w:anchor="_Toc236991807" w:history="1">
+          <w:hyperlink w:anchor="_Toc236992167" w:history="1">
             <w:r>
               <w:rPr>
                 <w:rStyle w:val="Hyperlink"/>
@@ -462,7 +462,7 @@
                 <w:noProof/>
                 <w:webHidden/>
               </w:rPr>
-              <w:instrText xml:space="preserve"> PAGEREF _Toc236991807 \h </w:instrText>
+              <w:instrText xml:space="preserve"> PAGEREF _Toc236992167 \h </w:instrText>
             </w:r>
             <w:r>
               <w:rPr>
@@ -507,7 +507,7 @@
               <w:lang w:val="el-GR" w:eastAsia="el-GR"/>
             </w:rPr>
           </w:pPr>
-          <w:hyperlink w:anchor="_Toc236991808" w:history="1">
+          <w:hyperlink w:anchor="_Toc236992168" w:history="1">
             <w:r>
               <w:rPr>
                 <w:rStyle w:val="Hyperlink"/>
@@ -535,7 +535,7 @@
                 <w:noProof/>
                 <w:webHidden/>
               </w:rPr>
-              <w:instrText xml:space="preserve"> PAGEREF _Toc236991808 \h </w:instrText>
+              <w:instrText xml:space="preserve"> PAGEREF _Toc236992168 \h </w:instrText>
             </w:r>
             <w:r>
               <w:rPr>
@@ -580,7 +580,7 @@
               <w:lang w:val="el-GR" w:eastAsia="el-GR"/>
             </w:rPr>
           </w:pPr>
-          <w:hyperlink w:anchor="_Toc236991809" w:history="1">
+          <w:hyperlink w:anchor="_Toc236992169" w:history="1">
             <w:r>
               <w:rPr>
                 <w:rStyle w:val="Hyperlink"/>
@@ -608,7 +608,7 @@
                 <w:noProof/>
                 <w:webHidden/>
               </w:rPr>
-              <w:instrText xml:space="preserve"> PAGEREF _Toc236991809 \h </w:instrText>
+              <w:instrText xml:space="preserve"> PAGEREF _Toc236992169 \h </w:instrText>
             </w:r>
             <w:r>
               <w:rPr>
@@ -653,7 +653,7 @@
               <w:lang w:val="el-GR" w:eastAsia="el-GR"/>
             </w:rPr>
           </w:pPr>
-          <w:hyperlink w:anchor="_Toc236991810" w:history="1">
+          <w:hyperlink w:anchor="_Toc236992170" w:history="1">
             <w:r>
               <w:rPr>
                 <w:rStyle w:val="Hyperlink"/>
@@ -681,7 +681,7 @@
                 <w:noProof/>
                 <w:webHidden/>
               </w:rPr>
-              <w:instrText xml:space="preserve"> PAGEREF _Toc236991810 \h </w:instrText>
+              <w:instrText xml:space="preserve"> PAGEREF _Toc236992170 \h </w:instrText>
             </w:r>
             <w:r>
               <w:rPr>
@@ -726,7 +726,7 @@
               <w:lang w:val="el-GR" w:eastAsia="el-GR"/>
             </w:rPr>
           </w:pPr>
-          <w:hyperlink w:anchor="_Toc236991811" w:history="1">
+          <w:hyperlink w:anchor="_Toc236992171" w:history="1">
             <w:r>
               <w:rPr>
                 <w:rStyle w:val="Hyperlink"/>
@@ -754,7 +754,7 @@
                 <w:noProof/>
                 <w:webHidden/>
               </w:rPr>
-              <w:instrText xml:space="preserve"> PAGEREF _Toc236991811 \h </w:instrText>
+              <w:instrText xml:space="preserve"> PAGEREF _Toc236992171 \h </w:instrText>
             </w:r>
             <w:r>
               <w:rPr>
@@ -799,7 +799,7 @@
               <w:lang w:val="el-GR" w:eastAsia="el-GR"/>
             </w:rPr>
           </w:pPr>
-          <w:hyperlink w:anchor="_Toc236991812" w:history="1">
+          <w:hyperlink w:anchor="_Toc236992172" w:history="1">
             <w:r>
               <w:rPr>
                 <w:rStyle w:val="Hyperlink"/>
@@ -827,7 +827,7 @@
                 <w:noProof/>
                 <w:webHidden/>
               </w:rPr>
-              <w:instrText xml:space="preserve"> PAGEREF _Toc236991812 \h </w:instrText>
+              <w:instrText xml:space="preserve"> PAGEREF _Toc236992172 \h </w:instrText>
             </w:r>
             <w:r>
               <w:rPr>
@@ -872,7 +872,7 @@
               <w:lang w:val="el-GR" w:eastAsia="el-GR"/>
             </w:rPr>
           </w:pPr>
-          <w:hyperlink w:anchor="_Toc236991813" w:history="1">
+          <w:hyperlink w:anchor="_Toc236992173" w:history="1">
             <w:r>
               <w:rPr>
                 <w:rStyle w:val="Hyperlink"/>
@@ -900,7 +900,7 @@
                 <w:noProof/>
                 <w:webHidden/>
               </w:rPr>
-              <w:instrText xml:space="preserve"> PAGEREF _Toc236991813 \h </w:instrText>
+              <w:instrText xml:space="preserve"> PAGEREF _Toc236992173 \h </w:instrText>
             </w:r>
             <w:r>
               <w:rPr>
@@ -945,7 +945,7 @@
               <w:lang w:val="el-GR" w:eastAsia="el-GR"/>
             </w:rPr>
           </w:pPr>
-          <w:hyperlink w:anchor="_Toc236991814" w:history="1">
+          <w:hyperlink w:anchor="_Toc236992174" w:history="1">
             <w:r>
               <w:rPr>
                 <w:rStyle w:val="Hyperlink"/>
@@ -973,7 +973,7 @@
                 <w:noProof/>
                 <w:webHidden/>
               </w:rPr>
-              <w:instrText xml:space="preserve"> PAGEREF _Toc236991814 \h </w:instrText>
+              <w:instrText xml:space="preserve"> PAGEREF _Toc236992174 \h </w:instrText>
             </w:r>
             <w:r>
               <w:rPr>
@@ -1018,7 +1018,7 @@
               <w:lang w:val="el-GR" w:eastAsia="el-GR"/>
             </w:rPr>
           </w:pPr>
-          <w:hyperlink w:anchor="_Toc236991815" w:history="1">
+          <w:hyperlink w:anchor="_Toc236992175" w:history="1">
             <w:r>
               <w:rPr>
                 <w:rStyle w:val="Hyperlink"/>
@@ -1046,7 +1046,7 @@
                 <w:noProof/>
                 <w:webHidden/>
               </w:rPr>
-              <w:instrText xml:space="preserve"> PAGEREF _Toc236991815 \h </w:instrText>
+              <w:instrText xml:space="preserve"> PAGEREF _Toc236992175 \h </w:instrText>
             </w:r>
             <w:r>
               <w:rPr>
@@ -1091,7 +1091,7 @@
               <w:lang w:val="el-GR" w:eastAsia="el-GR"/>
             </w:rPr>
           </w:pPr>
-          <w:hyperlink w:anchor="_Toc236991816" w:history="1">
+          <w:hyperlink w:anchor="_Toc236992176" w:history="1">
             <w:r>
               <w:rPr>
                 <w:rStyle w:val="Hyperlink"/>
@@ -1119,7 +1119,7 @@
                 <w:noProof/>
                 <w:webHidden/>
               </w:rPr>
-              <w:instrText xml:space="preserve"> PAGEREF _Toc236991816 \h </w:instrText>
+              <w:instrText xml:space="preserve"> PAGEREF _Toc236992176 \h </w:instrText>
             </w:r>
             <w:r>
               <w:rPr>
@@ -1164,7 +1164,7 @@
               <w:lang w:val="el-GR" w:eastAsia="el-GR"/>
             </w:rPr>
           </w:pPr>
-          <w:hyperlink w:anchor="_Toc236991817" w:history="1">
+          <w:hyperlink w:anchor="_Toc236992177" w:history="1">
             <w:r>
               <w:rPr>
                 <w:rStyle w:val="Hyperlink"/>
@@ -1192,7 +1192,7 @@
                 <w:noProof/>
                 <w:webHidden/>
               </w:rPr>
-              <w:instrText xml:space="preserve"> PAGEREF _Toc236991817 \h </w:instrText>
+              <w:instrText xml:space="preserve"> PAGEREF _Toc236992177 \h </w:instrText>
             </w:r>
             <w:r>
               <w:rPr>
@@ -1237,7 +1237,7 @@
               <w:lang w:val="el-GR" w:eastAsia="el-GR"/>
             </w:rPr>
           </w:pPr>
-          <w:hyperlink w:anchor="_Toc236991818" w:history="1">
+          <w:hyperlink w:anchor="_Toc236992178" w:history="1">
             <w:r>
               <w:rPr>
                 <w:rStyle w:val="Hyperlink"/>
@@ -1265,7 +1265,7 @@
                 <w:noProof/>
                 <w:webHidden/>
               </w:rPr>
-              <w:instrText xml:space="preserve"> PAGEREF _Toc236991818 \h </w:instrText>
+              <w:instrText xml:space="preserve"> PAGEREF _Toc236992178 \h </w:instrText>
             </w:r>
             <w:r>
               <w:rPr>
@@ -1310,7 +1310,7 @@
               <w:lang w:val="el-GR" w:eastAsia="el-GR"/>
             </w:rPr>
           </w:pPr>
-          <w:hyperlink w:anchor="_Toc236991819" w:history="1">
+          <w:hyperlink w:anchor="_Toc236992179" w:history="1">
             <w:r>
               <w:rPr>
                 <w:rStyle w:val="Hyperlink"/>
@@ -1338,7 +1338,7 @@
                 <w:noProof/>
                 <w:webHidden/>
               </w:rPr>
-              <w:instrText xml:space="preserve"> PAGEREF _Toc236991819 \h </w:instrText>
+              <w:instrText xml:space="preserve"> PAGEREF _Toc236992179 \h </w:instrText>
             </w:r>
             <w:r>
               <w:rPr>
@@ -1383,7 +1383,7 @@
               <w:lang w:val="el-GR" w:eastAsia="el-GR"/>
             </w:rPr>
           </w:pPr>
-          <w:hyperlink w:anchor="_Toc236991820" w:history="1">
+          <w:hyperlink w:anchor="_Toc236992180" w:history="1">
             <w:r>
               <w:rPr>
                 <w:rStyle w:val="Hyperlink"/>
@@ -1411,7 +1411,7 @@
                 <w:noProof/>
                 <w:webHidden/>
               </w:rPr>
-              <w:instrText xml:space="preserve"> PAGEREF _Toc236991820 \h </w:instrText>
+              <w:instrText xml:space="preserve"> PAGEREF _Toc236992180 \h </w:instrText>
             </w:r>
             <w:r>
               <w:rPr>
@@ -1431,7 +1431,7 @@
                 <w:noProof/>
                 <w:webHidden/>
               </w:rPr>
-              <w:t>59</w:t>
+              <w:t>58</w:t>
             </w:r>
             <w:r>
               <w:rPr>
@@ -1456,14 +1456,14 @@
               <w:lang w:val="el-GR" w:eastAsia="el-GR"/>
             </w:rPr>
           </w:pPr>
-          <w:hyperlink w:anchor="_Toc236991821" w:history="1">
+          <w:hyperlink w:anchor="_Toc236992181" w:history="1">
             <w:r>
               <w:rPr>
                 <w:rStyle w:val="Hyperlink"/>
                 <w:rFonts w:ascii="Noto Serif" w:hAnsi="Noto Serif" w:cs="Noto Serif"/>
                 <w:noProof/>
               </w:rPr>
-              <w:t>Appendix D: Decod</w:t>
+              <w:t>Appendix D: Decoding th</w:t>
             </w:r>
             <w:r>
               <w:rPr>
@@ -1471,7 +1471,7 @@
                 <w:rFonts w:ascii="Noto Serif" w:hAnsi="Noto Serif" w:cs="Noto Serif"/>
                 <w:noProof/>
               </w:rPr>
-              <w:t>i</w:t>
+              <w:t>e</w:t>
             </w:r>
             <w:r>
               <w:rPr>
@@ -1479,7 +1479,7 @@
                 <w:rFonts w:ascii="Noto Serif" w:hAnsi="Noto Serif" w:cs="Noto Serif"/>
                 <w:noProof/>
               </w:rPr>
-              <w:t>ng the SigLA database</w:t>
+              <w:t xml:space="preserve"> SigLA database</w:t>
             </w:r>
             <w:r>
               <w:rPr>
@@ -1500,7 +1500,7 @@
                 <w:noProof/>
                 <w:webHidden/>
               </w:rPr>
-              <w:instrText xml:space="preserve"> PAGEREF _Toc236991821 \h </w:instrText>
+              <w:instrText xml:space="preserve"> PAGEREF _Toc236992181 \h </w:instrText>
             </w:r>
             <w:r>
               <w:rPr>
@@ -1520,7 +1520,7 @@
                 <w:noProof/>
                 <w:webHidden/>
               </w:rPr>
-              <w:t>60</w:t>
+              <w:t>59</w:t>
             </w:r>
             <w:r>
               <w:rPr>
@@ -1575,7 +1575,7 @@
         </w:rPr>
       </w:pPr>
       <w:bookmarkStart w:id="1" w:name="_Toc236840839"/>
-      <w:bookmarkStart w:id="2" w:name="_Toc236991802"/>
+      <w:bookmarkStart w:id="2" w:name="_Toc236992162"/>
       <w:r>
         <w:rPr>
           <w:rFonts w:ascii="Noto Serif" w:hAnsi="Noto Serif" w:cs="Noto Serif"/>
@@ -1904,7 +1904,7 @@
           <w:szCs w:val="30"/>
         </w:rPr>
       </w:pPr>
-      <w:bookmarkStart w:id="6" w:name="_Toc236991803"/>
+      <w:bookmarkStart w:id="6" w:name="_Toc236992163"/>
       <w:r>
         <w:rPr>
           <w:rFonts w:ascii="Noto Serif" w:hAnsi="Noto Serif" w:cs="Noto Serif"/>
@@ -2081,7 +2081,7 @@
           <w:szCs w:val="30"/>
         </w:rPr>
       </w:pPr>
-      <w:bookmarkStart w:id="8" w:name="_Toc236991804"/>
+      <w:bookmarkStart w:id="8" w:name="_Toc236992164"/>
       <w:r>
         <w:rPr>
           <w:rFonts w:ascii="Noto Serif" w:hAnsi="Noto Serif" w:cs="Noto Serif"/>
@@ -2370,7 +2370,7 @@
           <w:szCs w:val="30"/>
         </w:rPr>
       </w:pPr>
-      <w:bookmarkStart w:id="12" w:name="_Toc236991805"/>
+      <w:bookmarkStart w:id="12" w:name="_Toc236992165"/>
       <w:r>
         <w:rPr>
           <w:rFonts w:ascii="Noto Serif" w:hAnsi="Noto Serif" w:cs="Noto Serif"/>
@@ -2835,7 +2835,7 @@
           <w:szCs w:val="30"/>
         </w:rPr>
       </w:pPr>
-      <w:bookmarkStart w:id="18" w:name="_Toc236991806"/>
+      <w:bookmarkStart w:id="18" w:name="_Toc236992166"/>
       <w:r>
         <w:rPr>
           <w:rFonts w:ascii="Noto Serif" w:hAnsi="Noto Serif" w:cs="Noto Serif"/>
@@ -4131,7 +4131,7 @@
           <w:szCs w:val="30"/>
         </w:rPr>
       </w:pPr>
-      <w:bookmarkStart w:id="29" w:name="_Toc236991807"/>
+      <w:bookmarkStart w:id="29" w:name="_Toc236992167"/>
       <w:r>
         <w:rPr>
           <w:rFonts w:ascii="Noto Serif" w:hAnsi="Noto Serif" w:cs="Noto Serif"/>
@@ -7345,7 +7345,7 @@
           <w:szCs w:val="30"/>
         </w:rPr>
       </w:pPr>
-      <w:bookmarkStart w:id="38" w:name="_Toc236991808"/>
+      <w:bookmarkStart w:id="38" w:name="_Toc236992168"/>
       <w:r>
         <w:rPr>
           <w:rFonts w:ascii="Noto Serif" w:hAnsi="Noto Serif" w:cs="Noto Serif"/>
@@ -12485,7 +12485,7 @@
           <w:szCs w:val="30"/>
         </w:rPr>
       </w:pPr>
-      <w:bookmarkStart w:id="47" w:name="_Toc236991809"/>
+      <w:bookmarkStart w:id="47" w:name="_Toc236992169"/>
       <w:r>
         <w:rPr>
           <w:rFonts w:ascii="Noto Serif" w:hAnsi="Noto Serif" w:cs="Noto Serif"/>
@@ -15901,7 +15901,7 @@
           <w:szCs w:val="30"/>
         </w:rPr>
       </w:pPr>
-      <w:bookmarkStart w:id="53" w:name="_Toc236991810"/>
+      <w:bookmarkStart w:id="53" w:name="_Toc236992170"/>
       <w:r>
         <w:rPr>
           <w:rFonts w:ascii="Noto Serif" w:hAnsi="Noto Serif" w:cs="Noto Serif"/>
@@ -16184,7 +16184,7 @@
           <w:szCs w:val="30"/>
         </w:rPr>
       </w:pPr>
-      <w:bookmarkStart w:id="55" w:name="_Toc236991811"/>
+      <w:bookmarkStart w:id="55" w:name="_Toc236992171"/>
       <w:r>
         <w:rPr>
           <w:rFonts w:ascii="Noto Serif" w:hAnsi="Noto Serif" w:cs="Noto Serif"/>
@@ -18586,7 +18586,7 @@
           <w:szCs w:val="30"/>
         </w:rPr>
       </w:pPr>
-      <w:bookmarkStart w:id="63" w:name="_Toc236991812"/>
+      <w:bookmarkStart w:id="63" w:name="_Toc236992172"/>
       <w:r>
         <w:rPr>
           <w:rFonts w:ascii="Noto Serif" w:hAnsi="Noto Serif" w:cs="Noto Serif"/>
@@ -18967,7 +18967,7 @@
           <w:szCs w:val="30"/>
         </w:rPr>
       </w:pPr>
-      <w:bookmarkStart w:id="65" w:name="_Toc236991813"/>
+      <w:bookmarkStart w:id="65" w:name="_Toc236992173"/>
       <w:r>
         <w:rPr>
           <w:rFonts w:ascii="Noto Serif" w:hAnsi="Noto Serif" w:cs="Noto Serif"/>
@@ -20064,7 +20064,7 @@
           <w:szCs w:val="30"/>
         </w:rPr>
       </w:pPr>
-      <w:bookmarkStart w:id="68" w:name="_Toc236991814"/>
+      <w:bookmarkStart w:id="68" w:name="_Toc236992174"/>
       <w:r>
         <w:rPr>
           <w:rFonts w:ascii="Noto Serif" w:hAnsi="Noto Serif" w:cs="Noto Serif"/>
@@ -20366,7 +20366,7 @@
           <w:szCs w:val="30"/>
         </w:rPr>
       </w:pPr>
-      <w:bookmarkStart w:id="70" w:name="_Toc236991815"/>
+      <w:bookmarkStart w:id="70" w:name="_Toc236992175"/>
       <w:r>
         <w:rPr>
           <w:rFonts w:ascii="Noto Serif" w:hAnsi="Noto Serif" w:cs="Noto Serif"/>
@@ -21669,7 +21669,7 @@
           <w:szCs w:val="30"/>
         </w:rPr>
       </w:pPr>
-      <w:bookmarkStart w:id="79" w:name="_Toc236991816"/>
+      <w:bookmarkStart w:id="79" w:name="_Toc236992176"/>
       <w:r>
         <w:rPr>
           <w:rFonts w:ascii="Noto Serif" w:hAnsi="Noto Serif" w:cs="Noto Serif"/>
@@ -23115,7 +23115,7 @@
           <w:szCs w:val="30"/>
         </w:rPr>
       </w:pPr>
-      <w:bookmarkStart w:id="85" w:name="_Toc236991817"/>
+      <w:bookmarkStart w:id="85" w:name="_Toc236992177"/>
       <w:r>
         <w:rPr>
           <w:rFonts w:ascii="Noto Serif" w:hAnsi="Noto Serif" w:cs="Noto Serif"/>
@@ -24298,7 +24298,7 @@
           <w:szCs w:val="30"/>
         </w:rPr>
       </w:pPr>
-      <w:bookmarkStart w:id="87" w:name="_Toc236991818"/>
+      <w:bookmarkStart w:id="87" w:name="_Toc236992178"/>
       <w:r>
         <w:rPr>
           <w:rFonts w:ascii="Noto Serif" w:hAnsi="Noto Serif" w:cs="Noto Serif"/>
@@ -25702,7 +25702,7 @@
           <w:szCs w:val="30"/>
         </w:rPr>
       </w:pPr>
-      <w:bookmarkStart w:id="89" w:name="_Toc236991819"/>
+      <w:bookmarkStart w:id="89" w:name="_Toc236992179"/>
       <w:r>
         <w:rPr>
           <w:rFonts w:ascii="Noto Serif" w:hAnsi="Noto Serif" w:cs="Noto Serif"/>
@@ -26953,6 +26953,86 @@
     </w:p>
     <w:p>
       <w:pPr>
+        <w:pStyle w:val="Heading2"/>
+        <w:jc w:val="both"/>
+        <w:rPr>
+          <w:rFonts w:ascii="Noto Serif" w:hAnsi="Noto Serif" w:cs="Noto Serif"/>
+          <w:sz w:val="30"/>
+          <w:szCs w:val="30"/>
+        </w:rPr>
+      </w:pPr>
+      <w:bookmarkStart w:id="91" w:name="_Toc236992180"/>
+      <w:r>
+        <w:rPr>
+          <w:rFonts w:ascii="Noto Serif" w:hAnsi="Noto Serif" w:cs="Noto Serif"/>
+          <w:sz w:val="30"/>
+          <w:szCs w:val="30"/>
+        </w:rPr>
+        <w:lastRenderedPageBreak/>
+        <w:t>Appendix C: Tests</w:t>
+      </w:r>
+      <w:bookmarkEnd w:id="91"/>
+    </w:p>
+    <w:p>
+      <w:pPr>
+        <w:pStyle w:val="FirstParagraph"/>
+        <w:jc w:val="both"/>
+        <w:rPr>
+          <w:rFonts w:ascii="Noto Serif" w:hAnsi="Noto Serif" w:cs="Noto Serif"/>
+        </w:rPr>
+      </w:pPr>
+      <w:r>
+        <w:rPr>
+          <w:rFonts w:ascii="Noto Serif" w:hAnsi="Noto Serif" w:cs="Noto Serif"/>
+        </w:rPr>
+        <w:t xml:space="preserve">The repository carries a regression suite in three groups: licensing hygiene (asserting that no third-party corpus data is committed), structural invariants (schema conformance, consistency between damage flags and the derived </w:t>
+      </w:r>
+      <w:r>
+        <w:rPr>
+          <w:rStyle w:val="VerbatimChar"/>
+          <w:rFonts w:ascii="Noto Serif" w:hAnsi="Noto Serif" w:cs="Noto Serif"/>
+        </w:rPr>
+        <w:t>complete</w:t>
+      </w:r>
+      <w:r>
+        <w:rPr>
+          <w:rFonts w:ascii="Noto Serif" w:hAnsi="Noto Serif" w:cs="Noto Serif"/>
+        </w:rPr>
+        <w:t xml:space="preserve"> field, presence of a confidence grade on every measure value, and application of the D4 correction), and published figures (the numerical claims of this paper expressed as assertions).</w:t>
+      </w:r>
+    </w:p>
+    <w:p>
+      <w:pPr>
+        <w:pStyle w:val="BodyText"/>
+        <w:jc w:val="both"/>
+        <w:rPr>
+          <w:rFonts w:ascii="Noto Serif" w:hAnsi="Noto Serif" w:cs="Noto Serif"/>
+        </w:rPr>
+      </w:pPr>
+      <w:r>
+        <w:rPr>
+          <w:rFonts w:ascii="Noto Serif" w:hAnsi="Noto Serif" w:cs="Noto Serif"/>
+        </w:rPr>
+        <w:t>A failure in the third group is informative rather than defective: it indicates that the upstream corpus has changed and that the figures reported here no longer describe the data. The suite therefore verifies the corpus checksum first and skips the dependent assertions when it differs.</w:t>
+      </w:r>
+    </w:p>
+    <w:p>
+      <w:pPr>
+        <w:pStyle w:val="BodyText"/>
+        <w:jc w:val="both"/>
+        <w:rPr>
+          <w:rFonts w:ascii="Noto Serif" w:hAnsi="Noto Serif" w:cs="Noto Serif"/>
+        </w:rPr>
+      </w:pPr>
+      <w:r>
+        <w:rPr>
+          <w:rFonts w:ascii="Noto Serif" w:hAnsi="Noto Serif" w:cs="Noto Serif"/>
+        </w:rPr>
+        <w:t>This is not a hypothetical safeguard. During preparation the suite caught a stale figure — the phantom-type inflation of §4.1, reported as 383 before the D4 correction and the adoption of the Corazza fraction system, and 374 on the corrected corpus. The corrected value is the one reported.</w:t>
+      </w:r>
+    </w:p>
+    <w:p>
+      <w:pPr>
         <w:rPr>
           <w:rFonts w:ascii="Noto Serif" w:eastAsiaTheme="majorEastAsia" w:hAnsi="Noto Serif" w:cs="Noto Serif"/>
           <w:b/>
@@ -26962,105 +27042,6 @@
           <w:szCs w:val="28"/>
         </w:rPr>
       </w:pPr>
-      <w:r>
-        <w:rPr>
-          <w:rFonts w:ascii="Noto Serif" w:hAnsi="Noto Serif" w:cs="Noto Serif"/>
-        </w:rPr>
-        <w:lastRenderedPageBreak/>
-        <w:br w:type="page"/>
-      </w:r>
-    </w:p>
-    <w:p>
-      <w:pPr>
-        <w:pStyle w:val="Heading2"/>
-        <w:jc w:val="both"/>
-        <w:rPr>
-          <w:rFonts w:ascii="Noto Serif" w:hAnsi="Noto Serif" w:cs="Noto Serif"/>
-          <w:sz w:val="30"/>
-          <w:szCs w:val="30"/>
-        </w:rPr>
-      </w:pPr>
-      <w:bookmarkStart w:id="91" w:name="_Toc236991820"/>
-      <w:r>
-        <w:rPr>
-          <w:rFonts w:ascii="Noto Serif" w:hAnsi="Noto Serif" w:cs="Noto Serif"/>
-          <w:sz w:val="30"/>
-          <w:szCs w:val="30"/>
-        </w:rPr>
-        <w:lastRenderedPageBreak/>
-        <w:t>Appendix C: Tests</w:t>
-      </w:r>
-      <w:bookmarkEnd w:id="91"/>
-    </w:p>
-    <w:p>
-      <w:pPr>
-        <w:pStyle w:val="FirstParagraph"/>
-        <w:jc w:val="both"/>
-        <w:rPr>
-          <w:rFonts w:ascii="Noto Serif" w:hAnsi="Noto Serif" w:cs="Noto Serif"/>
-        </w:rPr>
-      </w:pPr>
-      <w:r>
-        <w:rPr>
-          <w:rFonts w:ascii="Noto Serif" w:hAnsi="Noto Serif" w:cs="Noto Serif"/>
-        </w:rPr>
-        <w:t xml:space="preserve">The repository carries a regression suite in three groups: licensing hygiene (asserting that no third-party corpus data is committed), structural invariants (schema conformance, consistency between damage flags and the derived </w:t>
-      </w:r>
-      <w:r>
-        <w:rPr>
-          <w:rStyle w:val="VerbatimChar"/>
-          <w:rFonts w:ascii="Noto Serif" w:hAnsi="Noto Serif" w:cs="Noto Serif"/>
-        </w:rPr>
-        <w:t>complete</w:t>
-      </w:r>
-      <w:r>
-        <w:rPr>
-          <w:rFonts w:ascii="Noto Serif" w:hAnsi="Noto Serif" w:cs="Noto Serif"/>
-        </w:rPr>
-        <w:t xml:space="preserve"> field, presence of a confidence grade on every measure value, and application of the D4 correction), and published figures (the numerical claims of this paper expressed as assertions).</w:t>
-      </w:r>
-    </w:p>
-    <w:p>
-      <w:pPr>
-        <w:pStyle w:val="BodyText"/>
-        <w:jc w:val="both"/>
-        <w:rPr>
-          <w:rFonts w:ascii="Noto Serif" w:hAnsi="Noto Serif" w:cs="Noto Serif"/>
-        </w:rPr>
-      </w:pPr>
-      <w:r>
-        <w:rPr>
-          <w:rFonts w:ascii="Noto Serif" w:hAnsi="Noto Serif" w:cs="Noto Serif"/>
-        </w:rPr>
-        <w:t>A failure in the third group is informative rather than defective: it indicates that the upstream corpus has changed and that the figures reported here no longer describe the data. The suite therefore verifies the corpus checksum first and skips the dependent assertions when it differs.</w:t>
-      </w:r>
-    </w:p>
-    <w:p>
-      <w:pPr>
-        <w:pStyle w:val="BodyText"/>
-        <w:jc w:val="both"/>
-        <w:rPr>
-          <w:rFonts w:ascii="Noto Serif" w:hAnsi="Noto Serif" w:cs="Noto Serif"/>
-        </w:rPr>
-      </w:pPr>
-      <w:r>
-        <w:rPr>
-          <w:rFonts w:ascii="Noto Serif" w:hAnsi="Noto Serif" w:cs="Noto Serif"/>
-        </w:rPr>
-        <w:t>This is not a hypothetical safeguard. During preparation the suite caught a stale figure — the phantom-type inflation of §4.1, reported as 383 before the D4 correction and the adoption of the Corazza fraction system, and 374 on the corrected corpus. The corrected value is the one reported.</w:t>
-      </w:r>
-    </w:p>
-    <w:p>
-      <w:pPr>
-        <w:rPr>
-          <w:rFonts w:ascii="Noto Serif" w:eastAsiaTheme="majorEastAsia" w:hAnsi="Noto Serif" w:cs="Noto Serif"/>
-          <w:b/>
-          <w:bCs/>
-          <w:color w:val="4F81BD" w:themeColor="accent1"/>
-          <w:sz w:val="28"/>
-          <w:szCs w:val="28"/>
-        </w:rPr>
-      </w:pPr>
       <w:bookmarkStart w:id="92" w:name="appendix-d-decoding-the-sigla-database"/>
       <w:bookmarkEnd w:id="88"/>
       <w:bookmarkEnd w:id="90"/>
@@ -27081,7 +27062,7 @@
           <w:szCs w:val="30"/>
         </w:rPr>
       </w:pPr>
-      <w:bookmarkStart w:id="93" w:name="_Toc236991821"/>
+      <w:bookmarkStart w:id="93" w:name="_Toc236992181"/>
       <w:r>
         <w:rPr>
           <w:rFonts w:ascii="Noto Serif" w:hAnsi="Noto Serif" w:cs="Noto Serif"/>

</xml_diff>